<commit_message>
Revise reflection portfolio: formal Arabic, lesson plan in tables, expanded
Co-Authored-By: Claude Opus 4.8 <noreply@anthropic.com>
Claude-Session: https://claude.ai/code/session_01AkgGYV3yP2PQ2xS2ETa6YJ
</commit_message>
<xml_diff>
--- a/ملف_التأمل_المهني_الاستاج.docx
+++ b/ملف_التأمل_المهني_الاستاج.docx
@@ -4,7 +4,7 @@
   <w:body>
     <w:p>
       <w:pPr>
-        <w:spacing w:before="1200"/>
+        <w:spacing w:before="1000"/>
       </w:pPr>
     </w:p>
     <w:p>
@@ -16,29 +16,29 @@
         <w:rPr>
           <w:rFonts w:ascii="Arial" w:hAnsi="Arial" w:cs="Arial"/>
           <w:b/>
-          <w:color w:val="1F6F6B"/>
+          <w:color w:val="000000"/>
           <w:sz w:val="52"/>
           <w:bCs/>
           <w:rtl w:val="1"/>
         </w:rPr>
-        <w:t>ملف التأمّل والتطوّر المهني</w:t>
+        <w:t>مِلَفُّ التَّأمُّلِ والتَّطوُّرِ المِهَنيِّ</w:t>
       </w:r>
     </w:p>
     <w:p>
       <w:pPr>
         <w:bidi w:val="1"/>
-        <w:spacing w:after="600"/>
+        <w:spacing w:after="560"/>
         <w:jc w:val="center"/>
       </w:pPr>
       <w:r>
         <w:rPr>
           <w:rFonts w:ascii="Arial" w:hAnsi="Arial" w:cs="Arial"/>
           <w:b w:val="0"/>
-          <w:color w:val="222A33"/>
-          <w:sz w:val="32"/>
+          <w:color w:val="000000"/>
+          <w:sz w:val="30"/>
           <w:rtl w:val="1"/>
         </w:rPr>
-        <w:t>مسار سنة الاستاج في تعليم اللغة الإنجليزية</w:t>
+        <w:t>مسارُ سنةِ الاستاج في تعليمِ اللغةِ الإنجليزية</w:t>
       </w:r>
     </w:p>
     <w:p>
@@ -51,7 +51,7 @@
         <w:rPr>
           <w:rFonts w:ascii="Arial" w:hAnsi="Arial" w:cs="Arial"/>
           <w:b/>
-          <w:color w:val="222A33"/>
+          <w:color w:val="000000"/>
           <w:sz w:val="26"/>
           <w:bCs/>
           <w:rtl w:val="1"/>
@@ -62,11 +62,11 @@
         <w:rPr>
           <w:rFonts w:ascii="Arial" w:hAnsi="Arial" w:cs="Arial"/>
           <w:b w:val="0"/>
-          <w:color w:val="555B62"/>
+          <w:color w:val="000000"/>
           <w:sz w:val="26"/>
           <w:rtl w:val="1"/>
         </w:rPr>
-        <w:t xml:space="preserve"> تعليم اللغة الإنجليزية – المرحلة الإعدادية</w:t>
+        <w:t xml:space="preserve"> تعليمُ اللغةِ الإنجليزية – المرحلةُ الإعدادية</w:t>
       </w:r>
     </w:p>
     <w:p>
@@ -79,7 +79,7 @@
         <w:rPr>
           <w:rFonts w:ascii="Arial" w:hAnsi="Arial" w:cs="Arial"/>
           <w:b/>
-          <w:color w:val="222A33"/>
+          <w:color w:val="000000"/>
           <w:sz w:val="26"/>
           <w:bCs/>
           <w:rtl w:val="1"/>
@@ -90,11 +90,11 @@
         <w:rPr>
           <w:rFonts w:ascii="Arial" w:hAnsi="Arial" w:cs="Arial"/>
           <w:b w:val="0"/>
-          <w:color w:val="555B62"/>
+          <w:color w:val="000000"/>
           <w:sz w:val="26"/>
           <w:rtl w:val="1"/>
         </w:rPr>
-        <w:t xml:space="preserve"> الإعدادية الشاملة (أ) شفرعم، على اسم الشيخ صالح خنيفس</w:t>
+        <w:t xml:space="preserve"> الإعداديةُ الشاملةُ (أ) شفرعم، على اسمِ الشيخِ صالح خنيفس</w:t>
       </w:r>
     </w:p>
     <w:p>
@@ -107,7 +107,7 @@
         <w:rPr>
           <w:rFonts w:ascii="Arial" w:hAnsi="Arial" w:cs="Arial"/>
           <w:b/>
-          <w:color w:val="222A33"/>
+          <w:color w:val="000000"/>
           <w:sz w:val="26"/>
           <w:bCs/>
           <w:rtl w:val="1"/>
@@ -118,7 +118,7 @@
         <w:rPr>
           <w:rFonts w:ascii="Arial" w:hAnsi="Arial" w:cs="Arial"/>
           <w:b w:val="0"/>
-          <w:color w:val="555B62"/>
+          <w:color w:val="000000"/>
           <w:sz w:val="26"/>
           <w:rtl w:val="1"/>
         </w:rPr>
@@ -135,7 +135,7 @@
         <w:rPr>
           <w:rFonts w:ascii="Arial" w:hAnsi="Arial" w:cs="Arial"/>
           <w:b/>
-          <w:color w:val="222A33"/>
+          <w:color w:val="000000"/>
           <w:sz w:val="26"/>
           <w:bCs/>
           <w:rtl w:val="1"/>
@@ -146,11 +146,11 @@
         <w:rPr>
           <w:rFonts w:ascii="Arial" w:hAnsi="Arial" w:cs="Arial"/>
           <w:b w:val="0"/>
-          <w:color w:val="555B62"/>
+          <w:color w:val="000000"/>
           <w:sz w:val="26"/>
           <w:rtl w:val="1"/>
         </w:rPr>
-        <w:t xml:space="preserve"> مدرسة إعدادية (حطّة)</w:t>
+        <w:t xml:space="preserve"> مدرسةٌ إعدادية</w:t>
       </w:r>
     </w:p>
     <w:p>
@@ -163,39 +163,39 @@
         <w:rPr>
           <w:rFonts w:ascii="Arial" w:hAnsi="Arial" w:cs="Arial"/>
           <w:b/>
-          <w:color w:val="222A33"/>
+          <w:color w:val="000000"/>
           <w:sz w:val="26"/>
           <w:bCs/>
           <w:rtl w:val="1"/>
         </w:rPr>
-        <w:t>نوع التقديم:</w:t>
+        <w:t>نوعُ التقديم:</w:t>
       </w:r>
       <w:r>
         <w:rPr>
           <w:rFonts w:ascii="Arial" w:hAnsi="Arial" w:cs="Arial"/>
           <w:b w:val="0"/>
-          <w:color w:val="555B62"/>
+          <w:color w:val="000000"/>
           <w:sz w:val="26"/>
           <w:rtl w:val="1"/>
         </w:rPr>
-        <w:t xml:space="preserve"> ملف تأمّل في سنة الاستاج (سِدنات الاستاج)</w:t>
+        <w:t xml:space="preserve"> ملفُّ تأمُّلٍ في سنةِ الاستاج (ضمن سِدنةِ الاستاج)</w:t>
       </w:r>
     </w:p>
     <w:p>
       <w:pPr>
         <w:bidi w:val="1"/>
-        <w:spacing w:before="560"/>
+        <w:spacing w:before="520"/>
         <w:jc w:val="center"/>
       </w:pPr>
       <w:r>
         <w:rPr>
           <w:rFonts w:ascii="Arial" w:hAnsi="Arial" w:cs="Arial"/>
           <w:b w:val="0"/>
-          <w:color w:val="555B62"/>
+          <w:color w:val="000000"/>
           <w:sz w:val="24"/>
           <w:rtl w:val="1"/>
         </w:rPr>
-        <w:t>السنة الدراسية: 2025 – 2026</w:t>
+        <w:t>السنةُ الدراسية: 2025 – 2026</w:t>
       </w:r>
     </w:p>
     <w:p>
@@ -206,17 +206,56 @@
     <w:p>
       <w:pPr>
         <w:bidi w:val="1"/>
-        <w:spacing w:after="200" w:before="0" w:line="336" w:lineRule="auto"/>
+        <w:spacing w:before="360" w:after="120"/>
+        <w:jc w:val="right"/>
+        <w:pBdr>
+          <w:bottom w:val="single" w:sz="6" w:space="4" w:color="000000"/>
+        </w:pBdr>
+      </w:pPr>
+      <w:r>
+        <w:rPr>
+          <w:rFonts w:ascii="Arial" w:hAnsi="Arial" w:cs="Arial"/>
+          <w:b/>
+          <w:color w:val="000000"/>
+          <w:sz w:val="32"/>
+          <w:bCs/>
+          <w:rtl w:val="1"/>
+        </w:rPr>
+        <w:t>توطئة</w:t>
+      </w:r>
+    </w:p>
+    <w:p>
+      <w:pPr>
+        <w:bidi w:val="1"/>
+        <w:spacing w:after="160" w:before="0" w:line="360" w:lineRule="auto"/>
         <w:jc w:val="both"/>
       </w:pPr>
       <w:r>
         <w:rPr>
           <w:rFonts w:ascii="Arial" w:hAnsi="Arial" w:cs="Arial"/>
           <w:b w:val="0"/>
+          <w:color w:val="000000"/>
           <w:sz w:val="26"/>
           <w:rtl w:val="1"/>
         </w:rPr>
-        <w:t>قبل ما أبدأ، بحبّ أقول إنّ هذي السنة ما مرقت عليّ زي أي سنة. دخلت الصف أول يوم وأنا حاسّة إنّي عارفة كل شي، ومعي كل النظريات اللي تعلمناها بالمساق، وطلعت من السنة وأنا مقتنعة إنّ التعليم بتتعلمه وأنت واقفة قدام الطلاب، مش بس بالكتب. الملف هذا هو محاولة إنّي أرجع بالذاكرة لهاي السنة، أرتّب اللي صار، وأشوف كيف صار عندي شكل واضح إني معلمة إنجليزي، مش بس واحدة بتعطي حصص.</w:t>
+        <w:t>لم تكن هذه السنةُ عندي مجردَ سنةٍ دراسيةٍ أخرى، بل كانت السنةَ التي تحوَّلتُ فيها من طالبةٍ تحملُ نظرياتٍ عن التعليم إلى معلمةٍ تقفُ أمام صفٍّ حقيقيٍّ فيه وجوهٌ وأسماءٌ وقصص. دخلتُ في أول يومٍ وأنا واثقةٌ أنني أعرفُ ما ينبغي فعله، وخرجتُ من السنةِ وأنا أكثرُ تواضعًا وأكثرُ يقينًا في آنٍ واحد: أكثرُ تواضعًا لأنَّ الصفَّ علَّمني أنَّ الخطةَ شيءٌ والواقعَ شيءٌ آخر، وأكثرُ يقينًا لأنني صرتُ أعرفُ أيَّ معلمةٍ أريدُ أن أكون.</w:t>
+      </w:r>
+    </w:p>
+    <w:p>
+      <w:pPr>
+        <w:bidi w:val="1"/>
+        <w:spacing w:after="200" w:before="0" w:line="360" w:lineRule="auto"/>
+        <w:jc w:val="both"/>
+      </w:pPr>
+      <w:r>
+        <w:rPr>
+          <w:rFonts w:ascii="Arial" w:hAnsi="Arial" w:cs="Arial"/>
+          <w:b w:val="0"/>
+          <w:color w:val="000000"/>
+          <w:sz w:val="26"/>
+          <w:rtl w:val="1"/>
+        </w:rPr>
+        <w:t>يحاولُ هذا الملفُّ أن يجمعَ خيوطَ تلك السنة في مكانٍ واحد: أن أخطِّطَ فعاليةً تربويةً ذاتَ معنى، وأن أقفَ عند أصعبِ ما واجهني فيها، وأن أتأملَ فيما تركته فيَّ المرافقةُ المهنيةُ والمساقُ من أثر، وأن أصوغَ أخيرًا رؤيتي وهويتي المهنية كما تبلورت فعلًا لا كما أتمنى أن تكون.</w:t>
       </w:r>
     </w:p>
     <w:p>
@@ -225,19 +264,19 @@
         <w:spacing w:before="360" w:after="120"/>
         <w:jc w:val="right"/>
         <w:pBdr>
-          <w:bottom w:val="single" w:sz="6" w:space="4" w:color="1F6F6B"/>
+          <w:bottom w:val="single" w:sz="6" w:space="4" w:color="000000"/>
         </w:pBdr>
       </w:pPr>
       <w:r>
         <w:rPr>
           <w:rFonts w:ascii="Arial" w:hAnsi="Arial" w:cs="Arial"/>
           <w:b/>
-          <w:color w:val="1F6F6B"/>
-          <w:sz w:val="34"/>
+          <w:color w:val="000000"/>
+          <w:sz w:val="32"/>
           <w:bCs/>
           <w:rtl w:val="1"/>
         </w:rPr>
-        <w:t>أولًا: تخطيط الفعالية التربوية وخطة الدرس</w:t>
+        <w:t>أولًا: تخطيطُ الفعاليةِ التربويةِ وخطةُ الدرس</w:t>
       </w:r>
     </w:p>
     <w:p>
@@ -250,28 +289,29 @@
         <w:rPr>
           <w:rFonts w:ascii="Arial" w:hAnsi="Arial" w:cs="Arial"/>
           <w:b/>
-          <w:color w:val="222A33"/>
-          <w:sz w:val="28"/>
+          <w:color w:val="000000"/>
+          <w:sz w:val="27"/>
           <w:bCs/>
           <w:rtl w:val="1"/>
         </w:rPr>
-        <w:t>1. اسم الفعالية وموضوع الدرس</w:t>
+        <w:t>اسمُ الفعاليةِ وموضوعُ الدرس</w:t>
       </w:r>
     </w:p>
     <w:p>
       <w:pPr>
         <w:bidi w:val="1"/>
-        <w:spacing w:after="200" w:before="0" w:line="336" w:lineRule="auto"/>
+        <w:spacing w:after="200" w:before="0" w:line="360" w:lineRule="auto"/>
         <w:jc w:val="both"/>
       </w:pPr>
       <w:r>
         <w:rPr>
           <w:rFonts w:ascii="Arial" w:hAnsi="Arial" w:cs="Arial"/>
           <w:b w:val="0"/>
+          <w:color w:val="000000"/>
           <w:sz w:val="26"/>
           <w:rtl w:val="1"/>
         </w:rPr>
-        <w:t>اسم الفعالية: "My City, My Words" (مدينتي بكلماتي). مشروع صفّي صغير مدّته ثلاث حصص، الطلاب فيه بيبنوا دليل سياحي قصير عن شفرعم باللغة الإنجليزية: أماكن يحبّوها، أكلة من البلد، شخص من العيلة بدهم يعرّفوا فيه. خطة الدرس اللي بأفصّلها تحت هي الحصة الأولى من المشروع، وهي حصة التقديم وجمع الأفكار والكتابة الأولى.</w:t>
+        <w:t>اخترتُ فعاليةً على هيئةِ مشروعٍ صفيٍّ قصير حمَل عنوان "My City, My Words" (مدينتي بكلماتي). المشروعُ يمتدُّ على ثلاثِ حصص، ينتجُ فيه الطلابُ دليلًا سياحيًّا مصغَّرًا عن مدينتهم شفرعم باللغةِ الإنجليزية: مكانٌ يحبونه، طبقٌ من طعامِ البلد، وشخصٌ من العائلةِ يعرِّفون به. وخطةُ الدرسِ المفصَّلةُ أدناه تخصُّ الحصةَ الأولى من المشروع، وهي حصةُ التقديمِ وجمعِ الأفكارِ والكتابةِ الأولى، إذ إنها الحصةُ التي يُبنى عليها كلُّ ما يليها.</w:t>
       </w:r>
     </w:p>
     <w:p>
@@ -284,28 +324,29 @@
         <w:rPr>
           <w:rFonts w:ascii="Arial" w:hAnsi="Arial" w:cs="Arial"/>
           <w:b/>
-          <w:color w:val="222A33"/>
-          <w:sz w:val="28"/>
+          <w:color w:val="000000"/>
+          <w:sz w:val="27"/>
           <w:bCs/>
           <w:rtl w:val="1"/>
         </w:rPr>
-        <w:t>2. الصف المستهدف</w:t>
+        <w:t>الصفُّ المستهدَف</w:t>
       </w:r>
     </w:p>
     <w:p>
       <w:pPr>
         <w:bidi w:val="1"/>
-        <w:spacing w:after="200" w:before="0" w:line="336" w:lineRule="auto"/>
+        <w:spacing w:after="200" w:before="0" w:line="360" w:lineRule="auto"/>
         <w:jc w:val="both"/>
       </w:pPr>
       <w:r>
         <w:rPr>
           <w:rFonts w:ascii="Arial" w:hAnsi="Arial" w:cs="Arial"/>
           <w:b w:val="0"/>
+          <w:color w:val="000000"/>
           <w:sz w:val="26"/>
           <w:rtl w:val="1"/>
         </w:rPr>
-        <w:t>الصف الثامن. مجموعة فيها حوالي 28 طالب وطالبة، مستوياتهم بالإنجليزي متفاوتة كثير: في طلاب بيقرأوا ويكتبوا بثقة، وفي طلاب لسا بتعبوا بجملة بسيطة. هاي الفجوة كانت من أكبر الأشياء اللي فكّرت فيها وأنا بخطّط.</w:t>
+        <w:t>الصفُّ الثامن، مجموعةٌ من ثمانيةٍ وعشرين طالبًا وطالبة. المستوياتُ في هذا الصفِّ متفاوتةٌ إلى حدٍّ بعيد؛ فمنهم من يقرأُ ويكتبُ بثقة، ومنهم من ما زال يتعثرُ في تركيبِ جملةٍ بسيطة. هذه الفجوةُ بالذات كانت حاضرةً في ذهني في كلِّ سطرٍ من التخطيط، ووجَّهت قراري في تقسيمِ العملِ وتوزيعِ الأدوار.</w:t>
       </w:r>
     </w:p>
     <w:p>
@@ -318,148 +359,331 @@
         <w:rPr>
           <w:rFonts w:ascii="Arial" w:hAnsi="Arial" w:cs="Arial"/>
           <w:b/>
-          <w:color w:val="222A33"/>
-          <w:sz w:val="28"/>
+          <w:color w:val="000000"/>
+          <w:sz w:val="27"/>
           <w:bCs/>
           <w:rtl w:val="1"/>
         </w:rPr>
-        <w:t>3. الأهداف التعليمية والقيمية</w:t>
+        <w:t>الأهدافُ التعليميةُ والقيمية</w:t>
       </w:r>
     </w:p>
+    <w:tbl>
+      <w:tblPr>
+        <w:tblStyle w:val="TableGrid"/>
+        <w:tblW w:type="auto" w:w="0"/>
+        <w:jc w:val="center"/>
+        <w:tblLook w:firstColumn="1" w:firstRow="1" w:lastColumn="0" w:lastRow="0" w:noHBand="0" w:noVBand="1" w:val="04A0"/>
+        <w:bidiVisual/>
+      </w:tblPr>
+      <w:tblGrid>
+        <w:gridCol w:w="4873"/>
+        <w:gridCol w:w="4873"/>
+      </w:tblGrid>
+      <w:tr>
+        <w:tc>
+          <w:tcPr>
+            <w:tcW w:type="dxa" w:w="7087"/>
+          </w:tcPr>
+          <w:p>
+            <w:pPr>
+              <w:bidi w:val="1"/>
+              <w:spacing w:after="40" w:line="312" w:lineRule="auto"/>
+              <w:jc w:val="right"/>
+            </w:pPr>
+            <w:r/>
+            <w:r>
+              <w:rPr>
+                <w:rFonts w:ascii="Arial" w:hAnsi="Arial" w:cs="Arial"/>
+                <w:b/>
+                <w:color w:val="000000"/>
+                <w:sz w:val="23"/>
+                <w:bCs/>
+                <w:rtl w:val="1"/>
+              </w:rPr>
+              <w:t>الهدف</w:t>
+            </w:r>
+          </w:p>
+        </w:tc>
+        <w:tc>
+          <w:tcPr>
+            <w:tcW w:type="dxa" w:w="2551"/>
+          </w:tcPr>
+          <w:p>
+            <w:pPr>
+              <w:bidi w:val="1"/>
+              <w:spacing w:after="40" w:line="312" w:lineRule="auto"/>
+              <w:jc w:val="right"/>
+            </w:pPr>
+            <w:r/>
+            <w:r>
+              <w:rPr>
+                <w:rFonts w:ascii="Arial" w:hAnsi="Arial" w:cs="Arial"/>
+                <w:b/>
+                <w:color w:val="000000"/>
+                <w:sz w:val="23"/>
+                <w:bCs/>
+                <w:rtl w:val="1"/>
+              </w:rPr>
+              <w:t>نوعُ الهدف</w:t>
+            </w:r>
+          </w:p>
+        </w:tc>
+      </w:tr>
+      <w:tr>
+        <w:tc>
+          <w:tcPr>
+            <w:tcW w:type="dxa" w:w="7087"/>
+          </w:tcPr>
+          <w:p>
+            <w:pPr>
+              <w:bidi w:val="1"/>
+              <w:spacing w:after="40" w:line="312" w:lineRule="auto"/>
+              <w:jc w:val="right"/>
+            </w:pPr>
+            <w:r/>
+            <w:r>
+              <w:rPr>
+                <w:rFonts w:ascii="Arial" w:hAnsi="Arial" w:cs="Arial"/>
+                <w:b w:val="0"/>
+                <w:color w:val="000000"/>
+                <w:sz w:val="23"/>
+                <w:rtl w:val="1"/>
+              </w:rPr>
+              <w:t>أن يوظِّفَ الطالبُ ما بين ثماني وعشرِ مفرداتٍ جديدةٍ مرتبطةٍ بوصفِ الأماكن مثل: crowded, ancient, peaceful, market, view.</w:t>
+            </w:r>
+          </w:p>
+        </w:tc>
+        <w:tc>
+          <w:tcPr>
+            <w:tcW w:type="dxa" w:w="2551"/>
+          </w:tcPr>
+          <w:p>
+            <w:pPr>
+              <w:bidi w:val="1"/>
+              <w:spacing w:after="40" w:line="312" w:lineRule="auto"/>
+              <w:jc w:val="right"/>
+            </w:pPr>
+            <w:r/>
+            <w:r>
+              <w:rPr>
+                <w:rFonts w:ascii="Arial" w:hAnsi="Arial" w:cs="Arial"/>
+                <w:b w:val="0"/>
+                <w:color w:val="000000"/>
+                <w:sz w:val="23"/>
+                <w:rtl w:val="1"/>
+              </w:rPr>
+              <w:t>لغوي / معرفي</w:t>
+            </w:r>
+          </w:p>
+        </w:tc>
+      </w:tr>
+      <w:tr>
+        <w:tc>
+          <w:tcPr>
+            <w:tcW w:type="dxa" w:w="7087"/>
+          </w:tcPr>
+          <w:p>
+            <w:pPr>
+              <w:bidi w:val="1"/>
+              <w:spacing w:after="40" w:line="312" w:lineRule="auto"/>
+              <w:jc w:val="right"/>
+            </w:pPr>
+            <w:r/>
+            <w:r>
+              <w:rPr>
+                <w:rFonts w:ascii="Arial" w:hAnsi="Arial" w:cs="Arial"/>
+                <w:b w:val="0"/>
+                <w:color w:val="000000"/>
+                <w:sz w:val="23"/>
+                <w:rtl w:val="1"/>
+              </w:rPr>
+              <w:t>أن يكتبَ الطالبُ فقرةً قصيرةً من أربعِ إلى خمسِ جملٍ يصفُ فيها مكانًا في مدينته موظِّفًا زمنَ المضارعِ البسيطِ وصفاتٍ مناسبة.</w:t>
+            </w:r>
+          </w:p>
+        </w:tc>
+        <w:tc>
+          <w:tcPr>
+            <w:tcW w:type="dxa" w:w="2551"/>
+          </w:tcPr>
+          <w:p>
+            <w:pPr>
+              <w:bidi w:val="1"/>
+              <w:spacing w:after="40" w:line="312" w:lineRule="auto"/>
+              <w:jc w:val="right"/>
+            </w:pPr>
+            <w:r/>
+            <w:r>
+              <w:rPr>
+                <w:rFonts w:ascii="Arial" w:hAnsi="Arial" w:cs="Arial"/>
+                <w:b w:val="0"/>
+                <w:color w:val="000000"/>
+                <w:sz w:val="23"/>
+                <w:rtl w:val="1"/>
+              </w:rPr>
+              <w:t>لغوي / مهاري</w:t>
+            </w:r>
+          </w:p>
+        </w:tc>
+      </w:tr>
+      <w:tr>
+        <w:tc>
+          <w:tcPr>
+            <w:tcW w:type="dxa" w:w="7087"/>
+          </w:tcPr>
+          <w:p>
+            <w:pPr>
+              <w:bidi w:val="1"/>
+              <w:spacing w:after="40" w:line="312" w:lineRule="auto"/>
+              <w:jc w:val="right"/>
+            </w:pPr>
+            <w:r/>
+            <w:r>
+              <w:rPr>
+                <w:rFonts w:ascii="Arial" w:hAnsi="Arial" w:cs="Arial"/>
+                <w:b w:val="0"/>
+                <w:color w:val="000000"/>
+                <w:sz w:val="23"/>
+                <w:rtl w:val="1"/>
+              </w:rPr>
+              <w:t>أن يعرضَ الطالبُ فكرته شفويًّا بجملةٍ أو جملتين أمام مجموعتِه الصغيرة.</w:t>
+            </w:r>
+          </w:p>
+        </w:tc>
+        <w:tc>
+          <w:tcPr>
+            <w:tcW w:type="dxa" w:w="2551"/>
+          </w:tcPr>
+          <w:p>
+            <w:pPr>
+              <w:bidi w:val="1"/>
+              <w:spacing w:after="40" w:line="312" w:lineRule="auto"/>
+              <w:jc w:val="right"/>
+            </w:pPr>
+            <w:r/>
+            <w:r>
+              <w:rPr>
+                <w:rFonts w:ascii="Arial" w:hAnsi="Arial" w:cs="Arial"/>
+                <w:b w:val="0"/>
+                <w:color w:val="000000"/>
+                <w:sz w:val="23"/>
+                <w:rtl w:val="1"/>
+              </w:rPr>
+              <w:t>مهاري / تواصلي</w:t>
+            </w:r>
+          </w:p>
+        </w:tc>
+      </w:tr>
+      <w:tr>
+        <w:tc>
+          <w:tcPr>
+            <w:tcW w:type="dxa" w:w="7087"/>
+          </w:tcPr>
+          <w:p>
+            <w:pPr>
+              <w:bidi w:val="1"/>
+              <w:spacing w:after="40" w:line="312" w:lineRule="auto"/>
+              <w:jc w:val="right"/>
+            </w:pPr>
+            <w:r/>
+            <w:r>
+              <w:rPr>
+                <w:rFonts w:ascii="Arial" w:hAnsi="Arial" w:cs="Arial"/>
+                <w:b w:val="0"/>
+                <w:color w:val="000000"/>
+                <w:sz w:val="23"/>
+                <w:rtl w:val="1"/>
+              </w:rPr>
+              <w:t>أن يشعرَ الطالبُ بأنَّ لغته الإنجليزيةَ قادرةٌ على التعبيرِ عن حياتِه هو، لا عن نصوصٍ جاهزةٍ بعيدةٍ عنه.</w:t>
+            </w:r>
+          </w:p>
+        </w:tc>
+        <w:tc>
+          <w:tcPr>
+            <w:tcW w:type="dxa" w:w="2551"/>
+          </w:tcPr>
+          <w:p>
+            <w:pPr>
+              <w:bidi w:val="1"/>
+              <w:spacing w:after="40" w:line="312" w:lineRule="auto"/>
+              <w:jc w:val="right"/>
+            </w:pPr>
+            <w:r/>
+            <w:r>
+              <w:rPr>
+                <w:rFonts w:ascii="Arial" w:hAnsi="Arial" w:cs="Arial"/>
+                <w:b w:val="0"/>
+                <w:color w:val="000000"/>
+                <w:sz w:val="23"/>
+                <w:rtl w:val="1"/>
+              </w:rPr>
+              <w:t>قيمي / وجداني</w:t>
+            </w:r>
+          </w:p>
+        </w:tc>
+      </w:tr>
+      <w:tr>
+        <w:tc>
+          <w:tcPr>
+            <w:tcW w:type="dxa" w:w="7087"/>
+          </w:tcPr>
+          <w:p>
+            <w:pPr>
+              <w:bidi w:val="1"/>
+              <w:spacing w:after="40" w:line="312" w:lineRule="auto"/>
+              <w:jc w:val="right"/>
+            </w:pPr>
+            <w:r/>
+            <w:r>
+              <w:rPr>
+                <w:rFonts w:ascii="Arial" w:hAnsi="Arial" w:cs="Arial"/>
+                <w:b w:val="0"/>
+                <w:color w:val="000000"/>
+                <w:sz w:val="23"/>
+                <w:rtl w:val="1"/>
+              </w:rPr>
+              <w:t>أن يعتزَّ الطالبُ بمدينتِه وبقصصِ أهلِه، وأن ينقلَ هذا الاعتزازَ إلى لغةٍ ثانية.</w:t>
+            </w:r>
+          </w:p>
+        </w:tc>
+        <w:tc>
+          <w:tcPr>
+            <w:tcW w:type="dxa" w:w="2551"/>
+          </w:tcPr>
+          <w:p>
+            <w:pPr>
+              <w:bidi w:val="1"/>
+              <w:spacing w:after="40" w:line="312" w:lineRule="auto"/>
+              <w:jc w:val="right"/>
+            </w:pPr>
+            <w:r/>
+            <w:r>
+              <w:rPr>
+                <w:rFonts w:ascii="Arial" w:hAnsi="Arial" w:cs="Arial"/>
+                <w:b w:val="0"/>
+                <w:color w:val="000000"/>
+                <w:sz w:val="23"/>
+                <w:rtl w:val="1"/>
+              </w:rPr>
+              <w:t>قيمي</w:t>
+            </w:r>
+          </w:p>
+        </w:tc>
+      </w:tr>
+    </w:tbl>
     <w:p>
       <w:pPr>
         <w:bidi w:val="1"/>
-        <w:spacing w:after="40" w:before="0" w:line="336" w:lineRule="auto"/>
+        <w:spacing w:after="80" w:before="0" w:line="360" w:lineRule="auto"/>
         <w:jc w:val="both"/>
       </w:pPr>
       <w:r>
         <w:rPr>
           <w:rFonts w:ascii="Arial" w:hAnsi="Arial" w:cs="Arial"/>
-          <w:b/>
-          <w:sz w:val="26"/>
-          <w:bCs/>
-          <w:rtl w:val="1"/>
-        </w:rPr>
-        <w:t>الأهداف التعليمية (اللغوية):</w:t>
-      </w:r>
-    </w:p>
-    <w:p>
-      <w:pPr>
-        <w:pStyle w:val="ListBullet"/>
-        <w:bidi w:val="1"/>
-        <w:spacing w:after="80" w:line="324" w:lineRule="auto"/>
-        <w:jc w:val="right"/>
-      </w:pPr>
-      <w:r>
-        <w:rPr>
-          <w:rFonts w:ascii="Arial" w:hAnsi="Arial" w:cs="Arial"/>
           <w:b w:val="0"/>
+          <w:color w:val="000000"/>
           <w:sz w:val="26"/>
           <w:rtl w:val="1"/>
         </w:rPr>
-        <w:t xml:space="preserve"> أن يستعمل الطالب من 8 إلى 10 كلمات جديدة مرتبطة بوصف الأماكن (مثل: crowded, ancient, peaceful, market, view).</w:t>
-      </w:r>
-    </w:p>
-    <w:p>
-      <w:pPr>
-        <w:pStyle w:val="ListBullet"/>
-        <w:bidi w:val="1"/>
-        <w:spacing w:after="80" w:line="324" w:lineRule="auto"/>
-        <w:jc w:val="right"/>
-      </w:pPr>
-      <w:r>
-        <w:rPr>
-          <w:rFonts w:ascii="Arial" w:hAnsi="Arial" w:cs="Arial"/>
-          <w:b w:val="0"/>
-          <w:sz w:val="26"/>
-          <w:rtl w:val="1"/>
-        </w:rPr>
-        <w:t xml:space="preserve"> أن يكتب الطالب فقرة قصيرة من 4 إلى 5 جمل يصف فيها مكانًا في مدينته باستعمال زمن المضارع البسيط وصفات مناسبة.</w:t>
-      </w:r>
-    </w:p>
-    <w:p>
-      <w:pPr>
-        <w:pStyle w:val="ListBullet"/>
-        <w:bidi w:val="1"/>
-        <w:spacing w:after="80" w:line="324" w:lineRule="auto"/>
-        <w:jc w:val="right"/>
-      </w:pPr>
-      <w:r>
-        <w:rPr>
-          <w:rFonts w:ascii="Arial" w:hAnsi="Arial" w:cs="Arial"/>
-          <w:b w:val="0"/>
-          <w:sz w:val="26"/>
-          <w:rtl w:val="1"/>
-        </w:rPr>
-        <w:t xml:space="preserve"> أن يعرض الطالب فكرته شفويًا بجملة أو جملتين أمام مجموعته الصغيرة.</w:t>
-      </w:r>
-    </w:p>
-    <w:p>
-      <w:pPr>
-        <w:bidi w:val="1"/>
-        <w:spacing w:after="40" w:before="120" w:line="336" w:lineRule="auto"/>
-        <w:jc w:val="both"/>
-      </w:pPr>
-      <w:r>
-        <w:rPr>
-          <w:rFonts w:ascii="Arial" w:hAnsi="Arial" w:cs="Arial"/>
-          <w:b/>
-          <w:sz w:val="26"/>
-          <w:bCs/>
-          <w:rtl w:val="1"/>
-        </w:rPr>
-        <w:t>الأهداف القيمية والتربوية:</w:t>
-      </w:r>
-    </w:p>
-    <w:p>
-      <w:pPr>
-        <w:pStyle w:val="ListBullet"/>
-        <w:bidi w:val="1"/>
-        <w:spacing w:after="80" w:line="324" w:lineRule="auto"/>
-        <w:jc w:val="right"/>
-      </w:pPr>
-      <w:r>
-        <w:rPr>
-          <w:rFonts w:ascii="Arial" w:hAnsi="Arial" w:cs="Arial"/>
-          <w:b w:val="0"/>
-          <w:sz w:val="26"/>
-          <w:rtl w:val="1"/>
-        </w:rPr>
-        <w:t xml:space="preserve"> أن يشعر الطالب بأن لغته الإنجليزية تقدر تحكي عن حياته هو، مش بس عن نصوص جاهزة بالكتاب.</w:t>
-      </w:r>
-    </w:p>
-    <w:p>
-      <w:pPr>
-        <w:pStyle w:val="ListBullet"/>
-        <w:bidi w:val="1"/>
-        <w:spacing w:after="80" w:line="324" w:lineRule="auto"/>
-        <w:jc w:val="right"/>
-      </w:pPr>
-      <w:r>
-        <w:rPr>
-          <w:rFonts w:ascii="Arial" w:hAnsi="Arial" w:cs="Arial"/>
-          <w:b w:val="0"/>
-          <w:sz w:val="26"/>
-          <w:rtl w:val="1"/>
-        </w:rPr>
-        <w:t xml:space="preserve"> أن يعتزّ الطالب بمدينته وبقصص أهله، وأن ينقل هذا الاعتزاز للغة ثانية.</w:t>
-      </w:r>
-    </w:p>
-    <w:p>
-      <w:pPr>
-        <w:pStyle w:val="ListBullet"/>
-        <w:bidi w:val="1"/>
-        <w:spacing w:after="80" w:line="324" w:lineRule="auto"/>
-        <w:jc w:val="right"/>
-      </w:pPr>
-      <w:r>
-        <w:rPr>
-          <w:rFonts w:ascii="Arial" w:hAnsi="Arial" w:cs="Arial"/>
-          <w:b w:val="0"/>
-          <w:sz w:val="26"/>
-          <w:rtl w:val="1"/>
-        </w:rPr>
-        <w:t xml:space="preserve"> أن يتعوّد الطالب على احترام كلام زميله والإصغاء له وقت العرض داخل المجموعة.</w:t>
       </w:r>
     </w:p>
     <w:p>
@@ -472,97 +696,331 @@
         <w:rPr>
           <w:rFonts w:ascii="Arial" w:hAnsi="Arial" w:cs="Arial"/>
           <w:b/>
-          <w:color w:val="222A33"/>
-          <w:sz w:val="28"/>
+          <w:color w:val="000000"/>
+          <w:sz w:val="27"/>
           <w:bCs/>
           <w:rtl w:val="1"/>
         </w:rPr>
-        <w:t>4. المواد والوسائل التعليمية</w:t>
+        <w:t>الموادُّ والوسائلُ التعليمية</w:t>
       </w:r>
     </w:p>
+    <w:tbl>
+      <w:tblPr>
+        <w:tblStyle w:val="TableGrid"/>
+        <w:tblW w:type="auto" w:w="0"/>
+        <w:jc w:val="center"/>
+        <w:tblLook w:firstColumn="1" w:firstRow="1" w:lastColumn="0" w:lastRow="0" w:noHBand="0" w:noVBand="1" w:val="04A0"/>
+        <w:bidiVisual/>
+      </w:tblPr>
+      <w:tblGrid>
+        <w:gridCol w:w="4873"/>
+        <w:gridCol w:w="4873"/>
+      </w:tblGrid>
+      <w:tr>
+        <w:tc>
+          <w:tcPr>
+            <w:tcW w:type="dxa" w:w="5102"/>
+          </w:tcPr>
+          <w:p>
+            <w:pPr>
+              <w:bidi w:val="1"/>
+              <w:spacing w:after="40" w:line="312" w:lineRule="auto"/>
+              <w:jc w:val="right"/>
+            </w:pPr>
+            <w:r/>
+            <w:r>
+              <w:rPr>
+                <w:rFonts w:ascii="Arial" w:hAnsi="Arial" w:cs="Arial"/>
+                <w:b/>
+                <w:color w:val="000000"/>
+                <w:sz w:val="23"/>
+                <w:bCs/>
+                <w:rtl w:val="1"/>
+              </w:rPr>
+              <w:t>الوسيلة</w:t>
+            </w:r>
+          </w:p>
+        </w:tc>
+        <w:tc>
+          <w:tcPr>
+            <w:tcW w:type="dxa" w:w="4535"/>
+          </w:tcPr>
+          <w:p>
+            <w:pPr>
+              <w:bidi w:val="1"/>
+              <w:spacing w:after="40" w:line="312" w:lineRule="auto"/>
+              <w:jc w:val="right"/>
+            </w:pPr>
+            <w:r/>
+            <w:r>
+              <w:rPr>
+                <w:rFonts w:ascii="Arial" w:hAnsi="Arial" w:cs="Arial"/>
+                <w:b/>
+                <w:color w:val="000000"/>
+                <w:sz w:val="23"/>
+                <w:bCs/>
+                <w:rtl w:val="1"/>
+              </w:rPr>
+              <w:t>الغرضُ منها</w:t>
+            </w:r>
+          </w:p>
+        </w:tc>
+      </w:tr>
+      <w:tr>
+        <w:tc>
+          <w:tcPr>
+            <w:tcW w:type="dxa" w:w="5102"/>
+          </w:tcPr>
+          <w:p>
+            <w:pPr>
+              <w:bidi w:val="1"/>
+              <w:spacing w:after="40" w:line="312" w:lineRule="auto"/>
+              <w:jc w:val="right"/>
+            </w:pPr>
+            <w:r/>
+            <w:r>
+              <w:rPr>
+                <w:rFonts w:ascii="Arial" w:hAnsi="Arial" w:cs="Arial"/>
+                <w:b w:val="0"/>
+                <w:color w:val="000000"/>
+                <w:sz w:val="23"/>
+                <w:rtl w:val="1"/>
+              </w:rPr>
+              <w:t>بطاقاتُ مفرداتٍ مصوَّرةٌ عن الأماكنِ والأوصاف</w:t>
+            </w:r>
+          </w:p>
+        </w:tc>
+        <w:tc>
+          <w:tcPr>
+            <w:tcW w:type="dxa" w:w="4535"/>
+          </w:tcPr>
+          <w:p>
+            <w:pPr>
+              <w:bidi w:val="1"/>
+              <w:spacing w:after="40" w:line="312" w:lineRule="auto"/>
+              <w:jc w:val="right"/>
+            </w:pPr>
+            <w:r/>
+            <w:r>
+              <w:rPr>
+                <w:rFonts w:ascii="Arial" w:hAnsi="Arial" w:cs="Arial"/>
+                <w:b w:val="0"/>
+                <w:color w:val="000000"/>
+                <w:sz w:val="23"/>
+                <w:rtl w:val="1"/>
+              </w:rPr>
+              <w:t>ربطُ المفردةِ بصورةٍ محسوسةٍ لترسيخِها لدى المتعلمِ البصري</w:t>
+            </w:r>
+          </w:p>
+        </w:tc>
+      </w:tr>
+      <w:tr>
+        <w:tc>
+          <w:tcPr>
+            <w:tcW w:type="dxa" w:w="5102"/>
+          </w:tcPr>
+          <w:p>
+            <w:pPr>
+              <w:bidi w:val="1"/>
+              <w:spacing w:after="40" w:line="312" w:lineRule="auto"/>
+              <w:jc w:val="right"/>
+            </w:pPr>
+            <w:r/>
+            <w:r>
+              <w:rPr>
+                <w:rFonts w:ascii="Arial" w:hAnsi="Arial" w:cs="Arial"/>
+                <w:b w:val="0"/>
+                <w:color w:val="000000"/>
+                <w:sz w:val="23"/>
+                <w:rtl w:val="1"/>
+              </w:rPr>
+              <w:t>ورقةُ عملٍ فيها هيكلُ الفقرةِ وبداياتُ جملٍ جاهزة</w:t>
+            </w:r>
+          </w:p>
+        </w:tc>
+        <w:tc>
+          <w:tcPr>
+            <w:tcW w:type="dxa" w:w="4535"/>
+          </w:tcPr>
+          <w:p>
+            <w:pPr>
+              <w:bidi w:val="1"/>
+              <w:spacing w:after="40" w:line="312" w:lineRule="auto"/>
+              <w:jc w:val="right"/>
+            </w:pPr>
+            <w:r/>
+            <w:r>
+              <w:rPr>
+                <w:rFonts w:ascii="Arial" w:hAnsi="Arial" w:cs="Arial"/>
+                <w:b w:val="0"/>
+                <w:color w:val="000000"/>
+                <w:sz w:val="23"/>
+                <w:rtl w:val="1"/>
+              </w:rPr>
+              <w:t>إسنادُ الطالبِ الأضعفِ حتى لا يبدأَ الكتابةَ من فراغ</w:t>
+            </w:r>
+          </w:p>
+        </w:tc>
+      </w:tr>
+      <w:tr>
+        <w:tc>
+          <w:tcPr>
+            <w:tcW w:type="dxa" w:w="5102"/>
+          </w:tcPr>
+          <w:p>
+            <w:pPr>
+              <w:bidi w:val="1"/>
+              <w:spacing w:after="40" w:line="312" w:lineRule="auto"/>
+              <w:jc w:val="right"/>
+            </w:pPr>
+            <w:r/>
+            <w:r>
+              <w:rPr>
+                <w:rFonts w:ascii="Arial" w:hAnsi="Arial" w:cs="Arial"/>
+                <w:b w:val="0"/>
+                <w:color w:val="000000"/>
+                <w:sz w:val="23"/>
+                <w:rtl w:val="1"/>
+              </w:rPr>
+              <w:t>صورٌ من شفرعم: السوقُ القديم، حارةٌ قديمة، إطلالةٌ على البلد</w:t>
+            </w:r>
+          </w:p>
+        </w:tc>
+        <w:tc>
+          <w:tcPr>
+            <w:tcW w:type="dxa" w:w="4535"/>
+          </w:tcPr>
+          <w:p>
+            <w:pPr>
+              <w:bidi w:val="1"/>
+              <w:spacing w:after="40" w:line="312" w:lineRule="auto"/>
+              <w:jc w:val="right"/>
+            </w:pPr>
+            <w:r/>
+            <w:r>
+              <w:rPr>
+                <w:rFonts w:ascii="Arial" w:hAnsi="Arial" w:cs="Arial"/>
+                <w:b w:val="0"/>
+                <w:color w:val="000000"/>
+                <w:sz w:val="23"/>
+                <w:rtl w:val="1"/>
+              </w:rPr>
+              <w:t>إثارةُ الدافعيةِ وتقريبُ الموضوعِ من واقعِ الطلاب</w:t>
+            </w:r>
+          </w:p>
+        </w:tc>
+      </w:tr>
+      <w:tr>
+        <w:tc>
+          <w:tcPr>
+            <w:tcW w:type="dxa" w:w="5102"/>
+          </w:tcPr>
+          <w:p>
+            <w:pPr>
+              <w:bidi w:val="1"/>
+              <w:spacing w:after="40" w:line="312" w:lineRule="auto"/>
+              <w:jc w:val="right"/>
+            </w:pPr>
+            <w:r/>
+            <w:r>
+              <w:rPr>
+                <w:rFonts w:ascii="Arial" w:hAnsi="Arial" w:cs="Arial"/>
+                <w:b w:val="0"/>
+                <w:color w:val="000000"/>
+                <w:sz w:val="23"/>
+                <w:rtl w:val="1"/>
+              </w:rPr>
+              <w:t>مقطعٌ صوتيٌّ قصيرٌ لشخصٍ يعرِّفُ بمدينتِه بالإنجليزية</w:t>
+            </w:r>
+          </w:p>
+        </w:tc>
+        <w:tc>
+          <w:tcPr>
+            <w:tcW w:type="dxa" w:w="4535"/>
+          </w:tcPr>
+          <w:p>
+            <w:pPr>
+              <w:bidi w:val="1"/>
+              <w:spacing w:after="40" w:line="312" w:lineRule="auto"/>
+              <w:jc w:val="right"/>
+            </w:pPr>
+            <w:r/>
+            <w:r>
+              <w:rPr>
+                <w:rFonts w:ascii="Arial" w:hAnsi="Arial" w:cs="Arial"/>
+                <w:b w:val="0"/>
+                <w:color w:val="000000"/>
+                <w:sz w:val="23"/>
+                <w:rtl w:val="1"/>
+              </w:rPr>
+              <w:t>نموذجُ استماعٍ أصيلٌ يُحتذى في العرضِ الشفوي</w:t>
+            </w:r>
+          </w:p>
+        </w:tc>
+      </w:tr>
+      <w:tr>
+        <w:tc>
+          <w:tcPr>
+            <w:tcW w:type="dxa" w:w="5102"/>
+          </w:tcPr>
+          <w:p>
+            <w:pPr>
+              <w:bidi w:val="1"/>
+              <w:spacing w:after="40" w:line="312" w:lineRule="auto"/>
+              <w:jc w:val="right"/>
+            </w:pPr>
+            <w:r/>
+            <w:r>
+              <w:rPr>
+                <w:rFonts w:ascii="Arial" w:hAnsi="Arial" w:cs="Arial"/>
+                <w:b w:val="0"/>
+                <w:color w:val="000000"/>
+                <w:sz w:val="23"/>
+                <w:rtl w:val="1"/>
+              </w:rPr>
+              <w:t>أوراقٌ كبيرةٌ وأقلامٌ لكلِّ مجموعة</w:t>
+            </w:r>
+          </w:p>
+        </w:tc>
+        <w:tc>
+          <w:tcPr>
+            <w:tcW w:type="dxa" w:w="4535"/>
+          </w:tcPr>
+          <w:p>
+            <w:pPr>
+              <w:bidi w:val="1"/>
+              <w:spacing w:after="40" w:line="312" w:lineRule="auto"/>
+              <w:jc w:val="right"/>
+            </w:pPr>
+            <w:r/>
+            <w:r>
+              <w:rPr>
+                <w:rFonts w:ascii="Arial" w:hAnsi="Arial" w:cs="Arial"/>
+                <w:b w:val="0"/>
+                <w:color w:val="000000"/>
+                <w:sz w:val="23"/>
+                <w:rtl w:val="1"/>
+              </w:rPr>
+              <w:t>إخراجُ نتاجِ المجموعةِ وعرضُه في نهايةِ المشروع</w:t>
+            </w:r>
+          </w:p>
+        </w:tc>
+      </w:tr>
+    </w:tbl>
     <w:p>
       <w:pPr>
-        <w:pStyle w:val="ListBullet"/>
         <w:bidi w:val="1"/>
-        <w:spacing w:after="80" w:line="324" w:lineRule="auto"/>
-        <w:jc w:val="right"/>
+        <w:spacing w:after="80" w:before="0" w:line="360" w:lineRule="auto"/>
+        <w:jc w:val="both"/>
       </w:pPr>
       <w:r>
         <w:rPr>
           <w:rFonts w:ascii="Arial" w:hAnsi="Arial" w:cs="Arial"/>
           <w:b w:val="0"/>
+          <w:color w:val="000000"/>
           <w:sz w:val="26"/>
           <w:rtl w:val="1"/>
         </w:rPr>
-        <w:t xml:space="preserve"> بطاقات كلمات (word cards) مصوّرة عن الأماكن والأوصاف.</w:t>
-      </w:r>
-    </w:p>
-    <w:p>
-      <w:pPr>
-        <w:pStyle w:val="ListBullet"/>
-        <w:bidi w:val="1"/>
-        <w:spacing w:after="80" w:line="324" w:lineRule="auto"/>
-        <w:jc w:val="right"/>
-      </w:pPr>
-      <w:r>
-        <w:rPr>
-          <w:rFonts w:ascii="Arial" w:hAnsi="Arial" w:cs="Arial"/>
-          <w:b w:val="0"/>
-          <w:sz w:val="26"/>
-          <w:rtl w:val="1"/>
-        </w:rPr>
-        <w:t xml:space="preserve"> ورقة عمل فيها هيكل الفقرة: بداية جملة (sentence starters) وفراغات يكمّلها الطالب.</w:t>
-      </w:r>
-    </w:p>
-    <w:p>
-      <w:pPr>
-        <w:pStyle w:val="ListBullet"/>
-        <w:bidi w:val="1"/>
-        <w:spacing w:after="80" w:line="324" w:lineRule="auto"/>
-        <w:jc w:val="right"/>
-      </w:pPr>
-      <w:r>
-        <w:rPr>
-          <w:rFonts w:ascii="Arial" w:hAnsi="Arial" w:cs="Arial"/>
-          <w:b w:val="0"/>
-          <w:sz w:val="26"/>
-          <w:rtl w:val="1"/>
-        </w:rPr>
-        <w:t xml:space="preserve"> صور من شفرعم عرضتها على الشاشة: السوق القديم، حارة قديمة، إطلالة على البلد.</w:t>
-      </w:r>
-    </w:p>
-    <w:p>
-      <w:pPr>
-        <w:pStyle w:val="ListBullet"/>
-        <w:bidi w:val="1"/>
-        <w:spacing w:after="80" w:line="324" w:lineRule="auto"/>
-        <w:jc w:val="right"/>
-      </w:pPr>
-      <w:r>
-        <w:rPr>
-          <w:rFonts w:ascii="Arial" w:hAnsi="Arial" w:cs="Arial"/>
-          <w:b w:val="0"/>
-          <w:sz w:val="26"/>
-          <w:rtl w:val="1"/>
-        </w:rPr>
-        <w:t xml:space="preserve"> لوح وأقلام ملوّنة، وأوراق كبيرة لكل مجموعة تلصق عليها فقراتها بآخر المشروع.</w:t>
-      </w:r>
-    </w:p>
-    <w:p>
-      <w:pPr>
-        <w:pStyle w:val="ListBullet"/>
-        <w:bidi w:val="1"/>
-        <w:spacing w:after="80" w:line="324" w:lineRule="auto"/>
-        <w:jc w:val="right"/>
-      </w:pPr>
-      <w:r>
-        <w:rPr>
-          <w:rFonts w:ascii="Arial" w:hAnsi="Arial" w:cs="Arial"/>
-          <w:b w:val="0"/>
-          <w:sz w:val="26"/>
-          <w:rtl w:val="1"/>
-        </w:rPr>
-        <w:t xml:space="preserve"> هاتفي لتشغيل مقطع صوتي قصير لشخص يعرّف عن مدينته بالإنجليزية كنموذج للاستماع.</w:t>
       </w:r>
     </w:p>
     <w:p>
@@ -575,163 +1033,626 @@
         <w:rPr>
           <w:rFonts w:ascii="Arial" w:hAnsi="Arial" w:cs="Arial"/>
           <w:b/>
-          <w:color w:val="222A33"/>
-          <w:sz w:val="28"/>
+          <w:color w:val="000000"/>
+          <w:sz w:val="27"/>
           <w:bCs/>
           <w:rtl w:val="1"/>
         </w:rPr>
-        <w:t>5. سير الدرس</w:t>
+        <w:t>سيرُ الدرس</w:t>
       </w:r>
     </w:p>
+    <w:tbl>
+      <w:tblPr>
+        <w:tblStyle w:val="TableGrid"/>
+        <w:tblW w:type="auto" w:w="0"/>
+        <w:jc w:val="center"/>
+        <w:tblLook w:firstColumn="1" w:firstRow="1" w:lastColumn="0" w:lastRow="0" w:noHBand="0" w:noVBand="1" w:val="04A0"/>
+        <w:bidiVisual/>
+      </w:tblPr>
+      <w:tblGrid>
+        <w:gridCol w:w="2436"/>
+        <w:gridCol w:w="2436"/>
+        <w:gridCol w:w="2436"/>
+        <w:gridCol w:w="2436"/>
+      </w:tblGrid>
+      <w:tr>
+        <w:tc>
+          <w:tcPr>
+            <w:tcW w:type="dxa" w:w="1814"/>
+          </w:tcPr>
+          <w:p>
+            <w:pPr>
+              <w:bidi w:val="1"/>
+              <w:spacing w:after="40" w:line="312" w:lineRule="auto"/>
+              <w:jc w:val="center"/>
+            </w:pPr>
+            <w:r/>
+            <w:r>
+              <w:rPr>
+                <w:rFonts w:ascii="Arial" w:hAnsi="Arial" w:cs="Arial"/>
+                <w:b/>
+                <w:color w:val="000000"/>
+                <w:sz w:val="23"/>
+                <w:bCs/>
+                <w:rtl w:val="1"/>
+              </w:rPr>
+              <w:t>المرحلةُ والزمن</w:t>
+            </w:r>
+          </w:p>
+        </w:tc>
+        <w:tc>
+          <w:tcPr>
+            <w:tcW w:type="dxa" w:w="3855"/>
+          </w:tcPr>
+          <w:p>
+            <w:pPr>
+              <w:bidi w:val="1"/>
+              <w:spacing w:after="40" w:line="312" w:lineRule="auto"/>
+              <w:jc w:val="center"/>
+            </w:pPr>
+            <w:r/>
+            <w:r>
+              <w:rPr>
+                <w:rFonts w:ascii="Arial" w:hAnsi="Arial" w:cs="Arial"/>
+                <w:b/>
+                <w:color w:val="000000"/>
+                <w:sz w:val="23"/>
+                <w:bCs/>
+                <w:rtl w:val="1"/>
+              </w:rPr>
+              <w:t>سيرُ النشاطِ ودورُ المعلمة</w:t>
+            </w:r>
+          </w:p>
+        </w:tc>
+        <w:tc>
+          <w:tcPr>
+            <w:tcW w:type="dxa" w:w="2268"/>
+          </w:tcPr>
+          <w:p>
+            <w:pPr>
+              <w:bidi w:val="1"/>
+              <w:spacing w:after="40" w:line="312" w:lineRule="auto"/>
+              <w:jc w:val="center"/>
+            </w:pPr>
+            <w:r/>
+            <w:r>
+              <w:rPr>
+                <w:rFonts w:ascii="Arial" w:hAnsi="Arial" w:cs="Arial"/>
+                <w:b/>
+                <w:color w:val="000000"/>
+                <w:sz w:val="23"/>
+                <w:bCs/>
+                <w:rtl w:val="1"/>
+              </w:rPr>
+              <w:t>دورُ الطالب</w:t>
+            </w:r>
+          </w:p>
+        </w:tc>
+        <w:tc>
+          <w:tcPr>
+            <w:tcW w:type="dxa" w:w="1701"/>
+          </w:tcPr>
+          <w:p>
+            <w:pPr>
+              <w:bidi w:val="1"/>
+              <w:spacing w:after="40" w:line="312" w:lineRule="auto"/>
+              <w:jc w:val="center"/>
+            </w:pPr>
+            <w:r/>
+            <w:r>
+              <w:rPr>
+                <w:rFonts w:ascii="Arial" w:hAnsi="Arial" w:cs="Arial"/>
+                <w:b/>
+                <w:color w:val="000000"/>
+                <w:sz w:val="23"/>
+                <w:bCs/>
+                <w:rtl w:val="1"/>
+              </w:rPr>
+              <w:t>الوسائل</w:t>
+            </w:r>
+          </w:p>
+        </w:tc>
+      </w:tr>
+      <w:tr>
+        <w:tc>
+          <w:tcPr>
+            <w:tcW w:type="dxa" w:w="1814"/>
+          </w:tcPr>
+          <w:p>
+            <w:pPr>
+              <w:bidi w:val="1"/>
+              <w:spacing w:after="40" w:line="312" w:lineRule="auto"/>
+              <w:jc w:val="right"/>
+            </w:pPr>
+            <w:r/>
+            <w:r>
+              <w:rPr>
+                <w:rFonts w:ascii="Arial" w:hAnsi="Arial" w:cs="Arial"/>
+                <w:b/>
+                <w:color w:val="000000"/>
+                <w:sz w:val="23"/>
+                <w:bCs/>
+                <w:rtl w:val="1"/>
+              </w:rPr>
+              <w:t>المقدمة</w:t>
+              <w:br/>
+              <w:t>(10 دقائق)</w:t>
+            </w:r>
+          </w:p>
+        </w:tc>
+        <w:tc>
+          <w:tcPr>
+            <w:tcW w:type="dxa" w:w="3855"/>
+          </w:tcPr>
+          <w:p>
+            <w:pPr>
+              <w:bidi w:val="1"/>
+              <w:spacing w:after="40" w:line="312" w:lineRule="auto"/>
+              <w:jc w:val="right"/>
+            </w:pPr>
+            <w:r/>
+            <w:r>
+              <w:rPr>
+                <w:rFonts w:ascii="Arial" w:hAnsi="Arial" w:cs="Arial"/>
+                <w:b w:val="0"/>
+                <w:color w:val="000000"/>
+                <w:sz w:val="23"/>
+                <w:rtl w:val="1"/>
+              </w:rPr>
+              <w:t>أفتتحُ الحصةَ بسؤالٍ على السبورة: "?If a friend visits Shefar’am for one day, where do you take them". أتيحُ لهم الحديثَ بالعربيةِ أولًا حتى أفتحَ البابَ دون خوف، ثم أدوِّنُ الأماكنَ التي يذكرونها بالإنجليزيةِ على اللوح، فيتكوَّنُ بنكُ مفرداتٍ نابعٌ منهم لا منّي.</w:t>
+            </w:r>
+          </w:p>
+        </w:tc>
+        <w:tc>
+          <w:tcPr>
+            <w:tcW w:type="dxa" w:w="2268"/>
+          </w:tcPr>
+          <w:p>
+            <w:pPr>
+              <w:bidi w:val="1"/>
+              <w:spacing w:after="40" w:line="312" w:lineRule="auto"/>
+              <w:jc w:val="right"/>
+            </w:pPr>
+            <w:r/>
+            <w:r>
+              <w:rPr>
+                <w:rFonts w:ascii="Arial" w:hAnsi="Arial" w:cs="Arial"/>
+                <w:b w:val="0"/>
+                <w:color w:val="000000"/>
+                <w:sz w:val="23"/>
+                <w:rtl w:val="1"/>
+              </w:rPr>
+              <w:t>يستحضرُ أماكنَ يعرفُها، يشاركُ برأيه، ويتعرَّفُ على المفرداتِ في سياقٍ حيّ.</w:t>
+            </w:r>
+          </w:p>
+        </w:tc>
+        <w:tc>
+          <w:tcPr>
+            <w:tcW w:type="dxa" w:w="1701"/>
+          </w:tcPr>
+          <w:p>
+            <w:pPr>
+              <w:bidi w:val="1"/>
+              <w:spacing w:after="40" w:line="312" w:lineRule="auto"/>
+              <w:jc w:val="right"/>
+            </w:pPr>
+            <w:r/>
+            <w:r>
+              <w:rPr>
+                <w:rFonts w:ascii="Arial" w:hAnsi="Arial" w:cs="Arial"/>
+                <w:b w:val="0"/>
+                <w:color w:val="000000"/>
+                <w:sz w:val="23"/>
+                <w:rtl w:val="1"/>
+              </w:rPr>
+              <w:t>السبورة، صورٌ من البلد</w:t>
+            </w:r>
+          </w:p>
+        </w:tc>
+      </w:tr>
+      <w:tr>
+        <w:tc>
+          <w:tcPr>
+            <w:tcW w:type="dxa" w:w="1814"/>
+          </w:tcPr>
+          <w:p>
+            <w:pPr>
+              <w:bidi w:val="1"/>
+              <w:spacing w:after="40" w:line="312" w:lineRule="auto"/>
+              <w:jc w:val="right"/>
+            </w:pPr>
+            <w:r/>
+            <w:r>
+              <w:rPr>
+                <w:rFonts w:ascii="Arial" w:hAnsi="Arial" w:cs="Arial"/>
+                <w:b/>
+                <w:color w:val="000000"/>
+                <w:sz w:val="23"/>
+                <w:bCs/>
+                <w:rtl w:val="1"/>
+              </w:rPr>
+              <w:t>مجريات الدرس – الاستماع</w:t>
+              <w:br/>
+              <w:t>(7 دقائق)</w:t>
+            </w:r>
+          </w:p>
+        </w:tc>
+        <w:tc>
+          <w:tcPr>
+            <w:tcW w:type="dxa" w:w="3855"/>
+          </w:tcPr>
+          <w:p>
+            <w:pPr>
+              <w:bidi w:val="1"/>
+              <w:spacing w:after="40" w:line="312" w:lineRule="auto"/>
+              <w:jc w:val="right"/>
+            </w:pPr>
+            <w:r/>
+            <w:r>
+              <w:rPr>
+                <w:rFonts w:ascii="Arial" w:hAnsi="Arial" w:cs="Arial"/>
+                <w:b w:val="0"/>
+                <w:color w:val="000000"/>
+                <w:sz w:val="23"/>
+                <w:rtl w:val="1"/>
+              </w:rPr>
+              <w:t>أُسمِعُهم المقطعَ الصوتيَّ مرتين، وأكلِّفهم بالتقاطِ صفتين وصفيتين فقط، ثم نراجعُهما معًا ونثبِّتُهما على اللوح.</w:t>
+            </w:r>
+          </w:p>
+        </w:tc>
+        <w:tc>
+          <w:tcPr>
+            <w:tcW w:type="dxa" w:w="2268"/>
+          </w:tcPr>
+          <w:p>
+            <w:pPr>
+              <w:bidi w:val="1"/>
+              <w:spacing w:after="40" w:line="312" w:lineRule="auto"/>
+              <w:jc w:val="right"/>
+            </w:pPr>
+            <w:r/>
+            <w:r>
+              <w:rPr>
+                <w:rFonts w:ascii="Arial" w:hAnsi="Arial" w:cs="Arial"/>
+                <w:b w:val="0"/>
+                <w:color w:val="000000"/>
+                <w:sz w:val="23"/>
+                <w:rtl w:val="1"/>
+              </w:rPr>
+              <w:t>يستمعُ بهدف، يلتقطُ مفرداتٍ محددة، ويشاركُ فيما سمِع.</w:t>
+            </w:r>
+          </w:p>
+        </w:tc>
+        <w:tc>
+          <w:tcPr>
+            <w:tcW w:type="dxa" w:w="1701"/>
+          </w:tcPr>
+          <w:p>
+            <w:pPr>
+              <w:bidi w:val="1"/>
+              <w:spacing w:after="40" w:line="312" w:lineRule="auto"/>
+              <w:jc w:val="right"/>
+            </w:pPr>
+            <w:r/>
+            <w:r>
+              <w:rPr>
+                <w:rFonts w:ascii="Arial" w:hAnsi="Arial" w:cs="Arial"/>
+                <w:b w:val="0"/>
+                <w:color w:val="000000"/>
+                <w:sz w:val="23"/>
+                <w:rtl w:val="1"/>
+              </w:rPr>
+              <w:t>المقطعُ الصوتي</w:t>
+            </w:r>
+          </w:p>
+        </w:tc>
+      </w:tr>
+      <w:tr>
+        <w:tc>
+          <w:tcPr>
+            <w:tcW w:type="dxa" w:w="1814"/>
+          </w:tcPr>
+          <w:p>
+            <w:pPr>
+              <w:bidi w:val="1"/>
+              <w:spacing w:after="40" w:line="312" w:lineRule="auto"/>
+              <w:jc w:val="right"/>
+            </w:pPr>
+            <w:r/>
+            <w:r>
+              <w:rPr>
+                <w:rFonts w:ascii="Arial" w:hAnsi="Arial" w:cs="Arial"/>
+                <w:b/>
+                <w:color w:val="000000"/>
+                <w:sz w:val="23"/>
+                <w:bCs/>
+                <w:rtl w:val="1"/>
+              </w:rPr>
+              <w:t>مجريات الدرس – بناءُ المفردات</w:t>
+              <w:br/>
+              <w:t>(8 دقائق)</w:t>
+            </w:r>
+          </w:p>
+        </w:tc>
+        <w:tc>
+          <w:tcPr>
+            <w:tcW w:type="dxa" w:w="3855"/>
+          </w:tcPr>
+          <w:p>
+            <w:pPr>
+              <w:bidi w:val="1"/>
+              <w:spacing w:after="40" w:line="312" w:lineRule="auto"/>
+              <w:jc w:val="right"/>
+            </w:pPr>
+            <w:r/>
+            <w:r>
+              <w:rPr>
+                <w:rFonts w:ascii="Arial" w:hAnsi="Arial" w:cs="Arial"/>
+                <w:b w:val="0"/>
+                <w:color w:val="000000"/>
+                <w:sz w:val="23"/>
+                <w:rtl w:val="1"/>
+              </w:rPr>
+              <w:t>أوزِّعُ بطاقاتِ المفردات، ونربطُ كلَّ مفردةٍ بصورةٍ من صورِ المدينة، ثم نلعبُ لعبةً سريعة: أنطقُ الصفةَ فيرفعون الصورةَ المناسبة.</w:t>
+            </w:r>
+          </w:p>
+        </w:tc>
+        <w:tc>
+          <w:tcPr>
+            <w:tcW w:type="dxa" w:w="2268"/>
+          </w:tcPr>
+          <w:p>
+            <w:pPr>
+              <w:bidi w:val="1"/>
+              <w:spacing w:after="40" w:line="312" w:lineRule="auto"/>
+              <w:jc w:val="right"/>
+            </w:pPr>
+            <w:r/>
+            <w:r>
+              <w:rPr>
+                <w:rFonts w:ascii="Arial" w:hAnsi="Arial" w:cs="Arial"/>
+                <w:b w:val="0"/>
+                <w:color w:val="000000"/>
+                <w:sz w:val="23"/>
+                <w:rtl w:val="1"/>
+              </w:rPr>
+              <w:t>يربطُ المفردةَ بمعناها المحسوس، ويتفاعلُ حركيًّا مع المحتوى.</w:t>
+            </w:r>
+          </w:p>
+        </w:tc>
+        <w:tc>
+          <w:tcPr>
+            <w:tcW w:type="dxa" w:w="1701"/>
+          </w:tcPr>
+          <w:p>
+            <w:pPr>
+              <w:bidi w:val="1"/>
+              <w:spacing w:after="40" w:line="312" w:lineRule="auto"/>
+              <w:jc w:val="right"/>
+            </w:pPr>
+            <w:r/>
+            <w:r>
+              <w:rPr>
+                <w:rFonts w:ascii="Arial" w:hAnsi="Arial" w:cs="Arial"/>
+                <w:b w:val="0"/>
+                <w:color w:val="000000"/>
+                <w:sz w:val="23"/>
+                <w:rtl w:val="1"/>
+              </w:rPr>
+              <w:t>بطاقاتُ المفردات</w:t>
+            </w:r>
+          </w:p>
+        </w:tc>
+      </w:tr>
+      <w:tr>
+        <w:tc>
+          <w:tcPr>
+            <w:tcW w:type="dxa" w:w="1814"/>
+          </w:tcPr>
+          <w:p>
+            <w:pPr>
+              <w:bidi w:val="1"/>
+              <w:spacing w:after="40" w:line="312" w:lineRule="auto"/>
+              <w:jc w:val="right"/>
+            </w:pPr>
+            <w:r/>
+            <w:r>
+              <w:rPr>
+                <w:rFonts w:ascii="Arial" w:hAnsi="Arial" w:cs="Arial"/>
+                <w:b/>
+                <w:color w:val="000000"/>
+                <w:sz w:val="23"/>
+                <w:bCs/>
+                <w:rtl w:val="1"/>
+              </w:rPr>
+              <w:t>مجريات الدرس – العملُ في مجموعاتٍ والكتابة</w:t>
+              <w:br/>
+              <w:t>(15 دقيقة)</w:t>
+            </w:r>
+          </w:p>
+        </w:tc>
+        <w:tc>
+          <w:tcPr>
+            <w:tcW w:type="dxa" w:w="3855"/>
+          </w:tcPr>
+          <w:p>
+            <w:pPr>
+              <w:bidi w:val="1"/>
+              <w:spacing w:after="40" w:line="312" w:lineRule="auto"/>
+              <w:jc w:val="right"/>
+            </w:pPr>
+            <w:r/>
+            <w:r>
+              <w:rPr>
+                <w:rFonts w:ascii="Arial" w:hAnsi="Arial" w:cs="Arial"/>
+                <w:b w:val="0"/>
+                <w:color w:val="000000"/>
+                <w:sz w:val="23"/>
+                <w:rtl w:val="1"/>
+              </w:rPr>
+              <w:t>أقسِّمُهم مجموعاتٍ من أربعة، تختارُ كلٌّ منها مكانًا واحدًا. أوزِّعُ ورقةَ العملِ بهيكلِ الفقرة، ويشرعون في الكتابةِ معًا، وأدورُ بينهم أُسنِدُ من يحتاج. يتولى الطالبُ الأقوى دورَ "المحرِّر" الذي يراجعُ الجمل، ويتولى الأضعفُ الرسمَ والكلماتِ المفتاحية، فلكلٍّ مهمة.</w:t>
+            </w:r>
+          </w:p>
+        </w:tc>
+        <w:tc>
+          <w:tcPr>
+            <w:tcW w:type="dxa" w:w="2268"/>
+          </w:tcPr>
+          <w:p>
+            <w:pPr>
+              <w:bidi w:val="1"/>
+              <w:spacing w:after="40" w:line="312" w:lineRule="auto"/>
+              <w:jc w:val="right"/>
+            </w:pPr>
+            <w:r/>
+            <w:r>
+              <w:rPr>
+                <w:rFonts w:ascii="Arial" w:hAnsi="Arial" w:cs="Arial"/>
+                <w:b w:val="0"/>
+                <w:color w:val="000000"/>
+                <w:sz w:val="23"/>
+                <w:rtl w:val="1"/>
+              </w:rPr>
+              <w:t>يتعاونُ ضمن دورٍ واضح، يكتبُ فقرةً قصيرة، ويتحملُ مسؤوليةَ جزءٍ من النتاج.</w:t>
+            </w:r>
+          </w:p>
+        </w:tc>
+        <w:tc>
+          <w:tcPr>
+            <w:tcW w:type="dxa" w:w="1701"/>
+          </w:tcPr>
+          <w:p>
+            <w:pPr>
+              <w:bidi w:val="1"/>
+              <w:spacing w:after="40" w:line="312" w:lineRule="auto"/>
+              <w:jc w:val="right"/>
+            </w:pPr>
+            <w:r/>
+            <w:r>
+              <w:rPr>
+                <w:rFonts w:ascii="Arial" w:hAnsi="Arial" w:cs="Arial"/>
+                <w:b w:val="0"/>
+                <w:color w:val="000000"/>
+                <w:sz w:val="23"/>
+                <w:rtl w:val="1"/>
+              </w:rPr>
+              <w:t>أوراقُ العمل، الأوراقُ الكبيرة</w:t>
+            </w:r>
+          </w:p>
+        </w:tc>
+      </w:tr>
+      <w:tr>
+        <w:tc>
+          <w:tcPr>
+            <w:tcW w:type="dxa" w:w="1814"/>
+          </w:tcPr>
+          <w:p>
+            <w:pPr>
+              <w:bidi w:val="1"/>
+              <w:spacing w:after="40" w:line="312" w:lineRule="auto"/>
+              <w:jc w:val="right"/>
+            </w:pPr>
+            <w:r/>
+            <w:r>
+              <w:rPr>
+                <w:rFonts w:ascii="Arial" w:hAnsi="Arial" w:cs="Arial"/>
+                <w:b/>
+                <w:color w:val="000000"/>
+                <w:sz w:val="23"/>
+                <w:bCs/>
+                <w:rtl w:val="1"/>
+              </w:rPr>
+              <w:t>الخاتمةُ والتقييم</w:t>
+              <w:br/>
+              <w:t>(10 دقائق)</w:t>
+            </w:r>
+          </w:p>
+        </w:tc>
+        <w:tc>
+          <w:tcPr>
+            <w:tcW w:type="dxa" w:w="3855"/>
+          </w:tcPr>
+          <w:p>
+            <w:pPr>
+              <w:bidi w:val="1"/>
+              <w:spacing w:after="40" w:line="312" w:lineRule="auto"/>
+              <w:jc w:val="right"/>
+            </w:pPr>
+            <w:r/>
+            <w:r>
+              <w:rPr>
+                <w:rFonts w:ascii="Arial" w:hAnsi="Arial" w:cs="Arial"/>
+                <w:b w:val="0"/>
+                <w:color w:val="000000"/>
+                <w:sz w:val="23"/>
+                <w:rtl w:val="1"/>
+              </w:rPr>
+              <w:t>تقرأُ كلُّ مجموعةٍ جملةً أو جملتين من فقرتها بصوتٍ عالٍ. لا أطلبُ الكمالَ بل المحاولة. أختمُ بسؤالٍ واحد: "ما أصعبُ كلمةٍ شعرتَ بها اليوم، وما أجملُ مكانٍ توصلتم إليه؟"، وأدوِّنُ ملاحظةً سريعةً عن كلِّ مجموعةٍ لأبنيَ عليها في الحصةِ التالية.</w:t>
+            </w:r>
+          </w:p>
+        </w:tc>
+        <w:tc>
+          <w:tcPr>
+            <w:tcW w:type="dxa" w:w="2268"/>
+          </w:tcPr>
+          <w:p>
+            <w:pPr>
+              <w:bidi w:val="1"/>
+              <w:spacing w:after="40" w:line="312" w:lineRule="auto"/>
+              <w:jc w:val="right"/>
+            </w:pPr>
+            <w:r/>
+            <w:r>
+              <w:rPr>
+                <w:rFonts w:ascii="Arial" w:hAnsi="Arial" w:cs="Arial"/>
+                <w:b w:val="0"/>
+                <w:color w:val="000000"/>
+                <w:sz w:val="23"/>
+                <w:rtl w:val="1"/>
+              </w:rPr>
+              <w:t>يعرضُ نتاجَه، يتأملُ في تعلُّمِه، ويقدِّمُ تغذيةً راجعةً عن تجربتِه.</w:t>
+            </w:r>
+          </w:p>
+        </w:tc>
+        <w:tc>
+          <w:tcPr>
+            <w:tcW w:type="dxa" w:w="1701"/>
+          </w:tcPr>
+          <w:p>
+            <w:pPr>
+              <w:bidi w:val="1"/>
+              <w:spacing w:after="40" w:line="312" w:lineRule="auto"/>
+              <w:jc w:val="right"/>
+            </w:pPr>
+            <w:r/>
+            <w:r>
+              <w:rPr>
+                <w:rFonts w:ascii="Arial" w:hAnsi="Arial" w:cs="Arial"/>
+                <w:b w:val="0"/>
+                <w:color w:val="000000"/>
+                <w:sz w:val="23"/>
+                <w:rtl w:val="1"/>
+              </w:rPr>
+              <w:t>الأوراقُ الكبيرة</w:t>
+            </w:r>
+          </w:p>
+        </w:tc>
+      </w:tr>
+    </w:tbl>
     <w:p>
       <w:pPr>
         <w:bidi w:val="1"/>
-        <w:spacing w:after="40" w:before="0" w:line="336" w:lineRule="auto"/>
-        <w:jc w:val="both"/>
-      </w:pPr>
-      <w:r>
-        <w:rPr>
-          <w:rFonts w:ascii="Arial" w:hAnsi="Arial" w:cs="Arial"/>
-          <w:b/>
-          <w:sz w:val="26"/>
-          <w:bCs/>
-          <w:rtl w:val="1"/>
-        </w:rPr>
-        <w:t>المقدمة (حوالي 10 دقائق):</w:t>
-      </w:r>
-    </w:p>
-    <w:p>
-      <w:pPr>
-        <w:bidi w:val="1"/>
-        <w:spacing w:after="160" w:before="0" w:line="336" w:lineRule="auto"/>
+        <w:spacing w:after="120" w:before="0" w:line="360" w:lineRule="auto"/>
         <w:jc w:val="both"/>
       </w:pPr>
       <w:r>
         <w:rPr>
           <w:rFonts w:ascii="Arial" w:hAnsi="Arial" w:cs="Arial"/>
           <w:b w:val="0"/>
+          <w:color w:val="000000"/>
           <w:sz w:val="26"/>
           <w:rtl w:val="1"/>
         </w:rPr>
-        <w:t>بلّشت الحصة بسؤال بسيط على السبورة: "?If a friend visits Shefar’am for one day, where do you take them". خليت الطلاب يحكوا بالعربي أول شي، عشان أفتح الباب وما يخافوا. بعدين جمعت الأماكن اللي قالوها وكتبتها بالإنجليزي على اللوح، وهيك صار عندنا بنك كلمات طالع منهم هم، مش مني أنا.</w:t>
-      </w:r>
-    </w:p>
-    <w:p>
-      <w:pPr>
-        <w:bidi w:val="1"/>
-        <w:spacing w:after="40" w:before="0" w:line="336" w:lineRule="auto"/>
-        <w:jc w:val="both"/>
-      </w:pPr>
-      <w:r>
-        <w:rPr>
-          <w:rFonts w:ascii="Arial" w:hAnsi="Arial" w:cs="Arial"/>
-          <w:b/>
-          <w:sz w:val="26"/>
-          <w:bCs/>
-          <w:rtl w:val="1"/>
-        </w:rPr>
-        <w:t>مجريات الدرس (حوالي 30 دقيقة):</w:t>
-      </w:r>
-    </w:p>
-    <w:p>
-      <w:pPr>
-        <w:pStyle w:val="ListBullet"/>
-        <w:bidi w:val="1"/>
-        <w:spacing w:after="80" w:line="324" w:lineRule="auto"/>
-        <w:jc w:val="right"/>
-      </w:pPr>
-      <w:r>
-        <w:rPr>
-          <w:rFonts w:ascii="Arial" w:hAnsi="Arial" w:cs="Arial"/>
-          <w:b w:val="0"/>
-          <w:sz w:val="26"/>
-          <w:rtl w:val="1"/>
-        </w:rPr>
-        <w:t xml:space="preserve"> سمّعتهم المقطع الصوتي القصير مرتين، وطلبت منهم يمسكوا كلمتين وصفيتين بس. راجعناهم سوا.</w:t>
-      </w:r>
-    </w:p>
-    <w:p>
-      <w:pPr>
-        <w:pStyle w:val="ListBullet"/>
-        <w:bidi w:val="1"/>
-        <w:spacing w:after="80" w:line="324" w:lineRule="auto"/>
-        <w:jc w:val="right"/>
-      </w:pPr>
-      <w:r>
-        <w:rPr>
-          <w:rFonts w:ascii="Arial" w:hAnsi="Arial" w:cs="Arial"/>
-          <w:b w:val="0"/>
-          <w:sz w:val="26"/>
-          <w:rtl w:val="1"/>
-        </w:rPr>
-        <w:t xml:space="preserve"> وزّعت بطاقات الكلمات وربطنا كل كلمة بصورة من صور البلد. لعبنا لعبة سريعة: أنا أقول الصفة، هم يرفعوا الصورة المناسبة.</w:t>
-      </w:r>
-    </w:p>
-    <w:p>
-      <w:pPr>
-        <w:pStyle w:val="ListBullet"/>
-        <w:bidi w:val="1"/>
-        <w:spacing w:after="80" w:line="324" w:lineRule="auto"/>
-        <w:jc w:val="right"/>
-      </w:pPr>
-      <w:r>
-        <w:rPr>
-          <w:rFonts w:ascii="Arial" w:hAnsi="Arial" w:cs="Arial"/>
-          <w:b w:val="0"/>
-          <w:sz w:val="26"/>
-          <w:rtl w:val="1"/>
-        </w:rPr>
-        <w:t xml:space="preserve"> قسّمتهم مجموعات من أربعة، وكل مجموعة اختارت مكان واحد. وزّعت ورقة العمل بهيكل الفقرة، وبلّشوا يكتبوا سوا، أنا أدور بينهم وأساعد اللي محتاج.</w:t>
-      </w:r>
-    </w:p>
-    <w:p>
-      <w:pPr>
-        <w:pStyle w:val="ListBullet"/>
-        <w:bidi w:val="1"/>
-        <w:spacing w:after="80" w:line="324" w:lineRule="auto"/>
-        <w:jc w:val="right"/>
-      </w:pPr>
-      <w:r>
-        <w:rPr>
-          <w:rFonts w:ascii="Arial" w:hAnsi="Arial" w:cs="Arial"/>
-          <w:b w:val="0"/>
-          <w:sz w:val="26"/>
-          <w:rtl w:val="1"/>
-        </w:rPr>
-        <w:t xml:space="preserve"> الطلاب الأقوى بالمجموعة أخذوا دور "المحرّر" اللي بيراجع الجمل، والأضعف أخذوا دور الرسم والكلمات المفتاحية، عشان كل واحد إلو شغلة.</w:t>
-      </w:r>
-    </w:p>
-    <w:p>
-      <w:pPr>
-        <w:bidi w:val="1"/>
-        <w:spacing w:after="40" w:before="120" w:line="336" w:lineRule="auto"/>
-        <w:jc w:val="both"/>
-      </w:pPr>
-      <w:r>
-        <w:rPr>
-          <w:rFonts w:ascii="Arial" w:hAnsi="Arial" w:cs="Arial"/>
-          <w:b/>
-          <w:sz w:val="26"/>
-          <w:bCs/>
-          <w:rtl w:val="1"/>
-        </w:rPr>
-        <w:t>الخاتمة (حوالي 10 دقائق):</w:t>
-      </w:r>
-    </w:p>
-    <w:p>
-      <w:pPr>
-        <w:bidi w:val="1"/>
-        <w:spacing w:after="200" w:before="0" w:line="336" w:lineRule="auto"/>
-        <w:jc w:val="both"/>
-      </w:pPr>
-      <w:r>
-        <w:rPr>
-          <w:rFonts w:ascii="Arial" w:hAnsi="Arial" w:cs="Arial"/>
-          <w:b w:val="0"/>
-          <w:sz w:val="26"/>
-          <w:rtl w:val="1"/>
-        </w:rPr>
-        <w:t>كل مجموعة قرأت جملة أو جملتين من فقرتها بصوت عالي. ما طلبت الكمال، طلبت إنهم يجرّبوا بس. وبآخر شي سألتهم سؤال واحد: "شو أصعب كلمة حسّيتها اليوم، وشو أحلى مكان طلع معكم؟". كتبت ملاحظة سريعة عن كل مجموعة عشان أبني عليها بالحصة الجاي.</w:t>
       </w:r>
     </w:p>
     <w:p>
@@ -744,111 +1665,63 @@
         <w:rPr>
           <w:rFonts w:ascii="Arial" w:hAnsi="Arial" w:cs="Arial"/>
           <w:b/>
-          <w:color w:val="222A33"/>
-          <w:sz w:val="28"/>
+          <w:color w:val="000000"/>
+          <w:sz w:val="27"/>
           <w:bCs/>
           <w:rtl w:val="1"/>
         </w:rPr>
-        <w:t>6. تأمّل شخصي حول تخطيط الفعالية</w:t>
+        <w:t>تأمُّلٌ شخصيٌّ حول تخطيطِ الفعالية</w:t>
       </w:r>
     </w:p>
     <w:p>
       <w:pPr>
         <w:bidi w:val="1"/>
-        <w:spacing w:after="40" w:before="0" w:line="336" w:lineRule="auto"/>
-        <w:jc w:val="both"/>
-      </w:pPr>
-      <w:r>
-        <w:rPr>
-          <w:rFonts w:ascii="Arial" w:hAnsi="Arial" w:cs="Arial"/>
-          <w:b/>
-          <w:sz w:val="26"/>
-          <w:bCs/>
-          <w:rtl w:val="1"/>
-        </w:rPr>
-        <w:t>ليش اخترت هذا الموضوع بالذات؟</w:t>
-      </w:r>
-    </w:p>
-    <w:p>
-      <w:pPr>
-        <w:bidi w:val="1"/>
-        <w:spacing w:after="160" w:before="0" w:line="336" w:lineRule="auto"/>
+        <w:spacing w:after="160" w:before="0" w:line="360" w:lineRule="auto"/>
         <w:jc w:val="both"/>
       </w:pPr>
       <w:r>
         <w:rPr>
           <w:rFonts w:ascii="Arial" w:hAnsi="Arial" w:cs="Arial"/>
           <w:b w:val="0"/>
+          <w:color w:val="000000"/>
           <w:sz w:val="26"/>
           <w:rtl w:val="1"/>
         </w:rPr>
-        <w:t>لأنّي لاحظت إشي بسيط بس مزعج: الطلاب بيحكوا الإنجليزي كإنّه مادة بعيدة عنهم، إشي بيصير بالامتحان وبس. حبّيت أقرّب اللغة من حياتهم. لما الموضوع يكون مدينتهم هم، صعب يقولوا "هذا مالوش علاقة فيّي".</w:t>
+        <w:t>اخترتُ هذا الموضوعَ تحديدًا لأنني لاحظتُ أمرًا بسيطًا لكنه مقلق: كثيرٌ من طلابي يتعاملون مع الإنجليزيةِ كأنها مادةٌ منفصلةٌ عن حياتهم، شيءٌ يخصُّ الامتحانَ فحسب. أردتُ أن أقرِّبَ اللغةَ من واقعهم؛ فحين يكونُ الموضوعُ مدينتَهم هم، يصعبُ عليهم أن يقولوا إنَّ هذا لا يعنيهم.</w:t>
       </w:r>
     </w:p>
     <w:p>
       <w:pPr>
         <w:bidi w:val="1"/>
-        <w:spacing w:after="40" w:before="0" w:line="336" w:lineRule="auto"/>
-        <w:jc w:val="both"/>
-      </w:pPr>
-      <w:r>
-        <w:rPr>
-          <w:rFonts w:ascii="Arial" w:hAnsi="Arial" w:cs="Arial"/>
-          <w:b/>
-          <w:sz w:val="26"/>
-          <w:bCs/>
-          <w:rtl w:val="1"/>
-        </w:rPr>
-        <w:t>شو الاعتبارات اللي أثّرت في قراري؟</w:t>
-      </w:r>
-    </w:p>
-    <w:p>
-      <w:pPr>
-        <w:bidi w:val="1"/>
-        <w:spacing w:after="160" w:before="0" w:line="336" w:lineRule="auto"/>
+        <w:spacing w:after="160" w:before="0" w:line="360" w:lineRule="auto"/>
         <w:jc w:val="both"/>
       </w:pPr>
       <w:r>
         <w:rPr>
           <w:rFonts w:ascii="Arial" w:hAnsi="Arial" w:cs="Arial"/>
           <w:b w:val="0"/>
+          <w:color w:val="000000"/>
           <w:sz w:val="26"/>
           <w:rtl w:val="1"/>
         </w:rPr>
-        <w:t>أول إشي الفروق الفردية. عارفة إنّ عندي طلاب ما بيقدروا يكتبوا فقرة لحالهم، فبنيت المشروع على مجموعات وأدوار، بحيث كل واحد يشارك على قدّه وما حدا يحسّ حاله فاشل. ثاني إشي القيمة: بدّي ياهم يعتزّوا بحالهم وببلدهم وهم يتعلموا لغة ثانية، مش يحسّوا إنّ الإنجليزي بيلغي هويّتهم.</w:t>
+        <w:t>أما الاعتباراتُ التي أثَّرت في قراري فكانت في مقدمتها الفروقُ الفردية. أدركُ أنَّ لديَّ طلابًا لا يقدرون على كتابةِ فقرةٍ بمفردهم، فبنيتُ المشروعَ على مجموعاتٍ وأدوارٍ يشاركُ فيها كلٌّ على قدرِه دون أن يشعرَ أحدٌ بالعجز. ثم جاء الاعتبارُ القيمي: أردتُ لهم أن يعتزوا بأنفسهم وببلدهم وهم يتعلمون لغةً ثانية، لا أن يشعروا بأنَّ الإنجليزيةَ تُلغي هويتهم. وثمة اعتبارٌ عمليٌّ ثالث، هو محدوديةُ زمنِ الحصة، فآثرتُ هدفًا لغويًّا واحدًا واضحًا على أهدافٍ كثيرةٍ متعجلة.</w:t>
       </w:r>
     </w:p>
     <w:p>
       <w:pPr>
         <w:bidi w:val="1"/>
-        <w:spacing w:after="40" w:before="0" w:line="336" w:lineRule="auto"/>
-        <w:jc w:val="both"/>
-      </w:pPr>
-      <w:r>
-        <w:rPr>
-          <w:rFonts w:ascii="Arial" w:hAnsi="Arial" w:cs="Arial"/>
-          <w:b/>
-          <w:sz w:val="26"/>
-          <w:bCs/>
-          <w:rtl w:val="1"/>
-        </w:rPr>
-        <w:t>من وين جت الفكرة؟</w:t>
-      </w:r>
-    </w:p>
-    <w:p>
-      <w:pPr>
-        <w:bidi w:val="1"/>
-        <w:spacing w:after="200" w:before="0" w:line="336" w:lineRule="auto"/>
+        <w:spacing w:after="200" w:before="0" w:line="360" w:lineRule="auto"/>
         <w:jc w:val="both"/>
       </w:pPr>
       <w:r>
         <w:rPr>
           <w:rFonts w:ascii="Arial" w:hAnsi="Arial" w:cs="Arial"/>
           <w:b w:val="0"/>
+          <w:color w:val="000000"/>
           <w:sz w:val="26"/>
           <w:rtl w:val="1"/>
         </w:rPr>
-        <w:t>الصراحة الفكرة طلعت من موقف صغير بالصف. مرة كنت بعطي نص عن مدينة أجنبية بالكتاب، وطالب قالّي بعفوية: "ميس، ليش دايمًا مدن بره؟ إحنا مالنا مدينة؟". الجملة هاي فضلت بدماغي، وحسّيت إنّه محقّ. كمان بالمساق حكينا عن التعلّم ذي المعنى (meaningful learning) وإنّ الطالب بيتعلّم أحسن لما يربط المادة بواقعه، فحبّيت أجرّب هالإشي بشكل عملي مش بس نظري.</w:t>
+        <w:t>وأما مصدرُ الفكرة فموقفٌ صغيرٌ لا أنساه. كنتُ أشرحُ نصًّا عن مدينةٍ أجنبيةٍ في الكتاب، فقال لي طالبٌ بعفوية: "مِس، لماذا دائمًا مدنٌ في الخارج؟ ألا مدينةَ لنا؟". ظلَّت جملتُه في ذهني، وشعرتُ أنه محق. ثم التقت هذه الملاحظةُ الميدانيةُ بما درسناه في المساق عن التعلُّمِ ذي المعنى (meaningful learning)، وأنَّ المتعلمَ يتعلمُ أعمقَ حين يربطُ المادةَ بواقعِه المعيش. فأردتُ أن أجرِّبَ هذا المبدأ عمليًّا، لا أن يبقى سطرًا نظريًّا في دفتري.</w:t>
       </w:r>
     </w:p>
     <w:p>
@@ -857,235 +1730,176 @@
         <w:spacing w:before="360" w:after="120"/>
         <w:jc w:val="right"/>
         <w:pBdr>
-          <w:bottom w:val="single" w:sz="6" w:space="4" w:color="1F6F6B"/>
+          <w:bottom w:val="single" w:sz="6" w:space="4" w:color="000000"/>
         </w:pBdr>
       </w:pPr>
       <w:r>
         <w:rPr>
           <w:rFonts w:ascii="Arial" w:hAnsi="Arial" w:cs="Arial"/>
           <w:b/>
-          <w:color w:val="1F6F6B"/>
-          <w:sz w:val="34"/>
+          <w:color w:val="000000"/>
+          <w:sz w:val="32"/>
           <w:bCs/>
           <w:rtl w:val="1"/>
         </w:rPr>
-        <w:t>ثانيًا: تحدٍّ شخصي خلال السنة وانعكاسه في الفعالية</w:t>
+        <w:t>ثانيًا: تحدٍّ شخصيٌّ خلال السنةِ وانعكاسُه في الفعالية</w:t>
       </w:r>
     </w:p>
     <w:p>
       <w:pPr>
         <w:bidi w:val="1"/>
-        <w:spacing w:after="200" w:before="0" w:line="336" w:lineRule="auto"/>
+        <w:spacing w:after="200" w:before="0" w:line="360" w:lineRule="auto"/>
         <w:jc w:val="both"/>
       </w:pPr>
       <w:r>
         <w:rPr>
           <w:rFonts w:ascii="Arial" w:hAnsi="Arial" w:cs="Arial"/>
           <w:b w:val="0"/>
+          <w:color w:val="000000"/>
           <w:sz w:val="26"/>
           <w:rtl w:val="1"/>
         </w:rPr>
-        <w:t>التحدّي الأكبر اللي واجهني كان انخفاض دافعية الطلاب للإنجليزي. مش كل الصف، بس فئة واضحة، خاصة الطلاب اللي عندهم فجوة قديمة باللغة. هدول وصلوا لمرحلة قرّروا فيها إنّهم "مش شاطرين بالإنجليزي وخلص"، وبطّلوا يحاولوا. واحد منهم مرة قالّي: "ميس أنا فاشل بالإنجليزي من الصف الرابع، ليش أتعب حالي؟". هاي الجملة وجعتني، وصارت هي مقياسي طول السنة.</w:t>
+        <w:t>كان التحدي الأكبرُ الذي واجهني هو انخفاضَ دافعيةِ الطلابِ نحو الإنجليزية، لا في الصفِّ كلِّه، بل لدى فئةٍ واضحةٍ من الطلابِ ذوي الفجوةِ اللغويةِ القديمة. بلغ هؤلاءِ مرحلةً قرَّروا فيها أنهم "ليسوا أهلًا للإنجليزية"، فكفُّوا عن المحاولة. قال لي أحدُهم يومًا: "مِس، أنا فاشلٌ في الإنجليزيةِ منذ الصفِّ الرابع، فلماذا أُتعبُ نفسي؟". أوجعتني هذه الجملةُ، وصارت طوال السنةِ مقياسًا أقيسُ عليه نجاحي.</w:t>
       </w:r>
     </w:p>
     <w:p>
       <w:pPr>
         <w:bidi w:val="1"/>
-        <w:spacing w:after="40" w:before="0" w:line="336" w:lineRule="auto"/>
+        <w:spacing w:after="40" w:before="0" w:line="360" w:lineRule="auto"/>
         <w:jc w:val="both"/>
       </w:pPr>
       <w:r>
         <w:rPr>
           <w:rFonts w:ascii="Arial" w:hAnsi="Arial" w:cs="Arial"/>
           <w:b/>
+          <w:color w:val="000000"/>
           <w:sz w:val="26"/>
           <w:bCs/>
           <w:rtl w:val="1"/>
         </w:rPr>
-        <w:t>كيف تعاملت مع التحدّي؟</w:t>
+        <w:t>كيف تعاملتُ مع التحدي</w:t>
       </w:r>
     </w:p>
     <w:p>
       <w:pPr>
-        <w:pStyle w:val="ListBullet"/>
         <w:bidi w:val="1"/>
-        <w:spacing w:after="80" w:line="324" w:lineRule="auto"/>
-        <w:jc w:val="right"/>
+        <w:spacing w:after="200" w:before="0" w:line="360" w:lineRule="auto"/>
+        <w:jc w:val="both"/>
       </w:pPr>
       <w:r>
         <w:rPr>
           <w:rFonts w:ascii="Arial" w:hAnsi="Arial" w:cs="Arial"/>
           <w:b w:val="0"/>
+          <w:color w:val="000000"/>
           <w:sz w:val="26"/>
           <w:rtl w:val="1"/>
         </w:rPr>
-        <w:t xml:space="preserve"> بلّشت أصغّر الأهداف. بدل ما أطلب فقرة كاملة، صرت أطلب جملة وحدة صح. النجاح الصغير بيرجّع الثقة أسرع من أي محاضرة تشجيع.</w:t>
-      </w:r>
-    </w:p>
-    <w:p>
-      <w:pPr>
-        <w:pStyle w:val="ListBullet"/>
-        <w:bidi w:val="1"/>
-        <w:spacing w:after="80" w:line="324" w:lineRule="auto"/>
-        <w:jc w:val="right"/>
-      </w:pPr>
-      <w:r>
-        <w:rPr>
-          <w:rFonts w:ascii="Arial" w:hAnsi="Arial" w:cs="Arial"/>
-          <w:b w:val="0"/>
-          <w:sz w:val="26"/>
-          <w:rtl w:val="1"/>
-        </w:rPr>
-        <w:t xml:space="preserve"> غيّرت طريقة التصحيح. بطّلت أحمّر كل غلط بالورقة. صرت أعلّم إشي صحّ عملوه بالأخضر أول، وبعدين نصحّح غلط واحد بس سوا.</w:t>
-      </w:r>
-    </w:p>
-    <w:p>
-      <w:pPr>
-        <w:pStyle w:val="ListBullet"/>
-        <w:bidi w:val="1"/>
-        <w:spacing w:after="80" w:line="324" w:lineRule="auto"/>
-        <w:jc w:val="right"/>
-      </w:pPr>
-      <w:r>
-        <w:rPr>
-          <w:rFonts w:ascii="Arial" w:hAnsi="Arial" w:cs="Arial"/>
-          <w:b w:val="0"/>
-          <w:sz w:val="26"/>
-          <w:rtl w:val="1"/>
-        </w:rPr>
-        <w:t xml:space="preserve"> بنيت أدوار داخل المجموعات، بحيث الطالب الضعيف يكون إلو مكان ووظيفة، مش بس متفرّج على اللي بيشتغلوا.</w:t>
-      </w:r>
-    </w:p>
-    <w:p>
-      <w:pPr>
-        <w:pStyle w:val="ListBullet"/>
-        <w:bidi w:val="1"/>
-        <w:spacing w:after="80" w:line="324" w:lineRule="auto"/>
-        <w:jc w:val="right"/>
-      </w:pPr>
-      <w:r>
-        <w:rPr>
-          <w:rFonts w:ascii="Arial" w:hAnsi="Arial" w:cs="Arial"/>
-          <w:b w:val="0"/>
-          <w:sz w:val="26"/>
-          <w:rtl w:val="1"/>
-        </w:rPr>
-        <w:t xml:space="preserve"> صرت أحكي معهم بلغتهم شوي برّة الحصة، أسأل عن حالهم. لما الطالب يحسّ إنّك بتشوفيه كإنسان، بيرجع يحاول عشانك أنت قبل المادة.</w:t>
+        <w:t>بدأتُ بتصغيرِ الأهداف. فبدل أن أطلبَ فقرةً كاملة، صرتُ أطلبُ جملةً واحدةً صحيحة، لأنَّ النجاحَ الصغيرَ يعيدُ الثقةَ أسرعَ من أيِّ خطبةِ تشجيع. ثم غيَّرتُ أسلوبَ التصحيح؛ فكففتُ عن تحميرِ كلِّ خطأٍ في الورقة، وصرتُ أُبرزُ أولًا شيئًا أصابوا فيه، ثم نصحِّحُ خطأً واحدًا معًا. وبنيتُ داخلَ المجموعاتِ أدوارًا تجعلُ للطالبِ الضعيفِ موقعًا ووظيفة، لا مجردَ متفرجٍ على من يعملون. وأخيرًا، خصَّصتُ لحظاتٍ خارجَ الدرسِ أحادثُهم فيها كأشخاص، أسألُ عن أحوالهم؛ فالطالبُ حين يشعرُ أنك تراه إنسانًا يعودُ إلى المحاولةِ من أجلك أنت قبل المادة.</w:t>
       </w:r>
     </w:p>
     <w:p>
       <w:pPr>
         <w:bidi w:val="1"/>
-        <w:spacing w:after="40" w:before="120" w:line="336" w:lineRule="auto"/>
+        <w:spacing w:after="40" w:before="0" w:line="360" w:lineRule="auto"/>
         <w:jc w:val="both"/>
       </w:pPr>
       <w:r>
         <w:rPr>
           <w:rFonts w:ascii="Arial" w:hAnsi="Arial" w:cs="Arial"/>
           <w:b/>
+          <w:color w:val="000000"/>
           <w:sz w:val="26"/>
           <w:bCs/>
           <w:rtl w:val="1"/>
         </w:rPr>
-        <w:t>شو تعلّمت من التجربة؟</w:t>
+        <w:t>ما الذي تعلمتُه من التجربة</w:t>
       </w:r>
     </w:p>
     <w:p>
       <w:pPr>
         <w:bidi w:val="1"/>
-        <w:spacing w:after="200" w:before="0" w:line="336" w:lineRule="auto"/>
+        <w:spacing w:after="200" w:before="0" w:line="360" w:lineRule="auto"/>
         <w:jc w:val="both"/>
       </w:pPr>
       <w:r>
         <w:rPr>
           <w:rFonts w:ascii="Arial" w:hAnsi="Arial" w:cs="Arial"/>
           <w:b w:val="0"/>
+          <w:color w:val="000000"/>
           <w:sz w:val="26"/>
           <w:rtl w:val="1"/>
         </w:rPr>
-        <w:t>تعلّمت إنّ الدافعية مش شي بتشتريه بالتهديد ولا بالعلامة. الطالب اللي "ما بيحبّ الإنجليزي" بغالب الأحيان هو طالب اتعوّد يفشل فيها، وخايف يجرّب ويفشل من جديد. شغلتي الأولى صارت إنّي أكسر هالخوف، مش إنّي أحشي معلومات براسه.</w:t>
+        <w:t>تعلمتُ أنَّ الدافعيةَ لا تُشترى بالتهديدِ ولا بالعلامة. فالطالبُ الذي "لا يحبُّ الإنجليزية" هو في الغالبِ طالبٌ تعوَّدَ أن يفشلَ فيها، ويخافُ أن يجرِّبَ فيفشلَ من جديد. فصارت مهمتي الأولى أن أكسرَ هذا الخوف، لا أن أحشوَ المعلوماتِ في رأسه. وأدركتُ أنَّ التعليمَ في جوهرِه علاقةٌ قبل أن يكون محتوى.</w:t>
       </w:r>
     </w:p>
     <w:p>
       <w:pPr>
         <w:bidi w:val="1"/>
-        <w:spacing w:after="40" w:before="0" w:line="336" w:lineRule="auto"/>
+        <w:spacing w:after="40" w:before="0" w:line="360" w:lineRule="auto"/>
         <w:jc w:val="both"/>
       </w:pPr>
       <w:r>
         <w:rPr>
           <w:rFonts w:ascii="Arial" w:hAnsi="Arial" w:cs="Arial"/>
           <w:b/>
+          <w:color w:val="000000"/>
           <w:sz w:val="26"/>
           <w:bCs/>
           <w:rtl w:val="1"/>
         </w:rPr>
-        <w:t>كيف انعكس التحدّي في الفعالية؟</w:t>
+        <w:t>كيف انعكس التحدي في الفعالية</w:t>
       </w:r>
     </w:p>
     <w:p>
       <w:pPr>
         <w:bidi w:val="1"/>
-        <w:spacing w:after="160" w:before="0" w:line="336" w:lineRule="auto"/>
+        <w:spacing w:after="200" w:before="0" w:line="360" w:lineRule="auto"/>
         <w:jc w:val="both"/>
       </w:pPr>
       <w:r>
         <w:rPr>
           <w:rFonts w:ascii="Arial" w:hAnsi="Arial" w:cs="Arial"/>
           <w:b w:val="0"/>
+          <w:color w:val="000000"/>
           <w:sz w:val="26"/>
           <w:rtl w:val="1"/>
         </w:rPr>
-        <w:t>مشروع "مدينتي بكلماتي" هو حرفيًا ردّي على هذا التحدّي. اخترت موضوع الطالب بيعرفه وبيقدر يحكي عنه حتى لو إنجليزيته ضعيفة، لأنّه بيحكي عن بلده. بنيت المشروع مجموعات وأدوار عشان الطالب الضعيف يلاقي إله مكان. وخليت الخاتمة "جرّبوا بس" مش "احكوا صح"، عشان أكسر الخوف من الغلط. القصد إنّ كل طالب يطلع من الحصة وهو حاسّ إنّه نجح بإشي، ولو صغير.</w:t>
+        <w:t>مشروعُ "مدينتي بكلماتي" هو حرفيًّا ردِّي على هذا التحدي. اخترتُ موضوعًا يعرفُه الطالبُ ويقدرُ على الحديثِ عنه مهما ضعُفت إنجليزيتُه، لأنه يتحدثُ عن بلده. وبنيتُ المشروعَ على مجموعاتٍ وأدوار كي يجدَ الطالبُ الضعيفُ لنفسِه موضعًا. وجعلتُ خاتمةَ الحصةِ "جرِّبوا فحسب" لا "تكلموا بصواب"، حتى أكسرَ الخوفَ من الخطأ. غايتي أن يخرجَ كلُّ طالبٍ من الحصةِ شاعرًا بأنه نجح في شيء، وإن كان صغيرًا. وقد وجَّهني في التخطيطِ اعتبارٌ حرِصتُ عليه: خشيتُ أن يستحوذَ الطلابُ الأقوى على العملِ فيُهمَّشَ الأضعف، فوزَّعتُ الأدوارَ بنفسي ولم أتركها للصدفة، وجعلتُ في دورِ "المحرِّر" تحديًا يليقُ بالقوي.</w:t>
       </w:r>
     </w:p>
     <w:p>
       <w:pPr>
         <w:bidi w:val="1"/>
-        <w:spacing w:after="160" w:before="0" w:line="336" w:lineRule="auto"/>
+        <w:spacing w:after="40" w:before="0" w:line="360" w:lineRule="auto"/>
+        <w:jc w:val="both"/>
+      </w:pPr>
+      <w:r>
+        <w:rPr>
+          <w:rFonts w:ascii="Arial" w:hAnsi="Arial" w:cs="Arial"/>
+          <w:b/>
+          <w:color w:val="000000"/>
+          <w:sz w:val="26"/>
+          <w:bCs/>
+          <w:rtl w:val="1"/>
+        </w:rPr>
+        <w:t>ما أرغبُ في تطويرِه مستقبلًا</w:t>
+      </w:r>
+    </w:p>
+    <w:p>
+      <w:pPr>
+        <w:bidi w:val="1"/>
+        <w:spacing w:after="200" w:before="0" w:line="360" w:lineRule="auto"/>
         <w:jc w:val="both"/>
       </w:pPr>
       <w:r>
         <w:rPr>
           <w:rFonts w:ascii="Arial" w:hAnsi="Arial" w:cs="Arial"/>
           <w:b w:val="0"/>
+          <w:color w:val="000000"/>
           <w:sz w:val="26"/>
           <w:rtl w:val="1"/>
         </w:rPr>
-        <w:t>شو الاعتبارات اللي وجّهتني وقت التخطيط؟ خفت إنّ الطلاب الأقوى يستحوذوا على الشغل ويهمّشوا الأضعف، فوزّعت الأدوار من عندي مش تركتها صدفة. وخفت الموضوع يطلع سهل زيادة على القوي، فخليت دور "المحرّر" فيه تحدّي إلهم.</w:t>
-      </w:r>
-    </w:p>
-    <w:p>
-      <w:pPr>
-        <w:bidi w:val="1"/>
-        <w:spacing w:after="40" w:before="0" w:line="336" w:lineRule="auto"/>
-        <w:jc w:val="both"/>
-      </w:pPr>
-      <w:r>
-        <w:rPr>
-          <w:rFonts w:ascii="Arial" w:hAnsi="Arial" w:cs="Arial"/>
-          <w:b/>
-          <w:sz w:val="26"/>
-          <w:bCs/>
-          <w:rtl w:val="1"/>
-        </w:rPr>
-        <w:t>شو بدّي أطوّر مستقبلًا؟</w:t>
-      </w:r>
-    </w:p>
-    <w:p>
-      <w:pPr>
-        <w:bidi w:val="1"/>
-        <w:spacing w:after="200" w:before="0" w:line="336" w:lineRule="auto"/>
-        <w:jc w:val="both"/>
-      </w:pPr>
-      <w:r>
-        <w:rPr>
-          <w:rFonts w:ascii="Arial" w:hAnsi="Arial" w:cs="Arial"/>
-          <w:b w:val="0"/>
-          <w:sz w:val="26"/>
-          <w:rtl w:val="1"/>
-        </w:rPr>
-        <w:t>بدّي أشتغل أكثر على التقييم. لسا التقييم عندي حاسّة إنّه على الحسّ، وبدّي أبني أداة واضحة (روبرِك بسيط) الطالب نفسه يعرف من خلالها وين هو ووين بدّه يوصل. وكمان بدّي أعطي وقت أطول للعرض الشفوي، لأنّ حسّيت إنّ 10 دقايق ما بتكفّي.</w:t>
+        <w:t>أشعرُ أنَّ تقييمي ما زال قائمًا على الحدسِ أكثرَ من اللازم، وأطمحُ إلى بناءِ أداةٍ واضحةٍ (سلَّم تقييمٍ مبسَّط) يعرفُ الطالبُ من خلالها أين هو وإلى أين يريدُ أن يصل. كما أنَّ عشرَ دقائقَ للعرضِ الشفويِّ لم تكفِ، وأنوي في المرةِ القادمةِ أن أمنحَ العرضَ حصةً كاملة، لأنَّ لحظةَ وقوفِ الطالبِ ونطقِه بجملتِه هي اللحظةُ التي تُبنى فيها الثقةُ فعلًا.</w:t>
       </w:r>
     </w:p>
     <w:p>
@@ -1094,339 +1908,469 @@
         <w:spacing w:before="360" w:after="120"/>
         <w:jc w:val="right"/>
         <w:pBdr>
-          <w:bottom w:val="single" w:sz="6" w:space="4" w:color="1F6F6B"/>
+          <w:bottom w:val="single" w:sz="6" w:space="4" w:color="000000"/>
         </w:pBdr>
       </w:pPr>
       <w:r>
         <w:rPr>
           <w:rFonts w:ascii="Arial" w:hAnsi="Arial" w:cs="Arial"/>
           <w:b/>
-          <w:color w:val="1F6F6B"/>
-          <w:sz w:val="34"/>
+          <w:color w:val="000000"/>
+          <w:sz w:val="32"/>
           <w:bCs/>
           <w:rtl w:val="1"/>
         </w:rPr>
-        <w:t>ثالثًا: ما الذي تعلّمته من المرافقة المهنية ومن المساق؟</w:t>
+        <w:t>ثالثًا: ما الذي تعلمتُه من المرافقةِ المهنيةِ ومن المساق</w:t>
       </w:r>
     </w:p>
     <w:p>
       <w:pPr>
         <w:bidi w:val="1"/>
-        <w:spacing w:after="40" w:before="0" w:line="336" w:lineRule="auto"/>
+        <w:spacing w:after="200" w:before="0" w:line="360" w:lineRule="auto"/>
+        <w:jc w:val="both"/>
+      </w:pPr>
+      <w:r>
+        <w:rPr>
+          <w:rFonts w:ascii="Arial" w:hAnsi="Arial" w:cs="Arial"/>
+          <w:b w:val="0"/>
+          <w:color w:val="000000"/>
+          <w:sz w:val="26"/>
+          <w:rtl w:val="1"/>
+        </w:rPr>
+        <w:t>أهمُّ استنتاجٍ خرجتُ به أنَّ التعليمَ ليس عرضًا للمعلومات، بل هو إدارةٌ لعلاقةٍ ولبيئة. كنتُ في السابقِ أُحضِّرُ الحصةَ وأنا مشغولةٌ بسؤالِ "ماذا سأُعطي؟"، وصرتُ أُحضِّرها وأنا أسألُ "ماذا سيفعلُ الطالبُ وبماذا سيخرج؟". هذا التحوُّلُ من مركزيةِ المعلمِ إلى مركزيةِ المتعلمِ هو خلاصةُ السنةِ عندي.</w:t>
+      </w:r>
+    </w:p>
+    <w:p>
+      <w:pPr>
+        <w:bidi w:val="1"/>
+        <w:spacing w:after="40" w:before="0" w:line="360" w:lineRule="auto"/>
         <w:jc w:val="both"/>
       </w:pPr>
       <w:r>
         <w:rPr>
           <w:rFonts w:ascii="Arial" w:hAnsi="Arial" w:cs="Arial"/>
           <w:b/>
+          <w:color w:val="000000"/>
           <w:sz w:val="26"/>
           <w:bCs/>
           <w:rtl w:val="1"/>
         </w:rPr>
-        <w:t>أهمّ الأفكار اللي طلعت فيها</w:t>
+        <w:t>في فهمِ دورِ المعلمِ وعمليةِ التدريس</w:t>
       </w:r>
     </w:p>
     <w:p>
       <w:pPr>
         <w:bidi w:val="1"/>
-        <w:spacing w:after="200" w:before="0" w:line="336" w:lineRule="auto"/>
+        <w:spacing w:after="200" w:before="0" w:line="360" w:lineRule="auto"/>
         <w:jc w:val="both"/>
       </w:pPr>
       <w:r>
         <w:rPr>
           <w:rFonts w:ascii="Arial" w:hAnsi="Arial" w:cs="Arial"/>
           <w:b w:val="0"/>
+          <w:color w:val="000000"/>
           <w:sz w:val="26"/>
           <w:rtl w:val="1"/>
         </w:rPr>
-        <w:t>أكبر إشي فهمته إنّ التعليم مش عرض معلومات، هو إدارة علاقة وبيئة. زمان كنت أحضّر الحصة وأنا مركّزة على "شو بدّي أعطي"، هلق بحضّرها وأنا بفكّر "شو بدّي الطالب يعمل ويطلع فيه". هذا التحويل من المعلّم للطالب هو خلاصة السنة كلها عندي.</w:t>
+        <w:t>أرَتني المرافقةُ أنَّ المعلمَ ليس ملزَمًا بأن يكونَ مصدرَ كلِّ شيءٍ في الصف. كانت المعلمةُ المرافقةُ أهدأَ مني بكثير، تمنحُ الطالبَ وقتًا ليفكرَ ولا تتعجلُ ملءَ الفراغ. تعلمتُ أنَّ الصمتَ في الصفِّ ليس فشلًا دائمًا، بل هو أحيانًا تفكيرٌ يجري بهدوء.</w:t>
       </w:r>
     </w:p>
     <w:p>
       <w:pPr>
         <w:bidi w:val="1"/>
-        <w:spacing w:after="40" w:before="0" w:line="336" w:lineRule="auto"/>
+        <w:spacing w:after="80" w:before="0" w:line="360" w:lineRule="auto"/>
         <w:jc w:val="both"/>
       </w:pPr>
       <w:r>
         <w:rPr>
           <w:rFonts w:ascii="Arial" w:hAnsi="Arial" w:cs="Arial"/>
           <w:b/>
+          <w:color w:val="000000"/>
           <w:sz w:val="26"/>
           <w:bCs/>
           <w:rtl w:val="1"/>
         </w:rPr>
-        <w:t>كيف ساعدوني أفهم دور المعلّم وعملية التدريس؟</w:t>
+        <w:t>كيف أثَّرا في طريقةِ تدريسي</w:t>
       </w:r>
     </w:p>
+    <w:tbl>
+      <w:tblPr>
+        <w:tblStyle w:val="TableGrid"/>
+        <w:tblW w:type="auto" w:w="0"/>
+        <w:jc w:val="center"/>
+        <w:tblLook w:firstColumn="1" w:firstRow="1" w:lastColumn="0" w:lastRow="0" w:noHBand="0" w:noVBand="1" w:val="04A0"/>
+        <w:bidiVisual/>
+      </w:tblPr>
+      <w:tblGrid>
+        <w:gridCol w:w="4873"/>
+        <w:gridCol w:w="4873"/>
+      </w:tblGrid>
+      <w:tr>
+        <w:tc>
+          <w:tcPr>
+            <w:tcW w:type="dxa" w:w="2551"/>
+          </w:tcPr>
+          <w:p>
+            <w:pPr>
+              <w:bidi w:val="1"/>
+              <w:spacing w:after="40" w:line="312" w:lineRule="auto"/>
+              <w:jc w:val="right"/>
+            </w:pPr>
+            <w:r/>
+            <w:r>
+              <w:rPr>
+                <w:rFonts w:ascii="Arial" w:hAnsi="Arial" w:cs="Arial"/>
+                <w:b/>
+                <w:color w:val="000000"/>
+                <w:sz w:val="23"/>
+                <w:bCs/>
+                <w:rtl w:val="1"/>
+              </w:rPr>
+              <w:t>المجال</w:t>
+            </w:r>
+          </w:p>
+        </w:tc>
+        <w:tc>
+          <w:tcPr>
+            <w:tcW w:type="dxa" w:w="7087"/>
+          </w:tcPr>
+          <w:p>
+            <w:pPr>
+              <w:bidi w:val="1"/>
+              <w:spacing w:after="40" w:line="312" w:lineRule="auto"/>
+              <w:jc w:val="right"/>
+            </w:pPr>
+            <w:r/>
+            <w:r>
+              <w:rPr>
+                <w:rFonts w:ascii="Arial" w:hAnsi="Arial" w:cs="Arial"/>
+                <w:b/>
+                <w:color w:val="000000"/>
+                <w:sz w:val="23"/>
+                <w:bCs/>
+                <w:rtl w:val="1"/>
+              </w:rPr>
+              <w:t>التغيُّرُ الذي طرأ</w:t>
+            </w:r>
+          </w:p>
+        </w:tc>
+      </w:tr>
+      <w:tr>
+        <w:tc>
+          <w:tcPr>
+            <w:tcW w:type="dxa" w:w="2551"/>
+          </w:tcPr>
+          <w:p>
+            <w:pPr>
+              <w:bidi w:val="1"/>
+              <w:spacing w:after="40" w:line="312" w:lineRule="auto"/>
+              <w:jc w:val="right"/>
+            </w:pPr>
+            <w:r/>
+            <w:r>
+              <w:rPr>
+                <w:rFonts w:ascii="Arial" w:hAnsi="Arial" w:cs="Arial"/>
+                <w:b/>
+                <w:color w:val="000000"/>
+                <w:sz w:val="23"/>
+                <w:bCs/>
+                <w:rtl w:val="1"/>
+              </w:rPr>
+              <w:t>تخطيطُ الدروس</w:t>
+            </w:r>
+          </w:p>
+        </w:tc>
+        <w:tc>
+          <w:tcPr>
+            <w:tcW w:type="dxa" w:w="7087"/>
+          </w:tcPr>
+          <w:p>
+            <w:pPr>
+              <w:bidi w:val="1"/>
+              <w:spacing w:after="40" w:line="312" w:lineRule="auto"/>
+              <w:jc w:val="right"/>
+            </w:pPr>
+            <w:r/>
+            <w:r>
+              <w:rPr>
+                <w:rFonts w:ascii="Arial" w:hAnsi="Arial" w:cs="Arial"/>
+                <w:b w:val="0"/>
+                <w:color w:val="000000"/>
+                <w:sz w:val="23"/>
+                <w:rtl w:val="1"/>
+              </w:rPr>
+              <w:t>صرتُ أبدأُ من الهدفِ ومن الطالب لا من المحتوى، وأسألُ نفسي: ما الذي أريدُه قادرًا على فعلِه في نهايةِ الحصة؟</w:t>
+            </w:r>
+          </w:p>
+        </w:tc>
+      </w:tr>
+      <w:tr>
+        <w:tc>
+          <w:tcPr>
+            <w:tcW w:type="dxa" w:w="2551"/>
+          </w:tcPr>
+          <w:p>
+            <w:pPr>
+              <w:bidi w:val="1"/>
+              <w:spacing w:after="40" w:line="312" w:lineRule="auto"/>
+              <w:jc w:val="right"/>
+            </w:pPr>
+            <w:r/>
+            <w:r>
+              <w:rPr>
+                <w:rFonts w:ascii="Arial" w:hAnsi="Arial" w:cs="Arial"/>
+                <w:b/>
+                <w:color w:val="000000"/>
+                <w:sz w:val="23"/>
+                <w:bCs/>
+                <w:rtl w:val="1"/>
+              </w:rPr>
+              <w:t>تنفيذُ الدروس</w:t>
+            </w:r>
+          </w:p>
+        </w:tc>
+        <w:tc>
+          <w:tcPr>
+            <w:tcW w:type="dxa" w:w="7087"/>
+          </w:tcPr>
+          <w:p>
+            <w:pPr>
+              <w:bidi w:val="1"/>
+              <w:spacing w:after="40" w:line="312" w:lineRule="auto"/>
+              <w:jc w:val="right"/>
+            </w:pPr>
+            <w:r/>
+            <w:r>
+              <w:rPr>
+                <w:rFonts w:ascii="Arial" w:hAnsi="Arial" w:cs="Arial"/>
+                <w:b w:val="0"/>
+                <w:color w:val="000000"/>
+                <w:sz w:val="23"/>
+                <w:rtl w:val="1"/>
+              </w:rPr>
+              <w:t>قلَّلتُ حديثي وكثَّرتُ عملَ الطلاب، حتى صارت الحصةُ التي أتكلمُ فيها طوالَ الوقتِ تُزعجني.</w:t>
+            </w:r>
+          </w:p>
+        </w:tc>
+      </w:tr>
+      <w:tr>
+        <w:tc>
+          <w:tcPr>
+            <w:tcW w:type="dxa" w:w="2551"/>
+          </w:tcPr>
+          <w:p>
+            <w:pPr>
+              <w:bidi w:val="1"/>
+              <w:spacing w:after="40" w:line="312" w:lineRule="auto"/>
+              <w:jc w:val="right"/>
+            </w:pPr>
+            <w:r/>
+            <w:r>
+              <w:rPr>
+                <w:rFonts w:ascii="Arial" w:hAnsi="Arial" w:cs="Arial"/>
+                <w:b/>
+                <w:color w:val="000000"/>
+                <w:sz w:val="23"/>
+                <w:bCs/>
+                <w:rtl w:val="1"/>
+              </w:rPr>
+              <w:t>التعاملُ مع الطلاب</w:t>
+            </w:r>
+          </w:p>
+        </w:tc>
+        <w:tc>
+          <w:tcPr>
+            <w:tcW w:type="dxa" w:w="7087"/>
+          </w:tcPr>
+          <w:p>
+            <w:pPr>
+              <w:bidi w:val="1"/>
+              <w:spacing w:after="40" w:line="312" w:lineRule="auto"/>
+              <w:jc w:val="right"/>
+            </w:pPr>
+            <w:r/>
+            <w:r>
+              <w:rPr>
+                <w:rFonts w:ascii="Arial" w:hAnsi="Arial" w:cs="Arial"/>
+                <w:b w:val="0"/>
+                <w:color w:val="000000"/>
+                <w:sz w:val="23"/>
+                <w:rtl w:val="1"/>
+              </w:rPr>
+              <w:t>صرتُ أقرأُ السلوكَ المشوِّشَ كرسالةٍ لا كتحدٍّ شخصي؛ فالطالبُ المشوِّشُ غالبًا مللٌّ أو غيرُ فاهم.</w:t>
+            </w:r>
+          </w:p>
+        </w:tc>
+      </w:tr>
+      <w:tr>
+        <w:tc>
+          <w:tcPr>
+            <w:tcW w:type="dxa" w:w="2551"/>
+          </w:tcPr>
+          <w:p>
+            <w:pPr>
+              <w:bidi w:val="1"/>
+              <w:spacing w:after="40" w:line="312" w:lineRule="auto"/>
+              <w:jc w:val="right"/>
+            </w:pPr>
+            <w:r/>
+            <w:r>
+              <w:rPr>
+                <w:rFonts w:ascii="Arial" w:hAnsi="Arial" w:cs="Arial"/>
+                <w:b/>
+                <w:color w:val="000000"/>
+                <w:sz w:val="23"/>
+                <w:bCs/>
+                <w:rtl w:val="1"/>
+              </w:rPr>
+              <w:t>تقييمُ تعلُّمهم</w:t>
+            </w:r>
+          </w:p>
+        </w:tc>
+        <w:tc>
+          <w:tcPr>
+            <w:tcW w:type="dxa" w:w="7087"/>
+          </w:tcPr>
+          <w:p>
+            <w:pPr>
+              <w:bidi w:val="1"/>
+              <w:spacing w:after="40" w:line="312" w:lineRule="auto"/>
+              <w:jc w:val="right"/>
+            </w:pPr>
+            <w:r/>
+            <w:r>
+              <w:rPr>
+                <w:rFonts w:ascii="Arial" w:hAnsi="Arial" w:cs="Arial"/>
+                <w:b w:val="0"/>
+                <w:color w:val="000000"/>
+                <w:sz w:val="23"/>
+                <w:rtl w:val="1"/>
+              </w:rPr>
+              <w:t>أدركتُ أنَّ التقييمَ ليس امتحانًا في نهايةِ الوحدةِ فحسب؛ فسؤالٌ ختاميٌّ أو ورقةُ خروجٍ تمنحُني صورةً أوضحَ من علامةٍ رقمية.</w:t>
+            </w:r>
+          </w:p>
+        </w:tc>
+      </w:tr>
+    </w:tbl>
     <w:p>
       <w:pPr>
         <w:bidi w:val="1"/>
-        <w:spacing w:after="200" w:before="0" w:line="336" w:lineRule="auto"/>
+        <w:spacing w:after="120" w:before="0" w:line="360" w:lineRule="auto"/>
         <w:jc w:val="both"/>
       </w:pPr>
       <w:r>
         <w:rPr>
           <w:rFonts w:ascii="Arial" w:hAnsi="Arial" w:cs="Arial"/>
           <w:b w:val="0"/>
+          <w:color w:val="000000"/>
           <w:sz w:val="26"/>
           <w:rtl w:val="1"/>
         </w:rPr>
-        <w:t>المرافقة خلّتني أشوف إنّ المعلّم مش لازم يكون هو مصدر كل شي بالصف. المعلّمة المرافقة كانت كثير أهدى منّي، بتعطي الطالب وقت يفكّر وما بتستعجل تعبّي الفراغ. تعلّمت إنّ الصمت بالصف مش دايمًا فشل، أحيانًا هو تفكير.</w:t>
       </w:r>
     </w:p>
     <w:p>
       <w:pPr>
         <w:bidi w:val="1"/>
-        <w:spacing w:after="80" w:before="0" w:line="336" w:lineRule="auto"/>
+        <w:spacing w:after="40" w:before="0" w:line="360" w:lineRule="auto"/>
         <w:jc w:val="both"/>
       </w:pPr>
       <w:r>
         <w:rPr>
           <w:rFonts w:ascii="Arial" w:hAnsi="Arial" w:cs="Arial"/>
           <w:b/>
+          <w:color w:val="000000"/>
           <w:sz w:val="26"/>
           <w:bCs/>
           <w:rtl w:val="1"/>
         </w:rPr>
-        <w:t>كيف أثّروا في طريقة تدريسي؟</w:t>
+        <w:t>النصيحةُ الأكثرُ تأثيرًا من المعلمةِ المرافقة</w:t>
       </w:r>
     </w:p>
     <w:p>
       <w:pPr>
-        <w:pStyle w:val="ListBullet"/>
         <w:bidi w:val="1"/>
-        <w:spacing w:after="80" w:line="324" w:lineRule="auto"/>
-        <w:jc w:val="right"/>
+        <w:spacing w:after="200" w:before="0" w:line="360" w:lineRule="auto"/>
+        <w:jc w:val="both"/>
       </w:pPr>
       <w:r>
         <w:rPr>
           <w:rFonts w:ascii="Arial" w:hAnsi="Arial" w:cs="Arial"/>
           <w:b w:val="0"/>
+          <w:color w:val="000000"/>
           <w:sz w:val="26"/>
           <w:rtl w:val="1"/>
         </w:rPr>
-        <w:t xml:space="preserve"> بتخطيط الدروس: صرت أبدأ من الهدف والطالب، مش من المحتوى. أسأل حالي: شو بدّي إياه يقدر يعمله بآخر الحصة؟</w:t>
-      </w:r>
-    </w:p>
-    <w:p>
-      <w:pPr>
-        <w:pStyle w:val="ListBullet"/>
-        <w:bidi w:val="1"/>
-        <w:spacing w:after="80" w:line="324" w:lineRule="auto"/>
-        <w:jc w:val="right"/>
-      </w:pPr>
-      <w:r>
-        <w:rPr>
-          <w:rFonts w:ascii="Arial" w:hAnsi="Arial" w:cs="Arial"/>
-          <w:b w:val="0"/>
-          <w:sz w:val="26"/>
-          <w:rtl w:val="1"/>
-        </w:rPr>
-        <w:t xml:space="preserve"> بتنفيذ الدروس: قلّلت حكيي أنا وكثّرت شغل الطلاب. الحصة اللي بحكي فيها طول الوقت صارت تزعجني.</w:t>
-      </w:r>
-    </w:p>
-    <w:p>
-      <w:pPr>
-        <w:pStyle w:val="ListBullet"/>
-        <w:bidi w:val="1"/>
-        <w:spacing w:after="80" w:line="324" w:lineRule="auto"/>
-        <w:jc w:val="right"/>
-      </w:pPr>
-      <w:r>
-        <w:rPr>
-          <w:rFonts w:ascii="Arial" w:hAnsi="Arial" w:cs="Arial"/>
-          <w:b w:val="0"/>
-          <w:sz w:val="26"/>
-          <w:rtl w:val="1"/>
-        </w:rPr>
-        <w:t xml:space="preserve"> بالتعامل مع الطلاب: صرت أشوف السلوك المزعج كرسالة، مش كتحدّي إلي شخصيًا. الطالب اللي بيشوّش غالبًا ملّان أو مش فاهم.</w:t>
-      </w:r>
-    </w:p>
-    <w:p>
-      <w:pPr>
-        <w:pStyle w:val="ListBullet"/>
-        <w:bidi w:val="1"/>
-        <w:spacing w:after="80" w:line="324" w:lineRule="auto"/>
-        <w:jc w:val="right"/>
-      </w:pPr>
-      <w:r>
-        <w:rPr>
-          <w:rFonts w:ascii="Arial" w:hAnsi="Arial" w:cs="Arial"/>
-          <w:b w:val="0"/>
-          <w:sz w:val="26"/>
-          <w:rtl w:val="1"/>
-        </w:rPr>
-        <w:t xml:space="preserve"> بتقييم تعلّمهم: تعلّمت إنّ التقييم مش بس امتحان بآخر الوحدة. سؤال بآخر الحصة أو ورقة خروج بتعطيني صورة أوضح من علامة رقمية.</w:t>
+        <w:t>خرجتُ يومًا من حصةٍ محبَطةً لأنَّ خطتي لم تسِر كما أردت، فقالت لي المعلمةُ المرافقةُ جملةً لم أنسَها: "لستِ مطالبةً بإنقاذِ الحصة، بل بقراءةِ الصف". قصدت أنني بدل أن أتشبثَ بالورقةِ التي حضَّرتها وأُكملَها قسرًا، عليَّ أن أنظرَ إلى الطلابِ أمامي وأُعدِّل. كانت مهمةً لأنني كنتُ أضعُ الخطةَ فوق الطلاب. ومنذئذٍ صرتُ أدخلُ الصفَّ والخطةُ معي، لكنها ليست مقدَّسة. وقد طبَّقتُها فعلًا في مشروعِ المدينة: حين رأيتُ المجموعةَ الأولى تتعثرُ في الكتابة، أوقفتُ المهمة، ورجعنا معًا إلى بنكِ المفردات، ثم أكملنا. ولو تشبثتُ بالورقةِ لضاعوا جميعًا.</w:t>
       </w:r>
     </w:p>
     <w:p>
       <w:pPr>
         <w:bidi w:val="1"/>
-        <w:spacing w:after="40" w:before="120" w:line="336" w:lineRule="auto"/>
+        <w:spacing w:after="40" w:before="0" w:line="360" w:lineRule="auto"/>
         <w:jc w:val="both"/>
       </w:pPr>
       <w:r>
         <w:rPr>
           <w:rFonts w:ascii="Arial" w:hAnsi="Arial" w:cs="Arial"/>
           <w:b/>
+          <w:color w:val="000000"/>
           <w:sz w:val="26"/>
           <w:bCs/>
           <w:rtl w:val="1"/>
         </w:rPr>
-        <w:t>النصيحة الأكثر تأثيرًا من المعلّمة المرافقة</w:t>
+        <w:t>كيف تغيَّرت نظرتي إلى تخطيطِ الدرس</w:t>
       </w:r>
     </w:p>
     <w:p>
       <w:pPr>
         <w:bidi w:val="1"/>
-        <w:spacing w:after="200" w:before="0" w:line="336" w:lineRule="auto"/>
+        <w:spacing w:after="200" w:before="0" w:line="360" w:lineRule="auto"/>
         <w:jc w:val="both"/>
       </w:pPr>
       <w:r>
         <w:rPr>
           <w:rFonts w:ascii="Arial" w:hAnsi="Arial" w:cs="Arial"/>
           <w:b w:val="0"/>
+          <w:color w:val="000000"/>
           <w:sz w:val="26"/>
           <w:rtl w:val="1"/>
         </w:rPr>
-        <w:t>مرة طلعت من حصة محبطة لأنّ خطتي ما مشيت زي ما بدّي، والمعلّمة المرافقة قالتلي جملة ما نسيتها: "إنتِ مش لازم تنقذي الحصة، لازم تقرأي الصف". قصدها إنّي بدل ما أتمسّك بالورقة اللي حضّرتها وأكمّلها غصب، لازم أشوف الطلاب قدّامي وأعدّل. ليش كانت مهمّة؟ لأنّي كنت حاطّة الخطة فوق الطلاب. من وقتها صرت أدخل الصف والخطة معي بس مش مقدّسة. طبّقتها عمليًا بمشروع المدينة: أول مجموعة لما شفتها تعبت بالكتابة، وقفت المهمة، رجعنا لبنك الكلمات سوا، وبعدين كمّلنا. لو تمسّكت بالورقة كان ضاعوا.</w:t>
+        <w:t>صارت أهدافي أقلَّ عددًا وأوضحَ صياغة، إذ إنَّ هدفًا واحدًا أو اثنين يتحققان خيرٌ من خمسةٍ تبقى حبرًا على ورق. وصرتُ في تنظيمِ مراحلِ الدرسِ أتركُ هامشًا للمرونةِ ولا أملأُ كلَّ دقيقة، لأنَّ الحصةَ المضغوطةَ لا تدعُ للطالبِ مجالًا ليفكر. وفي ملاءمةِ الأنشطةِ صرتُ أفكرُ في أضعفِ طالبٍ أولًا لا في المتوسط، فما يصلحُ له يصلحُ للبقية. وفي التنويعِ صرتُ أمزجُ السمعيَّ والبصريَّ والحركيَّ في الحصةِ الواحدة، لأنَّ الطلابَ لا يتعلمون جميعًا بالطريقةِ نفسها.</w:t>
       </w:r>
     </w:p>
     <w:p>
       <w:pPr>
         <w:bidi w:val="1"/>
-        <w:spacing w:after="80" w:before="0" w:line="336" w:lineRule="auto"/>
+        <w:spacing w:after="40" w:before="0" w:line="360" w:lineRule="auto"/>
         <w:jc w:val="both"/>
       </w:pPr>
       <w:r>
         <w:rPr>
           <w:rFonts w:ascii="Arial" w:hAnsi="Arial" w:cs="Arial"/>
           <w:b/>
+          <w:color w:val="000000"/>
           <w:sz w:val="26"/>
           <w:bCs/>
           <w:rtl w:val="1"/>
         </w:rPr>
-        <w:t>كيف تغيّرت نظرتي لتخطيط الدرس؟</w:t>
+        <w:t>كيف تطوَّرت قدراتي (تغييران حقيقيان)</w:t>
       </w:r>
     </w:p>
     <w:p>
       <w:pPr>
-        <w:pStyle w:val="ListBullet"/>
         <w:bidi w:val="1"/>
-        <w:spacing w:after="80" w:line="324" w:lineRule="auto"/>
-        <w:jc w:val="right"/>
+        <w:spacing w:after="200" w:before="0" w:line="360" w:lineRule="auto"/>
+        <w:jc w:val="both"/>
       </w:pPr>
       <w:r>
         <w:rPr>
           <w:rFonts w:ascii="Arial" w:hAnsi="Arial" w:cs="Arial"/>
           <w:b w:val="0"/>
+          <w:color w:val="000000"/>
           <w:sz w:val="26"/>
           <w:rtl w:val="1"/>
         </w:rPr>
-        <w:t xml:space="preserve"> باختيار الأهداف: صارت أهدافي أقل وأوضح. هدف واحد أو اثنين بيتحققوا أحسن من خمسة على الورق.</w:t>
-      </w:r>
-    </w:p>
-    <w:p>
-      <w:pPr>
-        <w:pStyle w:val="ListBullet"/>
-        <w:bidi w:val="1"/>
-        <w:spacing w:after="80" w:line="324" w:lineRule="auto"/>
-        <w:jc w:val="right"/>
-      </w:pPr>
-      <w:r>
-        <w:rPr>
-          <w:rFonts w:ascii="Arial" w:hAnsi="Arial" w:cs="Arial"/>
-          <w:b w:val="0"/>
-          <w:sz w:val="26"/>
-          <w:rtl w:val="1"/>
-        </w:rPr>
-        <w:t xml:space="preserve"> بتنظيم مراحل الدرس: صرت أترك وقت للمرونة، مش أعبّي كل دقيقة. الحصة المضغوطة ما بتترك مجال للطالب يفكّر.</w:t>
-      </w:r>
-    </w:p>
-    <w:p>
-      <w:pPr>
-        <w:pStyle w:val="ListBullet"/>
-        <w:bidi w:val="1"/>
-        <w:spacing w:after="80" w:line="324" w:lineRule="auto"/>
-        <w:jc w:val="right"/>
-      </w:pPr>
-      <w:r>
-        <w:rPr>
-          <w:rFonts w:ascii="Arial" w:hAnsi="Arial" w:cs="Arial"/>
-          <w:b w:val="0"/>
-          <w:sz w:val="26"/>
-          <w:rtl w:val="1"/>
-        </w:rPr>
-        <w:t xml:space="preserve"> بملاءمة الأنشطة: صرت أفكّر بأضعف طالب أول، مش بالمتوسط. لو النشاط بيمشي معه، بيمشي مع الكل.</w:t>
-      </w:r>
-    </w:p>
-    <w:p>
-      <w:pPr>
-        <w:pStyle w:val="ListBullet"/>
-        <w:bidi w:val="1"/>
-        <w:spacing w:after="80" w:line="324" w:lineRule="auto"/>
-        <w:jc w:val="right"/>
-      </w:pPr>
-      <w:r>
-        <w:rPr>
-          <w:rFonts w:ascii="Arial" w:hAnsi="Arial" w:cs="Arial"/>
-          <w:b w:val="0"/>
-          <w:sz w:val="26"/>
-          <w:rtl w:val="1"/>
-        </w:rPr>
-        <w:t xml:space="preserve"> بتنويع طرق التدريس: صرت أخلط سمعي وبصري وحركي بنفس الحصة، لأنّ مش كل الطلاب بيتعلموا بنفس الطريق.</w:t>
-      </w:r>
-    </w:p>
-    <w:p>
-      <w:pPr>
-        <w:bidi w:val="1"/>
-        <w:spacing w:after="80" w:before="0" w:line="336" w:lineRule="auto"/>
-        <w:jc w:val="both"/>
-      </w:pPr>
-      <w:r>
-        <w:rPr>
-          <w:rFonts w:ascii="Arial" w:hAnsi="Arial" w:cs="Arial"/>
-          <w:b/>
-          <w:sz w:val="26"/>
-          <w:bCs/>
-          <w:rtl w:val="1"/>
-        </w:rPr>
-        <w:t>كيف تطوّرت قدرتي؟ (تغييران حقيقيّان)</w:t>
-      </w:r>
-    </w:p>
-    <w:p>
-      <w:pPr>
-        <w:pStyle w:val="ListBullet"/>
-        <w:bidi w:val="1"/>
-        <w:spacing w:after="80" w:line="324" w:lineRule="auto"/>
-        <w:jc w:val="right"/>
-      </w:pPr>
-      <w:r>
-        <w:rPr>
-          <w:rFonts w:ascii="Arial" w:hAnsi="Arial" w:cs="Arial"/>
-          <w:b w:val="0"/>
-          <w:sz w:val="26"/>
-          <w:rtl w:val="1"/>
-        </w:rPr>
-        <w:t xml:space="preserve"> بإدارة الصف والوقت: بأول السنة كنت أنهي الحصة وأنا لاهثة، ما خلّصت نص الخطة. تعلّمت أخطّط لوقت أقل من الحصة الفعلية، وأترك هامش. النتيجة إنّي بطّلت أركض.</w:t>
-      </w:r>
-    </w:p>
-    <w:p>
-      <w:pPr>
-        <w:pStyle w:val="ListBullet"/>
-        <w:bidi w:val="1"/>
-        <w:spacing w:after="80" w:line="324" w:lineRule="auto"/>
-        <w:jc w:val="right"/>
-      </w:pPr>
-      <w:r>
-        <w:rPr>
-          <w:rFonts w:ascii="Arial" w:hAnsi="Arial" w:cs="Arial"/>
-          <w:b w:val="0"/>
-          <w:sz w:val="26"/>
-          <w:rtl w:val="1"/>
-        </w:rPr>
-        <w:t xml:space="preserve"> ببناء العلاقة مع الطلاب: تعلّمت أنادي الطلاب بأساميهم من أول أسبوع، وأسأل عن اللي غاب. تغيير بسيط بس غيّر جوّ الصف كله. الطالب اللي بتشوفيه بيرجعلك.</w:t>
+        <w:t>الأول في إدارةِ الصفِّ والوقت: كنتُ في مطلعِ السنةِ أُنهي الحصةَ لاهثةً دون أن أُتمَّ نصفَ الخطة، فتعلمتُ أن أخطِّطَ لزمنٍ أقلَّ من الحصةِ الفعلية وأتركَ فائضًا، فكفَّ عني الركض. والثاني في بناءِ العلاقةِ مع الطلاب: تعلمتُ أن أُناديَهم بأسمائهم منذ الأسبوعِ الأول وأن أسألَ عن الغائب، وهو تغييرٌ بسيطٌ غيَّر جوَّ الصفِّ كلِّه؛ فالطالبُ الذي تشعرُه بأنك تراه يعودُ إليك.</w:t>
       </w:r>
     </w:p>
     <w:p>
@@ -1435,253 +2379,176 @@
         <w:spacing w:before="360" w:after="120"/>
         <w:jc w:val="right"/>
         <w:pBdr>
-          <w:bottom w:val="single" w:sz="6" w:space="4" w:color="1F6F6B"/>
+          <w:bottom w:val="single" w:sz="6" w:space="4" w:color="000000"/>
         </w:pBdr>
       </w:pPr>
       <w:r>
         <w:rPr>
           <w:rFonts w:ascii="Arial" w:hAnsi="Arial" w:cs="Arial"/>
           <w:b/>
-          <w:color w:val="1F6F6B"/>
-          <w:sz w:val="34"/>
+          <w:color w:val="000000"/>
+          <w:sz w:val="32"/>
           <w:bCs/>
           <w:rtl w:val="1"/>
         </w:rPr>
-        <w:t>رابعًا: هويتي المهنية كمعلمة – القيم والمعتقدات والرؤية</w:t>
+        <w:t>رابعًا: هويتي المهنيةُ كمعلمة – القيمُ والمعتقداتُ والرؤية</w:t>
       </w:r>
     </w:p>
     <w:p>
       <w:pPr>
         <w:bidi w:val="1"/>
-        <w:spacing w:after="40" w:before="0" w:line="336" w:lineRule="auto"/>
+        <w:spacing w:after="200" w:before="0" w:line="360" w:lineRule="auto"/>
+        <w:jc w:val="both"/>
+      </w:pPr>
+      <w:r>
+        <w:rPr>
+          <w:rFonts w:ascii="Arial" w:hAnsi="Arial" w:cs="Arial"/>
+          <w:b w:val="0"/>
+          <w:color w:val="000000"/>
+          <w:sz w:val="26"/>
+          <w:rtl w:val="1"/>
+        </w:rPr>
+        <w:t>يتصدرُ قيمي احترامُ المتعلمِ المتبادل. أدخلُ الصفَّ على أساسِ أنَّ الطالبَ إنسانٌ قبل أن يكونَ متعلمًا، وأنَّ احترامي له غيرُ مشروطٍ بعلامته. ويليه حبُّ الاستطلاع؛ إذ أحبُّ للطالبِ أن يسألَ "لماذا" وأن يتجاوزَ حدودَ الكتاب. وأومنُ كذلك بالمسؤوليةِ الشخصية، أي أن يتعلمَ الطالبُ أنَّ تعلُّمَه مسؤوليتُه هو أيضًا، لا عبءٌ محمولٌ على عاتقي وحدي. هذه القيمُ ليست شعاراتٍ أعلِّقها، بل معاييرُ أقيسُ عليها قراراتي اليومية في الصف.</w:t>
+      </w:r>
+    </w:p>
+    <w:p>
+      <w:pPr>
+        <w:bidi w:val="1"/>
+        <w:spacing w:after="40" w:before="0" w:line="360" w:lineRule="auto"/>
         <w:jc w:val="both"/>
       </w:pPr>
       <w:r>
         <w:rPr>
           <w:rFonts w:ascii="Arial" w:hAnsi="Arial" w:cs="Arial"/>
           <w:b/>
+          <w:color w:val="000000"/>
           <w:sz w:val="26"/>
           <w:bCs/>
           <w:rtl w:val="1"/>
         </w:rPr>
-        <w:t>القيم اللي بتوجّهني</w:t>
+        <w:t>ما أرغبُ في تنميتِه لدى طلابي</w:t>
       </w:r>
     </w:p>
     <w:p>
       <w:pPr>
         <w:bidi w:val="1"/>
-        <w:spacing w:after="200" w:before="0" w:line="336" w:lineRule="auto"/>
+        <w:spacing w:after="200" w:before="0" w:line="360" w:lineRule="auto"/>
         <w:jc w:val="both"/>
       </w:pPr>
       <w:r>
         <w:rPr>
           <w:rFonts w:ascii="Arial" w:hAnsi="Arial" w:cs="Arial"/>
           <w:b w:val="0"/>
+          <w:color w:val="000000"/>
           <w:sz w:val="26"/>
           <w:rtl w:val="1"/>
         </w:rPr>
-        <w:t>أكثر إشي بأشتغل عليه هو الاحترام المتبادل. بأدخل الصف على أساس إنّ الطالب إنسان قبل ما يكون متعلّم، وإنّ احترامي إلو مش مربوط بعلامته. وبعدها بيجي حبّ الاستطلاع: بحبّ الطالب يسأل "ليش" ويطلع برّة الكتاب. وبأؤمن كثير بالمسؤولية الشخصية، إنّ الطالب يتعلّم إنّ تعلّمه مسؤوليّته هو كمان، مش شغلتي أنا لحالي.</w:t>
+        <w:t>أرغبُ في أن يخرجوا من صفي غيرَ خائفين من الخطأ، لأنَّ الخطأَ عندي جزءٌ من التعلُّمِ لا عيبٌ يُستحى منه. وأريدُهم قادرين على التعبيرِ عن رأيهم بثقة، ولو بلغةٍ بسيطة؛ فالمهارةُ اللغويةُ تأتي مع الوقت، أما الجرأةُ على المحاولةِ فهي الأساسُ الذي أبنيه أولًا. وأودُّ أن أزرعَ فيهم عادةَ التعاونِ واحترامِ صوتِ الآخرِ في أثناءِ العمل.</w:t>
       </w:r>
     </w:p>
     <w:p>
       <w:pPr>
         <w:bidi w:val="1"/>
-        <w:spacing w:after="40" w:before="0" w:line="336" w:lineRule="auto"/>
+        <w:spacing w:after="40" w:before="0" w:line="360" w:lineRule="auto"/>
         <w:jc w:val="both"/>
       </w:pPr>
       <w:r>
         <w:rPr>
           <w:rFonts w:ascii="Arial" w:hAnsi="Arial" w:cs="Arial"/>
           <w:b/>
+          <w:color w:val="000000"/>
           <w:sz w:val="26"/>
           <w:bCs/>
           <w:rtl w:val="1"/>
         </w:rPr>
-        <w:t>شو بدّي أنمّيه عند طلابي؟</w:t>
+        <w:t>أيُّ معلمةٍ أطمحُ أن أكون</w:t>
       </w:r>
     </w:p>
     <w:p>
       <w:pPr>
         <w:bidi w:val="1"/>
-        <w:spacing w:after="200" w:before="0" w:line="336" w:lineRule="auto"/>
+        <w:spacing w:after="200" w:before="0" w:line="360" w:lineRule="auto"/>
         <w:jc w:val="both"/>
       </w:pPr>
       <w:r>
         <w:rPr>
           <w:rFonts w:ascii="Arial" w:hAnsi="Arial" w:cs="Arial"/>
           <w:b w:val="0"/>
+          <w:color w:val="000000"/>
           <w:sz w:val="26"/>
           <w:rtl w:val="1"/>
         </w:rPr>
-        <w:t>بدّي إياهم يطلعوا من صفّي وهم مش خايفين من الغلط. الغلط عندي جزء من التعلّم، مش عيب. وبدّي إياهم يقدروا يحكوا رأيهم بثقة، حتى لو بلغة بسيطة. المهارة اللغوية بتيجي، بس الثقة والجرأة على المحاولة هي الأساس اللي بأبنيه أول.</w:t>
+        <w:t>أطمحُ أن أكونَ معلمةً مُصغيةً وممكِّنة. مُصغيةً لأنني اختبرتُ بنفسي كيف يتغيرُ الطالبُ حين يشعرُ أنَّ ثمة من يسمعُه حقًّا. وممكِّنةً لأنني لا أريدُ أن أبقى مصدرَ كلِّ شيء، بل أن أمنحَ الطالبَ الأدواتِ ثم أراه يطيرُ بها وحده. أنجحُ حصةٍ عندي تلك التي يخرجُ منها الطالبُ شاعرًا بأنه هو من أنجز، لا أنا. وهذا جوهريٌّ عندي لأنني أربّي إنسانًا مستقلًّا، لا أُلقِّنُ مادةً وحسب.</w:t>
       </w:r>
     </w:p>
     <w:p>
       <w:pPr>
         <w:bidi w:val="1"/>
-        <w:spacing w:after="40" w:before="0" w:line="336" w:lineRule="auto"/>
+        <w:spacing w:after="40" w:before="0" w:line="360" w:lineRule="auto"/>
         <w:jc w:val="both"/>
       </w:pPr>
       <w:r>
         <w:rPr>
           <w:rFonts w:ascii="Arial" w:hAnsi="Arial" w:cs="Arial"/>
           <w:b/>
+          <w:color w:val="000000"/>
           <w:sz w:val="26"/>
           <w:bCs/>
           <w:rtl w:val="1"/>
         </w:rPr>
-        <w:t>أي نوع من المعلمات أطمح أكون؟</w:t>
+        <w:t>"أنا أؤمن" التربويُّ الخاصُّ بي</w:t>
       </w:r>
     </w:p>
     <w:p>
       <w:pPr>
         <w:bidi w:val="1"/>
-        <w:spacing w:after="200" w:before="0" w:line="336" w:lineRule="auto"/>
+        <w:spacing w:after="200" w:before="0" w:line="360" w:lineRule="auto"/>
         <w:jc w:val="both"/>
       </w:pPr>
       <w:r>
         <w:rPr>
           <w:rFonts w:ascii="Arial" w:hAnsi="Arial" w:cs="Arial"/>
           <w:b w:val="0"/>
+          <w:color w:val="000000"/>
           <w:sz w:val="26"/>
           <w:rtl w:val="1"/>
         </w:rPr>
-        <w:t>بأطمح أكون معلّمة مصغية وممكّنة. مصغية لأنّي جرّبت على حالي كيف بيتغيّر الطالب لما يحسّ إنّ في حدا بيسمعه. وممكّنة لأنّي ما بدّي أكون مصدر كل شي، بدّي أعطي الطالب الأدوات ويطير هو. أنجح حصة عندي هي اللي الطالب بيطلع منها حاسّ إنّه هو اللي عمل، مش أنا. هذا مهمّ إلي لأنّي بأربّي إنسان مستقلّ، مش بس بأعلّم مادة.</w:t>
+        <w:t>أؤمنُ أنَّ كلَّ طالبٍ قادرٌ على التعلمِ حين يشعرُ بالأمانِ وبأنَّ له مكانًا. وأؤمنُ أنَّ اللغةَ تُبنى بالمحاولةِ والخطأ لا بالخوف. وأؤمنُ أنَّ مهمتي الأولى ليست أن أُعطيَ معلومة، بل أن أجعلَ الطالبَ يصدِّقُ أنه قادر؛ فحين يصدِّقُ نفسَه يغدو التعلمُ يسيرًا.</w:t>
       </w:r>
     </w:p>
     <w:p>
       <w:pPr>
         <w:bidi w:val="1"/>
-        <w:spacing w:after="40" w:before="0" w:line="336" w:lineRule="auto"/>
+        <w:spacing w:after="40" w:before="0" w:line="360" w:lineRule="auto"/>
         <w:jc w:val="both"/>
       </w:pPr>
       <w:r>
         <w:rPr>
           <w:rFonts w:ascii="Arial" w:hAnsi="Arial" w:cs="Arial"/>
           <w:b/>
+          <w:color w:val="000000"/>
           <w:sz w:val="26"/>
           <w:bCs/>
           <w:rtl w:val="1"/>
         </w:rPr>
-        <w:t>"أنا أؤمن" التربوي الخاص فيّي</w:t>
+        <w:t>كيف يظهرُ هذا "الأنا أؤمن" في ممارستي اليومية</w:t>
       </w:r>
     </w:p>
     <w:p>
       <w:pPr>
         <w:bidi w:val="1"/>
-        <w:spacing w:after="200" w:before="0" w:line="336" w:lineRule="auto"/>
+        <w:spacing w:after="200" w:before="0" w:line="360" w:lineRule="auto"/>
         <w:jc w:val="both"/>
       </w:pPr>
       <w:r>
         <w:rPr>
           <w:rFonts w:ascii="Arial" w:hAnsi="Arial" w:cs="Arial"/>
           <w:b w:val="0"/>
+          <w:color w:val="000000"/>
           <w:sz w:val="26"/>
           <w:rtl w:val="1"/>
         </w:rPr>
-        <w:t>أنا بأؤمن إنّ كل طالب بيقدر يتعلّم لما يحسّ بالأمان وإنّ إلو مكان. بأؤمن إنّ اللغة بتُبنى بالمحاولة والخطأ، مش بالخوف. وبأؤمن إنّ شغلتي الأولى مش إنّي أعطي معلومة، شغلتي إنّي أخلّي الطالب يصدّق إنّه قادر. لما يصدّق حاله، التعلّم بيصير سهل.</w:t>
-      </w:r>
-    </w:p>
-    <w:p>
-      <w:pPr>
-        <w:bidi w:val="1"/>
-        <w:spacing w:after="80" w:before="0" w:line="336" w:lineRule="auto"/>
-        <w:jc w:val="both"/>
-      </w:pPr>
-      <w:r>
-        <w:rPr>
-          <w:rFonts w:ascii="Arial" w:hAnsi="Arial" w:cs="Arial"/>
-          <w:b/>
-          <w:sz w:val="26"/>
-          <w:bCs/>
-          <w:rtl w:val="1"/>
-        </w:rPr>
-        <w:t>كيف بيظهر هذا "الأنا أؤمن" بممارستي اليومية؟</w:t>
-      </w:r>
-    </w:p>
-    <w:p>
-      <w:pPr>
-        <w:pStyle w:val="ListBullet"/>
-        <w:bidi w:val="1"/>
-        <w:spacing w:after="80" w:line="324" w:lineRule="auto"/>
-        <w:jc w:val="right"/>
-      </w:pPr>
-      <w:r>
-        <w:rPr>
-          <w:rFonts w:ascii="Arial" w:hAnsi="Arial" w:cs="Arial"/>
-          <w:b w:val="0"/>
-          <w:sz w:val="26"/>
-          <w:rtl w:val="1"/>
-        </w:rPr>
-        <w:t xml:space="preserve"> بأسلوب حكيي مع الطلاب: بأنادي بالاسم، وبأتجنّب أي كلمة بتقلّل من قيمة الطالب قدّام زمايله.</w:t>
-      </w:r>
-    </w:p>
-    <w:p>
-      <w:pPr>
-        <w:pStyle w:val="ListBullet"/>
-        <w:bidi w:val="1"/>
-        <w:spacing w:after="80" w:line="324" w:lineRule="auto"/>
-        <w:jc w:val="right"/>
-      </w:pPr>
-      <w:r>
-        <w:rPr>
-          <w:rFonts w:ascii="Arial" w:hAnsi="Arial" w:cs="Arial"/>
-          <w:b w:val="0"/>
-          <w:sz w:val="26"/>
-          <w:rtl w:val="1"/>
-        </w:rPr>
-        <w:t xml:space="preserve"> بإدارة الحصة: بأترك وقت للطالب يفكّر قبل ما يجاوب، وما بأستعجل أعبّي الصمت.</w:t>
-      </w:r>
-    </w:p>
-    <w:p>
-      <w:pPr>
-        <w:pStyle w:val="ListBullet"/>
-        <w:bidi w:val="1"/>
-        <w:spacing w:after="80" w:line="324" w:lineRule="auto"/>
-        <w:jc w:val="right"/>
-      </w:pPr>
-      <w:r>
-        <w:rPr>
-          <w:rFonts w:ascii="Arial" w:hAnsi="Arial" w:cs="Arial"/>
-          <w:b w:val="0"/>
-          <w:sz w:val="26"/>
-          <w:rtl w:val="1"/>
-        </w:rPr>
-        <w:t xml:space="preserve"> بتشجيع المشاركة: بأعطي الطالب الخجول سؤال بأعرف إنّه بيقدر عليه، عشان يجرّب النجاح.</w:t>
-      </w:r>
-    </w:p>
-    <w:p>
-      <w:pPr>
-        <w:pStyle w:val="ListBullet"/>
-        <w:bidi w:val="1"/>
-        <w:spacing w:after="80" w:line="324" w:lineRule="auto"/>
-        <w:jc w:val="right"/>
-      </w:pPr>
-      <w:r>
-        <w:rPr>
-          <w:rFonts w:ascii="Arial" w:hAnsi="Arial" w:cs="Arial"/>
-          <w:b w:val="0"/>
-          <w:sz w:val="26"/>
-          <w:rtl w:val="1"/>
-        </w:rPr>
-        <w:t xml:space="preserve"> بالتعامل مع الأخطاء: بأصلّح الغلط سوا معه، بهدوء، وبأبيّن الصح قبل الغلط. الغلط عندي محطة، مش نهاية.</w:t>
-      </w:r>
-    </w:p>
-    <w:p>
-      <w:pPr>
-        <w:pStyle w:val="ListBullet"/>
-        <w:bidi w:val="1"/>
-        <w:spacing w:after="80" w:line="324" w:lineRule="auto"/>
-        <w:jc w:val="right"/>
-      </w:pPr>
-      <w:r>
-        <w:rPr>
-          <w:rFonts w:ascii="Arial" w:hAnsi="Arial" w:cs="Arial"/>
-          <w:b w:val="0"/>
-          <w:sz w:val="26"/>
-          <w:rtl w:val="1"/>
-        </w:rPr>
-        <w:t xml:space="preserve"> بخلق بيئة صفية محترمة: بأحطّ مع الطلاب قوانين بسيطة من عندهم، عشان يحسّوا إنّها قوانينهم مش قوانيني.</w:t>
+        <w:t>يظهرُ في أسلوبِ حديثي مع الطلاب حين أناديهم بأسمائهم وأتجنبُ أيَّ كلمةٍ تقلِّلُ من قيمةِ الطالبِ أمام زملائه. ويظهرُ في إدارتي للحصةِ حين أتركُ للطالبِ وقتًا ليفكرَ قبل أن يجيب، ولا أتعجلُ ملءَ الصمت. ويظهرُ في تشجيعِ المشاركةِ حين أوجِّهُ للطالبِ الخجولِ سؤالًا أعلمُ أنه قادرٌ عليه، ليختبرَ طعمَ النجاح. ويظهرُ في التعاملِ مع الأخطاءِ حين أصحِّحُ الخطأَ معه بهدوءٍ وأُبرزُ الصوابَ قبله، فالخطأُ عندي محطةٌ لا نهاية. وأخيرًا يظهرُ في بيئةِ الصفِّ حين أضعُ القوانينَ مع الطلابِ أنفسِهم، ليشعروا أنها قوانينُهم لا قوانيني.</w:t>
       </w:r>
     </w:p>
     <w:p>
@@ -1690,35 +2557,36 @@
         <w:spacing w:before="360" w:after="120"/>
         <w:jc w:val="right"/>
         <w:pBdr>
-          <w:bottom w:val="single" w:sz="6" w:space="4" w:color="1F6F6B"/>
+          <w:bottom w:val="single" w:sz="6" w:space="4" w:color="000000"/>
         </w:pBdr>
       </w:pPr>
       <w:r>
         <w:rPr>
           <w:rFonts w:ascii="Arial" w:hAnsi="Arial" w:cs="Arial"/>
           <w:b/>
-          <w:color w:val="1F6F6B"/>
-          <w:sz w:val="34"/>
+          <w:color w:val="000000"/>
+          <w:sz w:val="32"/>
           <w:bCs/>
           <w:rtl w:val="1"/>
         </w:rPr>
-        <w:t>كلمة أخيرة</w:t>
+        <w:t>خاتمة</w:t>
       </w:r>
     </w:p>
     <w:p>
       <w:pPr>
         <w:bidi w:val="1"/>
-        <w:spacing w:after="160" w:before="0" w:line="336" w:lineRule="auto"/>
+        <w:spacing w:after="160" w:before="0" w:line="360" w:lineRule="auto"/>
         <w:jc w:val="both"/>
       </w:pPr>
       <w:r>
         <w:rPr>
           <w:rFonts w:ascii="Arial" w:hAnsi="Arial" w:cs="Arial"/>
           <w:b w:val="0"/>
+          <w:color w:val="000000"/>
           <w:sz w:val="26"/>
           <w:rtl w:val="1"/>
         </w:rPr>
-        <w:t>لو رجعت لأول يوم دخلت فيه الصف، كثير أشياء كنت رح أعملها غير. بس هذا بالضبط اللي بيفرح فيّي: إنّي مش نفس المعلّمة اللي بلّشت السنة فيها. تعلّمت إنّ التعليم مهنة بتتعلّمها كل يوم، ومن كل طالب. وطلعت من سنة الاستاج وأنا عارفة أي معلّمة بدّي أكون، وهذا وحده بيستاهل كل التعب.</w:t>
+        <w:t>لو عدتُ إلى أولِ يومٍ دخلتُ فيه الصف، لغيَّرتُ أشياءَ كثيرة. وهذا بالضبط ما يفرحني: أنني لم أعد المعلمةَ نفسَها التي بدأت. تعلمتُ أنَّ التعليمَ مهنةٌ تُتعلَّمُ كلَّ يوم، ومن كلِّ طالب. وخرجتُ من سنةِ الاستاجِ وأنا أعرفُ أيَّ معلمةٍ أريدُ أن أكون، وهذا وحده يستحقُّ كلَّ التعب.</w:t>
       </w:r>
     </w:p>
     <w:sectPr>

</xml_diff>

<commit_message>
Rewrite professional identity section as continuous integrative prose
Co-Authored-By: Claude Opus 4.8 <noreply@anthropic.com>
Claude-Session: https://claude.ai/code/session_01AkgGYV3yP2PQ2xS2ETa6YJ
</commit_message>
<xml_diff>
--- a/ملف_التأمل_المهني_الاستاج.docx
+++ b/ملف_التأمل_المهني_الاستاج.docx
@@ -238,7 +238,7 @@
           <w:sz w:val="26"/>
           <w:rtl w:val="1"/>
         </w:rPr>
-        <w:t>لم تكن هذه السنةُ عندي مجردَ سنةٍ دراسيةٍ أخرى، بل كانت السنةَ التي تحوَّلتُ فيها من طالبةٍ تحملُ نظرياتٍ عن التعليم إلى معلمةٍ تقفُ أمام صفٍّ حقيقيٍّ فيه وجوهٌ وأسماءٌ وقصص. دخلتُ في أول يومٍ وأنا واثقةٌ أنني أعرفُ ما ينبغي فعله، وخرجتُ من السنةِ وأنا أكثرُ تواضعًا وأكثرُ يقينًا في آنٍ واحد: أكثرُ تواضعًا لأنَّ الصفَّ علَّمني أنَّ الخطةَ شيءٌ والواقعَ شيءٌ آخر، وأكثرُ يقينًا لأنني صرتُ أعرفُ أيَّ معلمةٍ أريدُ أن أكون.</w:t>
+        <w:t>لم تكن هذه السنةُ عندي مجردَ سنةٍ دراسيةٍ أخرى, بل كانت السنةَ التي تحوَّلتُ فيها من طالبةٍ تحملُ نظرياتٍ عن التعليم إلى معلمةٍ تقفُ أمام صفٍّ حقيقيٍّ فيه وجوهٌ وأسماءٌ وقصص. دخلتُ في أول يومٍ وأنا واثقةٌ أنني أعرفُ ما ينبغي فعله, وخرجتُ من السنةِ وأنا أكثرُ تواضعًا وأكثرُ يقينًا في آنٍ واحد: أكثرُ تواضعًا لأنَّ الصفَّ علَّمني أنَّ الخطةَ شيءٌ والواقعَ شيءٌ آخر, وأكثرُ يقينًا لأنني صرتُ أعرفُ أيَّ معلمةٍ أريدُ أن أكون.</w:t>
       </w:r>
     </w:p>
     <w:p>
@@ -255,7 +255,7 @@
           <w:sz w:val="26"/>
           <w:rtl w:val="1"/>
         </w:rPr>
-        <w:t>يحاولُ هذا الملفُّ أن يجمعَ خيوطَ تلك السنة في مكانٍ واحد: أن أخطِّطَ فعاليةً تربويةً ذاتَ معنى، وأن أقفَ عند أصعبِ ما واجهني فيها، وأن أتأملَ فيما تركته فيَّ المرافقةُ المهنيةُ والمساقُ من أثر، وأن أصوغَ أخيرًا رؤيتي وهويتي المهنية كما تبلورت فعلًا لا كما أتمنى أن تكون.</w:t>
+        <w:t>يحاولُ هذا الملفُّ أن يجمعَ خيوطَ تلك السنة في مكانٍ واحد: أن أخطِّطَ فعاليةً تربويةً ذاتَ معنى, وأن أقفَ عند أصعبِ ما واجهني فيها, وأن أتأملَ فيما تركته فيَّ المرافقةُ المهنيةُ والمساقُ من أثر, وأن أصوغَ أخيرًا رؤيتي وهويتي المهنية كما تبلورت فعلًا لا كما أتمنى أن تكون.</w:t>
       </w:r>
     </w:p>
     <w:p>
@@ -311,7 +311,7 @@
           <w:sz w:val="26"/>
           <w:rtl w:val="1"/>
         </w:rPr>
-        <w:t>اخترتُ فعاليةً على هيئةِ مشروعٍ صفيٍّ قصير حمَل عنوان "My City, My Words" (مدينتي بكلماتي). المشروعُ يمتدُّ على ثلاثِ حصص، ينتجُ فيه الطلابُ دليلًا سياحيًّا مصغَّرًا عن مدينتهم شفرعم باللغةِ الإنجليزية: مكانٌ يحبونه، طبقٌ من طعامِ البلد، وشخصٌ من العائلةِ يعرِّفون به. وخطةُ الدرسِ المفصَّلةُ أدناه تخصُّ الحصةَ الأولى من المشروع، وهي حصةُ التقديمِ وجمعِ الأفكارِ والكتابةِ الأولى، إذ إنها الحصةُ التي يُبنى عليها كلُّ ما يليها.</w:t>
+        <w:t>اخترتُ فعاليةً على هيئةِ مشروعٍ صفيٍّ قصير حمَل عنوان "My City, My Words" (مدينتي بكلماتي). المشروعُ يمتدُّ على ثلاثِ حصص, ينتجُ فيه الطلابُ دليلًا سياحيًّا مصغَّرًا عن مدينتهم شفرعم باللغةِ الإنجليزية: مكانٌ يحبونه, طبقٌ من طعامِ البلد, وشخصٌ من العائلةِ يعرِّفون به. وخطةُ الدرسِ المفصَّلةُ أدناه تخصُّ الحصةَ الأولى من المشروع, وهي حصةُ التقديمِ وجمعِ الأفكارِ والكتابةِ الأولى, إذ إنها الحصةُ التي يُبنى عليها كلُّ ما يليها.</w:t>
       </w:r>
     </w:p>
     <w:p>
@@ -346,7 +346,7 @@
           <w:sz w:val="26"/>
           <w:rtl w:val="1"/>
         </w:rPr>
-        <w:t>الصفُّ الثامن، مجموعةٌ من ثمانيةٍ وعشرين طالبًا وطالبة. المستوياتُ في هذا الصفِّ متفاوتةٌ إلى حدٍّ بعيد؛ فمنهم من يقرأُ ويكتبُ بثقة، ومنهم من ما زال يتعثرُ في تركيبِ جملةٍ بسيطة. هذه الفجوةُ بالذات كانت حاضرةً في ذهني في كلِّ سطرٍ من التخطيط، ووجَّهت قراري في تقسيمِ العملِ وتوزيعِ الأدوار.</w:t>
+        <w:t>الصفُّ الثامن, مجموعةٌ من ثمانيةٍ وعشرين طالبًا وطالبة. المستوياتُ في هذا الصفِّ متفاوتةٌ إلى حدٍّ بعيد؛ فمنهم من يقرأُ ويكتبُ بثقة, ومنهم من ما زال يتعثرُ في تركيبِ جملةٍ بسيطة. هذه الفجوةُ بالذات كانت حاضرةً في ذهني في كلِّ سطرٍ من التخطيط, ووجَّهت قراري في تقسيمِ العملِ وتوزيعِ الأدوار.</w:t>
       </w:r>
     </w:p>
     <w:p>
@@ -593,7 +593,7 @@
                 <w:sz w:val="23"/>
                 <w:rtl w:val="1"/>
               </w:rPr>
-              <w:t>أن يشعرَ الطالبُ بأنَّ لغته الإنجليزيةَ قادرةٌ على التعبيرِ عن حياتِه هو، لا عن نصوصٍ جاهزةٍ بعيدةٍ عنه.</w:t>
+              <w:t>أن يشعرَ الطالبُ بأنَّ لغته الإنجليزيةَ قادرةٌ على التعبيرِ عن حياتِه هو, لا عن نصوصٍ جاهزةٍ بعيدةٍ عنه.</w:t>
             </w:r>
           </w:p>
         </w:tc>
@@ -641,7 +641,7 @@
                 <w:sz w:val="23"/>
                 <w:rtl w:val="1"/>
               </w:rPr>
-              <w:t>أن يعتزَّ الطالبُ بمدينتِه وبقصصِ أهلِه، وأن ينقلَ هذا الاعتزازَ إلى لغةٍ ثانية.</w:t>
+              <w:t>أن يعتزَّ الطالبُ بمدينتِه وبقصصِ أهلِه, وأن ينقلَ هذا الاعتزازَ إلى لغةٍ ثانية.</w:t>
             </w:r>
           </w:p>
         </w:tc>
@@ -882,7 +882,7 @@
                 <w:sz w:val="23"/>
                 <w:rtl w:val="1"/>
               </w:rPr>
-              <w:t>صورٌ من شفرعم: السوقُ القديم، حارةٌ قديمة، إطلالةٌ على البلد</w:t>
+              <w:t>صورٌ من شفرعم: السوقُ القديم, حارةٌ قديمة, إطلالةٌ على البلد</w:t>
             </w:r>
           </w:p>
         </w:tc>
@@ -1199,7 +1199,7 @@
                 <w:sz w:val="23"/>
                 <w:rtl w:val="1"/>
               </w:rPr>
-              <w:t>أفتتحُ الحصةَ بسؤالٍ على السبورة: "?If a friend visits Shefar’am for one day, where do you take them". أتيحُ لهم الحديثَ بالعربيةِ أولًا حتى أفتحَ البابَ دون خوف، ثم أدوِّنُ الأماكنَ التي يذكرونها بالإنجليزيةِ على اللوح، فيتكوَّنُ بنكُ مفرداتٍ نابعٌ منهم لا منّي.</w:t>
+              <w:t>أفتتحُ الحصةَ بسؤالٍ على السبورة: "?If a friend visits Shefar’am for one day, where do you take them". أتيحُ لهم الحديثَ بالعربيةِ أولًا حتى أفتحَ البابَ دون خوف, ثم أدوِّنُ الأماكنَ التي يذكرونها بالإنجليزيةِ على اللوح, فيتكوَّنُ بنكُ مفرداتٍ نابعٌ منهم لا منّي.</w:t>
             </w:r>
           </w:p>
         </w:tc>
@@ -1222,7 +1222,7 @@
                 <w:sz w:val="23"/>
                 <w:rtl w:val="1"/>
               </w:rPr>
-              <w:t>يستحضرُ أماكنَ يعرفُها، يشاركُ برأيه، ويتعرَّفُ على المفرداتِ في سياقٍ حيّ.</w:t>
+              <w:t>يستحضرُ أماكنَ يعرفُها, يشاركُ برأيه, ويتعرَّفُ على المفرداتِ في سياقٍ حيّ.</w:t>
             </w:r>
           </w:p>
         </w:tc>
@@ -1245,7 +1245,7 @@
                 <w:sz w:val="23"/>
                 <w:rtl w:val="1"/>
               </w:rPr>
-              <w:t>السبورة، صورٌ من البلد</w:t>
+              <w:t>السبورة, صورٌ من البلد</w:t>
             </w:r>
           </w:p>
         </w:tc>
@@ -1296,7 +1296,7 @@
                 <w:sz w:val="23"/>
                 <w:rtl w:val="1"/>
               </w:rPr>
-              <w:t>أُسمِعُهم المقطعَ الصوتيَّ مرتين، وأكلِّفهم بالتقاطِ صفتين وصفيتين فقط، ثم نراجعُهما معًا ونثبِّتُهما على اللوح.</w:t>
+              <w:t>أُسمِعُهم المقطعَ الصوتيَّ مرتين, وأكلِّفهم بالتقاطِ صفتين وصفيتين فقط, ثم نراجعُهما معًا ونثبِّتُهما على اللوح.</w:t>
             </w:r>
           </w:p>
         </w:tc>
@@ -1319,7 +1319,7 @@
                 <w:sz w:val="23"/>
                 <w:rtl w:val="1"/>
               </w:rPr>
-              <w:t>يستمعُ بهدف، يلتقطُ مفرداتٍ محددة، ويشاركُ فيما سمِع.</w:t>
+              <w:t>يستمعُ بهدف, يلتقطُ مفرداتٍ محددة, ويشاركُ فيما سمِع.</w:t>
             </w:r>
           </w:p>
         </w:tc>
@@ -1393,7 +1393,7 @@
                 <w:sz w:val="23"/>
                 <w:rtl w:val="1"/>
               </w:rPr>
-              <w:t>أوزِّعُ بطاقاتِ المفردات، ونربطُ كلَّ مفردةٍ بصورةٍ من صورِ المدينة، ثم نلعبُ لعبةً سريعة: أنطقُ الصفةَ فيرفعون الصورةَ المناسبة.</w:t>
+              <w:t>أوزِّعُ بطاقاتِ المفردات, ونربطُ كلَّ مفردةٍ بصورةٍ من صورِ المدينة, ثم نلعبُ لعبةً سريعة: أنطقُ الصفةَ فيرفعون الصورةَ المناسبة.</w:t>
             </w:r>
           </w:p>
         </w:tc>
@@ -1416,7 +1416,7 @@
                 <w:sz w:val="23"/>
                 <w:rtl w:val="1"/>
               </w:rPr>
-              <w:t>يربطُ المفردةَ بمعناها المحسوس، ويتفاعلُ حركيًّا مع المحتوى.</w:t>
+              <w:t>يربطُ المفردةَ بمعناها المحسوس, ويتفاعلُ حركيًّا مع المحتوى.</w:t>
             </w:r>
           </w:p>
         </w:tc>
@@ -1490,7 +1490,7 @@
                 <w:sz w:val="23"/>
                 <w:rtl w:val="1"/>
               </w:rPr>
-              <w:t>أقسِّمُهم مجموعاتٍ من أربعة، تختارُ كلٌّ منها مكانًا واحدًا. أوزِّعُ ورقةَ العملِ بهيكلِ الفقرة، ويشرعون في الكتابةِ معًا، وأدورُ بينهم أُسنِدُ من يحتاج. يتولى الطالبُ الأقوى دورَ "المحرِّر" الذي يراجعُ الجمل، ويتولى الأضعفُ الرسمَ والكلماتِ المفتاحية، فلكلٍّ مهمة.</w:t>
+              <w:t>أقسِّمُهم مجموعاتٍ من أربعة, تختارُ كلٌّ منها مكانًا واحدًا. أوزِّعُ ورقةَ العملِ بهيكلِ الفقرة, ويشرعون في الكتابةِ معًا, وأدورُ بينهم أُسنِدُ من يحتاج. يتولى الطالبُ الأقوى دورَ "المحرِّر" الذي يراجعُ الجمل, ويتولى الأضعفُ الرسمَ والكلماتِ المفتاحية, فلكلٍّ مهمة.</w:t>
             </w:r>
           </w:p>
         </w:tc>
@@ -1513,7 +1513,7 @@
                 <w:sz w:val="23"/>
                 <w:rtl w:val="1"/>
               </w:rPr>
-              <w:t>يتعاونُ ضمن دورٍ واضح، يكتبُ فقرةً قصيرة، ويتحملُ مسؤوليةَ جزءٍ من النتاج.</w:t>
+              <w:t>يتعاونُ ضمن دورٍ واضح, يكتبُ فقرةً قصيرة, ويتحملُ مسؤوليةَ جزءٍ من النتاج.</w:t>
             </w:r>
           </w:p>
         </w:tc>
@@ -1536,7 +1536,7 @@
                 <w:sz w:val="23"/>
                 <w:rtl w:val="1"/>
               </w:rPr>
-              <w:t>أوراقُ العمل، الأوراقُ الكبيرة</w:t>
+              <w:t>أوراقُ العمل, الأوراقُ الكبيرة</w:t>
             </w:r>
           </w:p>
         </w:tc>
@@ -1587,7 +1587,7 @@
                 <w:sz w:val="23"/>
                 <w:rtl w:val="1"/>
               </w:rPr>
-              <w:t>تقرأُ كلُّ مجموعةٍ جملةً أو جملتين من فقرتها بصوتٍ عالٍ. لا أطلبُ الكمالَ بل المحاولة. أختمُ بسؤالٍ واحد: "ما أصعبُ كلمةٍ شعرتَ بها اليوم، وما أجملُ مكانٍ توصلتم إليه؟"، وأدوِّنُ ملاحظةً سريعةً عن كلِّ مجموعةٍ لأبنيَ عليها في الحصةِ التالية.</w:t>
+              <w:t>تقرأُ كلُّ مجموعةٍ جملةً أو جملتين من فقرتها بصوتٍ عالٍ. لا أطلبُ الكمالَ بل المحاولة. أختمُ بسؤالٍ واحد: "ما أصعبُ كلمةٍ شعرتَ بها اليوم, وما أجملُ مكانٍ توصلتم إليه؟", وأدوِّنُ ملاحظةً سريعةً عن كلِّ مجموعةٍ لأبنيَ عليها في الحصةِ التالية.</w:t>
             </w:r>
           </w:p>
         </w:tc>
@@ -1610,7 +1610,7 @@
                 <w:sz w:val="23"/>
                 <w:rtl w:val="1"/>
               </w:rPr>
-              <w:t>يعرضُ نتاجَه، يتأملُ في تعلُّمِه، ويقدِّمُ تغذيةً راجعةً عن تجربتِه.</w:t>
+              <w:t>يعرضُ نتاجَه, يتأملُ في تعلُّمِه, ويقدِّمُ تغذيةً راجعةً عن تجربتِه.</w:t>
             </w:r>
           </w:p>
         </w:tc>
@@ -1687,7 +1687,7 @@
           <w:sz w:val="26"/>
           <w:rtl w:val="1"/>
         </w:rPr>
-        <w:t>اخترتُ هذا الموضوعَ تحديدًا لأنني لاحظتُ أمرًا بسيطًا لكنه مقلق: كثيرٌ من طلابي يتعاملون مع الإنجليزيةِ كأنها مادةٌ منفصلةٌ عن حياتهم، شيءٌ يخصُّ الامتحانَ فحسب. أردتُ أن أقرِّبَ اللغةَ من واقعهم؛ فحين يكونُ الموضوعُ مدينتَهم هم، يصعبُ عليهم أن يقولوا إنَّ هذا لا يعنيهم.</w:t>
+        <w:t>اخترتُ هذا الموضوعَ تحديدًا لأنني لاحظتُ أمرًا بسيطًا لكنه مقلق: كثيرٌ من طلابي يتعاملون مع الإنجليزيةِ كأنها مادةٌ منفصلةٌ عن حياتهم, شيءٌ يخصُّ الامتحانَ فحسب. أردتُ أن أقرِّبَ اللغةَ من واقعهم؛ فحين يكونُ الموضوعُ مدينتَهم هم, يصعبُ عليهم أن يقولوا إنَّ هذا لا يعنيهم.</w:t>
       </w:r>
     </w:p>
     <w:p>
@@ -1704,7 +1704,7 @@
           <w:sz w:val="26"/>
           <w:rtl w:val="1"/>
         </w:rPr>
-        <w:t>أما الاعتباراتُ التي أثَّرت في قراري فكانت في مقدمتها الفروقُ الفردية. أدركُ أنَّ لديَّ طلابًا لا يقدرون على كتابةِ فقرةٍ بمفردهم، فبنيتُ المشروعَ على مجموعاتٍ وأدوارٍ يشاركُ فيها كلٌّ على قدرِه دون أن يشعرَ أحدٌ بالعجز. ثم جاء الاعتبارُ القيمي: أردتُ لهم أن يعتزوا بأنفسهم وببلدهم وهم يتعلمون لغةً ثانية، لا أن يشعروا بأنَّ الإنجليزيةَ تُلغي هويتهم. وثمة اعتبارٌ عمليٌّ ثالث، هو محدوديةُ زمنِ الحصة، فآثرتُ هدفًا لغويًّا واحدًا واضحًا على أهدافٍ كثيرةٍ متعجلة.</w:t>
+        <w:t>أما الاعتباراتُ التي أثَّرت في قراري فكانت في مقدمتها الفروقُ الفردية. أدركُ أنَّ لديَّ طلابًا لا يقدرون على كتابةِ فقرةٍ بمفردهم, فبنيتُ المشروعَ على مجموعاتٍ وأدوارٍ يشاركُ فيها كلٌّ على قدرِه دون أن يشعرَ أحدٌ بالعجز. ثم جاء الاعتبارُ القيمي: أردتُ لهم أن يعتزوا بأنفسهم وببلدهم وهم يتعلمون لغةً ثانية, لا أن يشعروا بأنَّ الإنجليزيةَ تُلغي هويتهم. وثمة اعتبارٌ عمليٌّ ثالث, هو محدوديةُ زمنِ الحصة, فآثرتُ هدفًا لغويًّا واحدًا واضحًا على أهدافٍ كثيرةٍ متعجلة.</w:t>
       </w:r>
     </w:p>
     <w:p>
@@ -1721,7 +1721,7 @@
           <w:sz w:val="26"/>
           <w:rtl w:val="1"/>
         </w:rPr>
-        <w:t>وأما مصدرُ الفكرة فموقفٌ صغيرٌ لا أنساه. كنتُ أشرحُ نصًّا عن مدينةٍ أجنبيةٍ في الكتاب، فقال لي طالبٌ بعفوية: "مِس، لماذا دائمًا مدنٌ في الخارج؟ ألا مدينةَ لنا؟". ظلَّت جملتُه في ذهني، وشعرتُ أنه محق. ثم التقت هذه الملاحظةُ الميدانيةُ بما درسناه في المساق عن التعلُّمِ ذي المعنى (meaningful learning)، وأنَّ المتعلمَ يتعلمُ أعمقَ حين يربطُ المادةَ بواقعِه المعيش. فأردتُ أن أجرِّبَ هذا المبدأ عمليًّا، لا أن يبقى سطرًا نظريًّا في دفتري.</w:t>
+        <w:t>وأما مصدرُ الفكرة فموقفٌ صغيرٌ لا أنساه. كنتُ أشرحُ نصًّا عن مدينةٍ أجنبيةٍ في الكتاب, فقال لي طالبٌ بعفوية: "مِس, لماذا دائمًا مدنٌ في الخارج؟ ألا مدينةَ لنا؟". ظلَّت جملتُه في ذهني, وشعرتُ أنه محق. ثم التقت هذه الملاحظةُ الميدانيةُ بما درسناه في المساق عن التعلُّمِ ذي المعنى (meaningful learning), وأنَّ المتعلمَ يتعلمُ أعمقَ حين يربطُ المادةَ بواقعِه المعيش. فأردتُ أن أجرِّبَ هذا المبدأ عمليًّا, لا أن يبقى سطرًا نظريًّا في دفتري.</w:t>
       </w:r>
     </w:p>
     <w:p>
@@ -1759,7 +1759,7 @@
           <w:sz w:val="26"/>
           <w:rtl w:val="1"/>
         </w:rPr>
-        <w:t>كان التحدي الأكبرُ الذي واجهني هو انخفاضَ دافعيةِ الطلابِ نحو الإنجليزية، لا في الصفِّ كلِّه، بل لدى فئةٍ واضحةٍ من الطلابِ ذوي الفجوةِ اللغويةِ القديمة. بلغ هؤلاءِ مرحلةً قرَّروا فيها أنهم "ليسوا أهلًا للإنجليزية"، فكفُّوا عن المحاولة. قال لي أحدُهم يومًا: "مِس، أنا فاشلٌ في الإنجليزيةِ منذ الصفِّ الرابع، فلماذا أُتعبُ نفسي؟". أوجعتني هذه الجملةُ، وصارت طوال السنةِ مقياسًا أقيسُ عليه نجاحي.</w:t>
+        <w:t>كان التحدي الأكبرُ الذي واجهني هو انخفاضَ دافعيةِ الطلابِ نحو الإنجليزية, لا في الصفِّ كلِّه, بل لدى فئةٍ واضحةٍ من الطلابِ ذوي الفجوةِ اللغويةِ القديمة. بلغ هؤلاءِ مرحلةً قرَّروا فيها أنهم "ليسوا أهلًا للإنجليزية", فكفُّوا عن المحاولة. قال لي أحدُهم يومًا: "مِس, أنا فاشلٌ في الإنجليزيةِ منذ الصفِّ الرابع, فلماذا أُتعبُ نفسي؟". أوجعتني هذه الجملةُ, وصارت طوال السنةِ مقياسًا أقيسُ عليه نجاحي.</w:t>
       </w:r>
     </w:p>
     <w:p>
@@ -1794,7 +1794,7 @@
           <w:sz w:val="26"/>
           <w:rtl w:val="1"/>
         </w:rPr>
-        <w:t>بدأتُ بتصغيرِ الأهداف. فبدل أن أطلبَ فقرةً كاملة، صرتُ أطلبُ جملةً واحدةً صحيحة، لأنَّ النجاحَ الصغيرَ يعيدُ الثقةَ أسرعَ من أيِّ خطبةِ تشجيع. ثم غيَّرتُ أسلوبَ التصحيح؛ فكففتُ عن تحميرِ كلِّ خطأٍ في الورقة، وصرتُ أُبرزُ أولًا شيئًا أصابوا فيه، ثم نصحِّحُ خطأً واحدًا معًا. وبنيتُ داخلَ المجموعاتِ أدوارًا تجعلُ للطالبِ الضعيفِ موقعًا ووظيفة، لا مجردَ متفرجٍ على من يعملون. وأخيرًا، خصَّصتُ لحظاتٍ خارجَ الدرسِ أحادثُهم فيها كأشخاص، أسألُ عن أحوالهم؛ فالطالبُ حين يشعرُ أنك تراه إنسانًا يعودُ إلى المحاولةِ من أجلك أنت قبل المادة.</w:t>
+        <w:t>بدأتُ بتصغيرِ الأهداف. فبدل أن أطلبَ فقرةً كاملة, صرتُ أطلبُ جملةً واحدةً صحيحة, لأنَّ النجاحَ الصغيرَ يعيدُ الثقةَ أسرعَ من أيِّ خطبةِ تشجيع. ثم غيَّرتُ أسلوبَ التصحيح؛ فكففتُ عن تحميرِ كلِّ خطأٍ في الورقة, وصرتُ أُبرزُ أولًا شيئًا أصابوا فيه, ثم نصحِّحُ خطأً واحدًا معًا. وبنيتُ داخلَ المجموعاتِ أدوارًا تجعلُ للطالبِ الضعيفِ موقعًا ووظيفة, لا مجردَ متفرجٍ على من يعملون. وأخيرًا, خصَّصتُ لحظاتٍ خارجَ الدرسِ أحادثُهم فيها كأشخاص, أسألُ عن أحوالهم؛ فالطالبُ حين يشعرُ أنك تراه إنسانًا يعودُ إلى المحاولةِ من أجلك أنت قبل المادة.</w:t>
       </w:r>
     </w:p>
     <w:p>
@@ -1829,7 +1829,7 @@
           <w:sz w:val="26"/>
           <w:rtl w:val="1"/>
         </w:rPr>
-        <w:t>تعلمتُ أنَّ الدافعيةَ لا تُشترى بالتهديدِ ولا بالعلامة. فالطالبُ الذي "لا يحبُّ الإنجليزية" هو في الغالبِ طالبٌ تعوَّدَ أن يفشلَ فيها، ويخافُ أن يجرِّبَ فيفشلَ من جديد. فصارت مهمتي الأولى أن أكسرَ هذا الخوف، لا أن أحشوَ المعلوماتِ في رأسه. وأدركتُ أنَّ التعليمَ في جوهرِه علاقةٌ قبل أن يكون محتوى.</w:t>
+        <w:t>تعلمتُ أنَّ الدافعيةَ لا تُشترى بالتهديدِ ولا بالعلامة. فالطالبُ الذي "لا يحبُّ الإنجليزية" هو في الغالبِ طالبٌ تعوَّدَ أن يفشلَ فيها, ويخافُ أن يجرِّبَ فيفشلَ من جديد. فصارت مهمتي الأولى أن أكسرَ هذا الخوف, لا أن أحشوَ المعلوماتِ في رأسه. وأدركتُ أنَّ التعليمَ في جوهرِه علاقةٌ قبل أن يكون محتوى.</w:t>
       </w:r>
     </w:p>
     <w:p>
@@ -1864,7 +1864,7 @@
           <w:sz w:val="26"/>
           <w:rtl w:val="1"/>
         </w:rPr>
-        <w:t>مشروعُ "مدينتي بكلماتي" هو حرفيًّا ردِّي على هذا التحدي. اخترتُ موضوعًا يعرفُه الطالبُ ويقدرُ على الحديثِ عنه مهما ضعُفت إنجليزيتُه، لأنه يتحدثُ عن بلده. وبنيتُ المشروعَ على مجموعاتٍ وأدوار كي يجدَ الطالبُ الضعيفُ لنفسِه موضعًا. وجعلتُ خاتمةَ الحصةِ "جرِّبوا فحسب" لا "تكلموا بصواب"، حتى أكسرَ الخوفَ من الخطأ. غايتي أن يخرجَ كلُّ طالبٍ من الحصةِ شاعرًا بأنه نجح في شيء، وإن كان صغيرًا. وقد وجَّهني في التخطيطِ اعتبارٌ حرِصتُ عليه: خشيتُ أن يستحوذَ الطلابُ الأقوى على العملِ فيُهمَّشَ الأضعف، فوزَّعتُ الأدوارَ بنفسي ولم أتركها للصدفة، وجعلتُ في دورِ "المحرِّر" تحديًا يليقُ بالقوي.</w:t>
+        <w:t>مشروعُ "مدينتي بكلماتي" هو حرفيًّا ردِّي على هذا التحدي. اخترتُ موضوعًا يعرفُه الطالبُ ويقدرُ على الحديثِ عنه مهما ضعُفت إنجليزيتُه, لأنه يتحدثُ عن بلده. وبنيتُ المشروعَ على مجموعاتٍ وأدوار كي يجدَ الطالبُ الضعيفُ لنفسِه موضعًا. وجعلتُ خاتمةَ الحصةِ "جرِّبوا فحسب" لا "تكلموا بصواب", حتى أكسرَ الخوفَ من الخطأ. غايتي أن يخرجَ كلُّ طالبٍ من الحصةِ شاعرًا بأنه نجح في شيء, وإن كان صغيرًا. وقد وجَّهني في التخطيطِ اعتبارٌ حرِصتُ عليه: خشيتُ أن يستحوذَ الطلابُ الأقوى على العملِ فيُهمَّشَ الأضعف, فوزَّعتُ الأدوارَ بنفسي ولم أتركها للصدفة, وجعلتُ في دورِ "المحرِّر" تحديًا يليقُ بالقوي.</w:t>
       </w:r>
     </w:p>
     <w:p>
@@ -1899,7 +1899,7 @@
           <w:sz w:val="26"/>
           <w:rtl w:val="1"/>
         </w:rPr>
-        <w:t>أشعرُ أنَّ تقييمي ما زال قائمًا على الحدسِ أكثرَ من اللازم، وأطمحُ إلى بناءِ أداةٍ واضحةٍ (سلَّم تقييمٍ مبسَّط) يعرفُ الطالبُ من خلالها أين هو وإلى أين يريدُ أن يصل. كما أنَّ عشرَ دقائقَ للعرضِ الشفويِّ لم تكفِ، وأنوي في المرةِ القادمةِ أن أمنحَ العرضَ حصةً كاملة، لأنَّ لحظةَ وقوفِ الطالبِ ونطقِه بجملتِه هي اللحظةُ التي تُبنى فيها الثقةُ فعلًا.</w:t>
+        <w:t>أشعرُ أنَّ تقييمي ما زال قائمًا على الحدسِ أكثرَ من اللازم, وأطمحُ إلى بناءِ أداةٍ واضحةٍ (سلَّم تقييمٍ مبسَّط) يعرفُ الطالبُ من خلالها أين هو وإلى أين يريدُ أن يصل. كما أنَّ عشرَ دقائقَ للعرضِ الشفويِّ لم تكفِ, وأنوي في المرةِ القادمةِ أن أمنحَ العرضَ حصةً كاملة, لأنَّ لحظةَ وقوفِ الطالبِ ونطقِه بجملتِه هي اللحظةُ التي تُبنى فيها الثقةُ فعلًا.</w:t>
       </w:r>
     </w:p>
     <w:p>
@@ -1937,7 +1937,7 @@
           <w:sz w:val="26"/>
           <w:rtl w:val="1"/>
         </w:rPr>
-        <w:t>أهمُّ استنتاجٍ خرجتُ به أنَّ التعليمَ ليس عرضًا للمعلومات، بل هو إدارةٌ لعلاقةٍ ولبيئة. كنتُ في السابقِ أُحضِّرُ الحصةَ وأنا مشغولةٌ بسؤالِ "ماذا سأُعطي؟"، وصرتُ أُحضِّرها وأنا أسألُ "ماذا سيفعلُ الطالبُ وبماذا سيخرج؟". هذا التحوُّلُ من مركزيةِ المعلمِ إلى مركزيةِ المتعلمِ هو خلاصةُ السنةِ عندي.</w:t>
+        <w:t>أهمُّ استنتاجٍ خرجتُ به أنَّ التعليمَ ليس عرضًا للمعلومات, بل هو إدارةٌ لعلاقةٍ ولبيئة. كنتُ في السابقِ أُحضِّرُ الحصةَ وأنا مشغولةٌ بسؤالِ "ماذا سأُعطي؟", وصرتُ أُحضِّرها وأنا أسألُ "ماذا سيفعلُ الطالبُ وبماذا سيخرج؟". هذا التحوُّلُ من مركزيةِ المعلمِ إلى مركزيةِ المتعلمِ هو خلاصةُ السنةِ عندي.</w:t>
       </w:r>
     </w:p>
     <w:p>
@@ -1972,7 +1972,7 @@
           <w:sz w:val="26"/>
           <w:rtl w:val="1"/>
         </w:rPr>
-        <w:t>أرَتني المرافقةُ أنَّ المعلمَ ليس ملزَمًا بأن يكونَ مصدرَ كلِّ شيءٍ في الصف. كانت المعلمةُ المرافقةُ أهدأَ مني بكثير، تمنحُ الطالبَ وقتًا ليفكرَ ولا تتعجلُ ملءَ الفراغ. تعلمتُ أنَّ الصمتَ في الصفِّ ليس فشلًا دائمًا، بل هو أحيانًا تفكيرٌ يجري بهدوء.</w:t>
+        <w:t>أرَتني المرافقةُ أنَّ المعلمَ ليس ملزَمًا بأن يكونَ مصدرَ كلِّ شيءٍ في الصف. كانت المعلمةُ المرافقةُ أهدأَ مني بكثير, تمنحُ الطالبَ وقتًا ليفكرَ ولا تتعجلُ ملءَ الفراغ. تعلمتُ أنَّ الصمتَ في الصفِّ ليس فشلًا دائمًا, بل هو أحيانًا تفكيرٌ يجري بهدوء.</w:t>
       </w:r>
     </w:p>
     <w:p>
@@ -2099,7 +2099,7 @@
                 <w:sz w:val="23"/>
                 <w:rtl w:val="1"/>
               </w:rPr>
-              <w:t>صرتُ أبدأُ من الهدفِ ومن الطالب لا من المحتوى، وأسألُ نفسي: ما الذي أريدُه قادرًا على فعلِه في نهايةِ الحصة؟</w:t>
+              <w:t>صرتُ أبدأُ من الهدفِ ومن الطالب لا من المحتوى, وأسألُ نفسي: ما الذي أريدُه قادرًا على فعلِه في نهايةِ الحصة؟</w:t>
             </w:r>
           </w:p>
         </w:tc>
@@ -2148,7 +2148,7 @@
                 <w:sz w:val="23"/>
                 <w:rtl w:val="1"/>
               </w:rPr>
-              <w:t>قلَّلتُ حديثي وكثَّرتُ عملَ الطلاب، حتى صارت الحصةُ التي أتكلمُ فيها طوالَ الوقتِ تُزعجني.</w:t>
+              <w:t>قلَّلتُ حديثي وكثَّرتُ عملَ الطلاب, حتى صارت الحصةُ التي أتكلمُ فيها طوالَ الوقتِ تُزعجني.</w:t>
             </w:r>
           </w:p>
         </w:tc>
@@ -2300,7 +2300,7 @@
           <w:sz w:val="26"/>
           <w:rtl w:val="1"/>
         </w:rPr>
-        <w:t>خرجتُ يومًا من حصةٍ محبَطةً لأنَّ خطتي لم تسِر كما أردت، فقالت لي المعلمةُ المرافقةُ جملةً لم أنسَها: "لستِ مطالبةً بإنقاذِ الحصة، بل بقراءةِ الصف". قصدت أنني بدل أن أتشبثَ بالورقةِ التي حضَّرتها وأُكملَها قسرًا، عليَّ أن أنظرَ إلى الطلابِ أمامي وأُعدِّل. كانت مهمةً لأنني كنتُ أضعُ الخطةَ فوق الطلاب. ومنذئذٍ صرتُ أدخلُ الصفَّ والخطةُ معي، لكنها ليست مقدَّسة. وقد طبَّقتُها فعلًا في مشروعِ المدينة: حين رأيتُ المجموعةَ الأولى تتعثرُ في الكتابة، أوقفتُ المهمة، ورجعنا معًا إلى بنكِ المفردات، ثم أكملنا. ولو تشبثتُ بالورقةِ لضاعوا جميعًا.</w:t>
+        <w:t>خرجتُ يومًا من حصةٍ محبَطةً لأنَّ خطتي لم تسِر كما أردت, فقالت لي المعلمةُ المرافقةُ جملةً لم أنسَها: "لستِ مطالبةً بإنقاذِ الحصة, بل بقراءةِ الصف". قصدت أنني بدل أن أتشبثَ بالورقةِ التي حضَّرتها وأُكملَها قسرًا, عليَّ أن أنظرَ إلى الطلابِ أمامي وأُعدِّل. كانت مهمةً لأنني كنتُ أضعُ الخطةَ فوق الطلاب. ومنذئذٍ صرتُ أدخلُ الصفَّ والخطةُ معي, لكنها ليست مقدَّسة. وقد طبَّقتُها فعلًا في مشروعِ المدينة: حين رأيتُ المجموعةَ الأولى تتعثرُ في الكتابة, أوقفتُ المهمة, ورجعنا معًا إلى بنكِ المفردات, ثم أكملنا. ولو تشبثتُ بالورقةِ لضاعوا جميعًا.</w:t>
       </w:r>
     </w:p>
     <w:p>
@@ -2335,7 +2335,7 @@
           <w:sz w:val="26"/>
           <w:rtl w:val="1"/>
         </w:rPr>
-        <w:t>صارت أهدافي أقلَّ عددًا وأوضحَ صياغة، إذ إنَّ هدفًا واحدًا أو اثنين يتحققان خيرٌ من خمسةٍ تبقى حبرًا على ورق. وصرتُ في تنظيمِ مراحلِ الدرسِ أتركُ هامشًا للمرونةِ ولا أملأُ كلَّ دقيقة، لأنَّ الحصةَ المضغوطةَ لا تدعُ للطالبِ مجالًا ليفكر. وفي ملاءمةِ الأنشطةِ صرتُ أفكرُ في أضعفِ طالبٍ أولًا لا في المتوسط، فما يصلحُ له يصلحُ للبقية. وفي التنويعِ صرتُ أمزجُ السمعيَّ والبصريَّ والحركيَّ في الحصةِ الواحدة، لأنَّ الطلابَ لا يتعلمون جميعًا بالطريقةِ نفسها.</w:t>
+        <w:t>صارت أهدافي أقلَّ عددًا وأوضحَ صياغة, إذ إنَّ هدفًا واحدًا أو اثنين يتحققان خيرٌ من خمسةٍ تبقى حبرًا على ورق. وصرتُ في تنظيمِ مراحلِ الدرسِ أتركُ هامشًا للمرونةِ ولا أملأُ كلَّ دقيقة, لأنَّ الحصةَ المضغوطةَ لا تدعُ للطالبِ مجالًا ليفكر. وفي ملاءمةِ الأنشطةِ صرتُ أفكرُ في أضعفِ طالبٍ أولًا لا في المتوسط, فما يصلحُ له يصلحُ للبقية. وفي التنويعِ صرتُ أمزجُ السمعيَّ والبصريَّ والحركيَّ في الحصةِ الواحدة, لأنَّ الطلابَ لا يتعلمون جميعًا بالطريقةِ نفسها.</w:t>
       </w:r>
     </w:p>
     <w:p>
@@ -2370,7 +2370,7 @@
           <w:sz w:val="26"/>
           <w:rtl w:val="1"/>
         </w:rPr>
-        <w:t>الأول في إدارةِ الصفِّ والوقت: كنتُ في مطلعِ السنةِ أُنهي الحصةَ لاهثةً دون أن أُتمَّ نصفَ الخطة، فتعلمتُ أن أخطِّطَ لزمنٍ أقلَّ من الحصةِ الفعلية وأتركَ فائضًا، فكفَّ عني الركض. والثاني في بناءِ العلاقةِ مع الطلاب: تعلمتُ أن أُناديَهم بأسمائهم منذ الأسبوعِ الأول وأن أسألَ عن الغائب، وهو تغييرٌ بسيطٌ غيَّر جوَّ الصفِّ كلِّه؛ فالطالبُ الذي تشعرُه بأنك تراه يعودُ إليك.</w:t>
+        <w:t>الأول في إدارةِ الصفِّ والوقت: كنتُ في مطلعِ السنةِ أُنهي الحصةَ لاهثةً دون أن أُتمَّ نصفَ الخطة, فتعلمتُ أن أخطِّطَ لزمنٍ أقلَّ من الحصةِ الفعلية وأتركَ فائضًا, فكفَّ عني الركض. والثاني في بناءِ العلاقةِ مع الطلاب: تعلمتُ أن أُناديَهم بأسمائهم منذ الأسبوعِ الأول وأن أسألَ عن الغائب, وهو تغييرٌ بسيطٌ غيَّر جوَّ الصفِّ كلِّه؛ فالطالبُ الذي تشعرُه بأنك تراه يعودُ إليك.</w:t>
       </w:r>
     </w:p>
     <w:p>
@@ -2408,25 +2408,7 @@
           <w:sz w:val="26"/>
           <w:rtl w:val="1"/>
         </w:rPr>
-        <w:t>يتصدرُ قيمي احترامُ المتعلمِ المتبادل. أدخلُ الصفَّ على أساسِ أنَّ الطالبَ إنسانٌ قبل أن يكونَ متعلمًا، وأنَّ احترامي له غيرُ مشروطٍ بعلامته. ويليه حبُّ الاستطلاع؛ إذ أحبُّ للطالبِ أن يسألَ "لماذا" وأن يتجاوزَ حدودَ الكتاب. وأومنُ كذلك بالمسؤوليةِ الشخصية، أي أن يتعلمَ الطالبُ أنَّ تعلُّمَه مسؤوليتُه هو أيضًا، لا عبءٌ محمولٌ على عاتقي وحدي. هذه القيمُ ليست شعاراتٍ أعلِّقها، بل معاييرُ أقيسُ عليها قراراتي اليومية في الصف.</w:t>
-      </w:r>
-    </w:p>
-    <w:p>
-      <w:pPr>
-        <w:bidi w:val="1"/>
-        <w:spacing w:after="40" w:before="0" w:line="360" w:lineRule="auto"/>
-        <w:jc w:val="both"/>
-      </w:pPr>
-      <w:r>
-        <w:rPr>
-          <w:rFonts w:ascii="Arial" w:hAnsi="Arial" w:cs="Arial"/>
-          <w:b/>
-          <w:color w:val="000000"/>
-          <w:sz w:val="26"/>
-          <w:bCs/>
-          <w:rtl w:val="1"/>
-        </w:rPr>
-        <w:t>ما أرغبُ في تنميتِه لدى طلابي</w:t>
+        <w:t>حين أحاولُ أن أصفَ نفسي كمعلمة, أجدُ أنَّ كلَّ ما أفعلُه في الصفِّ يعودُ في جذرِه إلى قيمةٍ واحدةٍ تتصدرُ ما عداها: احترامُ المتعلمِ المتبادل. أدخلُ الصفَّ على أساسِ أنَّ الطالبَ إنسانٌ قبل أن يكونَ متعلمًا, وأنَّ احترامي له غيرُ مشروطٍ بعلامتِه. من هذه القيمةِ تتفرَّعُ بقيةُ ما أومنُ به؛ فحبُّ الاستطلاعِ الذي أرجو أن يسألَ الطالبُ بدافعِه "لماذا" ويتجاوزَ حدودَ الكتاب لا ينمو إلا في صفٍّ يشعرُ فيه أنَّ سؤالَه مُرحَّبٌ به لا مصدرُ إحراج. وكذلك المسؤوليةُ الشخصية, أي أن يعيَ الطالبُ أنَّ تعلُّمَه مسؤوليتُه هو أيضًا لا عبءٌ على عاتقي وحدي, لا تُبنى بالإكراهِ بل حين يشعرُ أنَّ صوتَه محسوبٌ وأنَّ قراراتِه في التعلمِ تخصُّه. هذه القيمُ ليست شعاراتٍ أعلِّقها على جدارِ الصف, بل معاييرُ أزنُ بها قراراتي اليوميةَ الصغيرة.</w:t>
       </w:r>
     </w:p>
     <w:p>
@@ -2443,25 +2425,7 @@
           <w:sz w:val="26"/>
           <w:rtl w:val="1"/>
         </w:rPr>
-        <w:t>أرغبُ في أن يخرجوا من صفي غيرَ خائفين من الخطأ، لأنَّ الخطأَ عندي جزءٌ من التعلُّمِ لا عيبٌ يُستحى منه. وأريدُهم قادرين على التعبيرِ عن رأيهم بثقة، ولو بلغةٍ بسيطة؛ فالمهارةُ اللغويةُ تأتي مع الوقت، أما الجرأةُ على المحاولةِ فهي الأساسُ الذي أبنيه أولًا. وأودُّ أن أزرعَ فيهم عادةَ التعاونِ واحترامِ صوتِ الآخرِ في أثناءِ العمل.</w:t>
-      </w:r>
-    </w:p>
-    <w:p>
-      <w:pPr>
-        <w:bidi w:val="1"/>
-        <w:spacing w:after="40" w:before="0" w:line="360" w:lineRule="auto"/>
-        <w:jc w:val="both"/>
-      </w:pPr>
-      <w:r>
-        <w:rPr>
-          <w:rFonts w:ascii="Arial" w:hAnsi="Arial" w:cs="Arial"/>
-          <w:b/>
-          <w:color w:val="000000"/>
-          <w:sz w:val="26"/>
-          <w:bCs/>
-          <w:rtl w:val="1"/>
-        </w:rPr>
-        <w:t>أيُّ معلمةٍ أطمحُ أن أكون</w:t>
+        <w:t>وانطلاقًا من هذا الأساس, صار واضحًا لي ما الذي أريدُ أن أنمِّيَه في طلابي فعلًا. قبل أيِّ مهارةٍ لغوية, أريدُهم أن يخرجوا من صفي غيرَ خائفين من الخطأ, لأنَّ الخطأَ عندي محطةٌ في التعلمِ لا عيبٌ يُستحى منه, وقد رأيتُ بعينيَّ كيف يشلُّ الخوفُ من الخطأ طالبًا كاملًا فيصمتُ خشيةَ أن يُخطئ. ثم أريدُهم قادرين على التعبيرِ عن رأيهم بثقة, ولو بلغةٍ بسيطة, وأن يتعوَّدوا التعاونَ واحترامَ صوتِ زميلِهم في أثناءِ العمل؛ فالمهارةُ اللغويةُ تأتي مع الوقت, أما الجرأةُ على المحاولةِ فهي الأرضُ التي يُزرَعُ فيها كلُّ شيءٍ بعدها. ولأنَّ هذا ما أريدُ أن أزرعَه, صرتُ أعرفُ أيَّ معلمةٍ أطمحُ أن أكون: معلمةً مُصغيةً وممكِّنة. مُصغيةً لأنني اختبرتُ بنفسي كيف يتغيرُ الطالبُ حين يشعرُ أنَّ ثمة من يسمعُه حقًّا, وممكِّنةً لأنني لا أريدُ أن أبقى مصدرَ كلِّ شيء, بل أن أمنحَه الأدواتِ ثم أراه ينطلقُ بها وحده. أنجحُ حصةٍ عندي تلك التي يخرجُ منها الطالبُ شاعرًا بأنه هو من أنجز, لا أنا, لأنني في النهايةِ أربّي إنسانًا مستقلًّا لا أُلقِّنُ مادةً وحسب.</w:t>
       </w:r>
     </w:p>
     <w:p>
@@ -2478,77 +2442,7 @@
           <w:sz w:val="26"/>
           <w:rtl w:val="1"/>
         </w:rPr>
-        <w:t>أطمحُ أن أكونَ معلمةً مُصغيةً وممكِّنة. مُصغيةً لأنني اختبرتُ بنفسي كيف يتغيرُ الطالبُ حين يشعرُ أنَّ ثمة من يسمعُه حقًّا. وممكِّنةً لأنني لا أريدُ أن أبقى مصدرَ كلِّ شيء، بل أن أمنحَ الطالبَ الأدواتِ ثم أراه يطيرُ بها وحده. أنجحُ حصةٍ عندي تلك التي يخرجُ منها الطالبُ شاعرًا بأنه هو من أنجز، لا أنا. وهذا جوهريٌّ عندي لأنني أربّي إنسانًا مستقلًّا، لا أُلقِّنُ مادةً وحسب.</w:t>
-      </w:r>
-    </w:p>
-    <w:p>
-      <w:pPr>
-        <w:bidi w:val="1"/>
-        <w:spacing w:after="40" w:before="0" w:line="360" w:lineRule="auto"/>
-        <w:jc w:val="both"/>
-      </w:pPr>
-      <w:r>
-        <w:rPr>
-          <w:rFonts w:ascii="Arial" w:hAnsi="Arial" w:cs="Arial"/>
-          <w:b/>
-          <w:color w:val="000000"/>
-          <w:sz w:val="26"/>
-          <w:bCs/>
-          <w:rtl w:val="1"/>
-        </w:rPr>
-        <w:t>"أنا أؤمن" التربويُّ الخاصُّ بي</w:t>
-      </w:r>
-    </w:p>
-    <w:p>
-      <w:pPr>
-        <w:bidi w:val="1"/>
-        <w:spacing w:after="200" w:before="0" w:line="360" w:lineRule="auto"/>
-        <w:jc w:val="both"/>
-      </w:pPr>
-      <w:r>
-        <w:rPr>
-          <w:rFonts w:ascii="Arial" w:hAnsi="Arial" w:cs="Arial"/>
-          <w:b w:val="0"/>
-          <w:color w:val="000000"/>
-          <w:sz w:val="26"/>
-          <w:rtl w:val="1"/>
-        </w:rPr>
-        <w:t>أؤمنُ أنَّ كلَّ طالبٍ قادرٌ على التعلمِ حين يشعرُ بالأمانِ وبأنَّ له مكانًا. وأؤمنُ أنَّ اللغةَ تُبنى بالمحاولةِ والخطأ لا بالخوف. وأؤمنُ أنَّ مهمتي الأولى ليست أن أُعطيَ معلومة، بل أن أجعلَ الطالبَ يصدِّقُ أنه قادر؛ فحين يصدِّقُ نفسَه يغدو التعلمُ يسيرًا.</w:t>
-      </w:r>
-    </w:p>
-    <w:p>
-      <w:pPr>
-        <w:bidi w:val="1"/>
-        <w:spacing w:after="40" w:before="0" w:line="360" w:lineRule="auto"/>
-        <w:jc w:val="both"/>
-      </w:pPr>
-      <w:r>
-        <w:rPr>
-          <w:rFonts w:ascii="Arial" w:hAnsi="Arial" w:cs="Arial"/>
-          <w:b/>
-          <w:color w:val="000000"/>
-          <w:sz w:val="26"/>
-          <w:bCs/>
-          <w:rtl w:val="1"/>
-        </w:rPr>
-        <w:t>كيف يظهرُ هذا "الأنا أؤمن" في ممارستي اليومية</w:t>
-      </w:r>
-    </w:p>
-    <w:p>
-      <w:pPr>
-        <w:bidi w:val="1"/>
-        <w:spacing w:after="200" w:before="0" w:line="360" w:lineRule="auto"/>
-        <w:jc w:val="both"/>
-      </w:pPr>
-      <w:r>
-        <w:rPr>
-          <w:rFonts w:ascii="Arial" w:hAnsi="Arial" w:cs="Arial"/>
-          <w:b w:val="0"/>
-          <w:color w:val="000000"/>
-          <w:sz w:val="26"/>
-          <w:rtl w:val="1"/>
-        </w:rPr>
-        <w:t>يظهرُ في أسلوبِ حديثي مع الطلاب حين أناديهم بأسمائهم وأتجنبُ أيَّ كلمةٍ تقلِّلُ من قيمةِ الطالبِ أمام زملائه. ويظهرُ في إدارتي للحصةِ حين أتركُ للطالبِ وقتًا ليفكرَ قبل أن يجيب، ولا أتعجلُ ملءَ الصمت. ويظهرُ في تشجيعِ المشاركةِ حين أوجِّهُ للطالبِ الخجولِ سؤالًا أعلمُ أنه قادرٌ عليه، ليختبرَ طعمَ النجاح. ويظهرُ في التعاملِ مع الأخطاءِ حين أصحِّحُ الخطأَ معه بهدوءٍ وأُبرزُ الصوابَ قبله، فالخطأُ عندي محطةٌ لا نهاية. وأخيرًا يظهرُ في بيئةِ الصفِّ حين أضعُ القوانينَ مع الطلابِ أنفسِهم، ليشعروا أنها قوانينُهم لا قوانيني.</w:t>
+        <w:t>كلُّ ما سبق يتكثَّفُ عندي في جملةٍ واحدةٍ هي "أنا أؤمن" التربويُّ الذي أعملُ في ضوئه: أؤمنُ أنَّ كلَّ طالبٍ قادرٌ على التعلمِ حين يشعرُ بالأمانِ وبأنَّ له مكانًا, وأنَّ اللغةَ تُبنى بالمحاولةِ والخطأ لا بالخوف, وأنَّ مهمتي الأولى ليست أن أُعطيَ معلومةً بل أن أجعلَ الطالبَ يصدِّقُ أنه قادر, فحين يصدِّقُ نفسَه يغدو التعلمُ يسيرًا. وهذا الإيمانُ لا يبقى في مكانٍ مجرَّد, بل يتسربُ إلى أدقِّ تفاصيلِ يومي في الصف. يظهرُ في أسلوبِ حديثي معهم حين أناديهم بأسمائهم وأتجنبُ أيَّ كلمةٍ تقلِّلُ من قيمةِ طالبٍ أمام زملائه, وفي إدارتي للحصةِ حين أتركُ له وقتًا ليفكرَ قبل أن يجيبَ ولا أتعجلُ ملءَ الصمت, وفي تشجيعي للمشاركةِ حين أوجِّهُ للطالبِ الخجولِ سؤالًا أعلمُ أنه قادرٌ عليه ليختبرَ طعمَ النجاح, وفي تعاملي مع الأخطاءِ حين أصحِّحُ الخطأَ معه بهدوءٍ وأُبرزُ الصوابَ قبله, وأخيرًا في بيئةِ الصفِّ حين أضعُ القوانينَ مع الطلابِ أنفسِهم ليشعروا أنها قوانينُهم لا قوانيني. بهذا تصيرُ القيمةُ والرؤيةُ والممارسةُ شيئًا واحدًا, لا أقوالًا في جانبٍ وأفعالًا في جانبٍ آخر.</w:t>
       </w:r>
     </w:p>
     <w:p>
@@ -2586,7 +2480,7 @@
           <w:sz w:val="26"/>
           <w:rtl w:val="1"/>
         </w:rPr>
-        <w:t>لو عدتُ إلى أولِ يومٍ دخلتُ فيه الصف، لغيَّرتُ أشياءَ كثيرة. وهذا بالضبط ما يفرحني: أنني لم أعد المعلمةَ نفسَها التي بدأت. تعلمتُ أنَّ التعليمَ مهنةٌ تُتعلَّمُ كلَّ يوم، ومن كلِّ طالب. وخرجتُ من سنةِ الاستاجِ وأنا أعرفُ أيَّ معلمةٍ أريدُ أن أكون، وهذا وحده يستحقُّ كلَّ التعب.</w:t>
+        <w:t>لو عدتُ إلى أولِ يومٍ دخلتُ فيه الصف, لغيَّرتُ أشياءَ كثيرة. وهذا بالضبط ما يفرحني: أنني لم أعد المعلمةَ نفسَها التي بدأت. تعلمتُ أنَّ التعليمَ مهنةٌ تُتعلَّمُ كلَّ يوم, ومن كلِّ طالب. وخرجتُ من سنةِ الاستاجِ وأنا أعرفُ أيَّ معلمةٍ أريدُ أن أكون, وهذا وحده يستحقُّ كلَّ التعب.</w:t>
       </w:r>
     </w:p>
     <w:sectPr>

</xml_diff>

<commit_message>
Deepen introduction and mentoring/course section with fuller reflection
Co-Authored-By: Claude Opus 4.8 <noreply@anthropic.com>
Claude-Session: https://claude.ai/code/session_01AkgGYV3yP2PQ2xS2ETa6YJ
</commit_message>
<xml_diff>
--- a/ملف_التأمل_المهني_الاستاج.docx
+++ b/ملف_التأمل_المهني_الاستاج.docx
@@ -221,7 +221,7 @@
           <w:bCs/>
           <w:rtl w:val="1"/>
         </w:rPr>
-        <w:t>توطئة</w:t>
+        <w:t>توطئة ومقدمة</w:t>
       </w:r>
     </w:p>
     <w:p>
@@ -238,7 +238,24 @@
           <w:sz w:val="26"/>
           <w:rtl w:val="1"/>
         </w:rPr>
-        <w:t>لم تكن هذه السنةُ عندي مجردَ سنةٍ دراسيةٍ أخرى, بل كانت السنةَ التي تحوَّلتُ فيها من طالبةٍ تحملُ نظرياتٍ عن التعليم إلى معلمةٍ تقفُ أمام صفٍّ حقيقيٍّ فيه وجوهٌ وأسماءٌ وقصص. دخلتُ في أول يومٍ وأنا واثقةٌ أنني أعرفُ ما ينبغي فعله, وخرجتُ من السنةِ وأنا أكثرُ تواضعًا وأكثرُ يقينًا في آنٍ واحد: أكثرُ تواضعًا لأنَّ الصفَّ علَّمني أنَّ الخطةَ شيءٌ والواقعَ شيءٌ آخر, وأكثرُ يقينًا لأنني صرتُ أعرفُ أيَّ معلمةٍ أريدُ أن أكون.</w:t>
+        <w:t>يُقالُ إنَّ المرءَ لا يعرفُ معنى مهنةٍ ما حتى يمارسَها, وأنا لم أُدرك كم أنَّ هذا صحيحٌ إلا في سنةِ الاستاج. جئتُ إلى الصفِّ محمَّلةً بما درستُه من نظرياتٍ عن التعلمِ والتقييمِ وإدارةِ الصف, وكنتُ أظنُّ أنَّ المعرفةَ وحدها كافية. لكنَّ أولَ حصةٍ حقيقيةٍ ذكَّرتني بأنَّ بين ما نعرفُه وما نفعلُه مسافةً لا تُقطعُ إلا بالممارسةِ والخطأ والتأمل. هكذا صارت هذه السنةُ, في تعليمِ اللغةِ الإنجليزيةِ في مدرسةٍ إعداديةٍ في شفرعم, أشبهَ بورشةٍ طويلةٍ أعدتُ فيها تشكيلَ صورتي عن نفسي معلمة.</w:t>
+      </w:r>
+    </w:p>
+    <w:p>
+      <w:pPr>
+        <w:bidi w:val="1"/>
+        <w:spacing w:after="160" w:before="0" w:line="360" w:lineRule="auto"/>
+        <w:jc w:val="both"/>
+      </w:pPr>
+      <w:r>
+        <w:rPr>
+          <w:rFonts w:ascii="Arial" w:hAnsi="Arial" w:cs="Arial"/>
+          <w:b w:val="0"/>
+          <w:color w:val="000000"/>
+          <w:sz w:val="26"/>
+          <w:rtl w:val="1"/>
+        </w:rPr>
+        <w:t>لم يكن الأمرُ سهلًا في بدايته. الوقوفُ أمام صفٍّ من المراهقين في مرحلةٍ حساسةٍ من أعمارهم, وتعليمُهم لغةً يشعرُ كثيرٌ منهم أنها غريبةٌ وبعيدةٌ عن عالمهم, وضعني أمام أسئلةٍ لم تكن الكتبُ قد أجابت عنها: كيف أُعيدُ الثقةَ لطالبٍ استسلم؟ كيف أوازنُ بين من يسبقُ ومن يتخلَّف في الصفِّ نفسه؟ متى أتمسكُ بخطتي ومتى أتركُها؟ ومع كلِّ سؤالٍ من هذه كنتُ أتعلمُ شيئًا, أحيانًا من نجاحٍ صغيرٍ وأحيانًا كثيرةً من إخفاق. ولعلَّ أهمَّ ما أدركتُه أنَّ التدريسَ ليس أداءً ننجزُه ثم ننصرف, بل علاقةٌ نبنيها يومًا بعد يوم مع أناسٍ صغارٍ يستحقون أن يُؤخذوا على محملِ الجد.</w:t>
       </w:r>
     </w:p>
     <w:p>
@@ -255,7 +272,7 @@
           <w:sz w:val="26"/>
           <w:rtl w:val="1"/>
         </w:rPr>
-        <w:t>يحاولُ هذا الملفُّ أن يجمعَ خيوطَ تلك السنة في مكانٍ واحد: أن أخطِّطَ فعاليةً تربويةً ذاتَ معنى, وأن أقفَ عند أصعبِ ما واجهني فيها, وأن أتأملَ فيما تركته فيَّ المرافقةُ المهنيةُ والمساقُ من أثر, وأن أصوغَ أخيرًا رؤيتي وهويتي المهنية كما تبلورت فعلًا لا كما أتمنى أن تكون.</w:t>
+        <w:t>يأتي هذا الملفُّ ليكونَ محطةَ توقفٍ أنظرُ فيها إلى الوراء بعينٍ متأملة, لا لأسردَ ما جرى فحسب, بل لأفهمَ كيف تحوَّلتُ خلاله. سأبدأُ بتخطيطِ فعاليةٍ تربويةٍ ذاتِ معنى اخترتُها لأنها تلخِّصُ ما أومنُ به, ثم أقفُ عند أصعبِ تحدٍّ واجهني وكيف انعكس في تلك الفعالية, وأتأملُ بعدها في الأثرِ العميقِ الذي تركته فيَّ المرافقةُ المهنيةُ والمساق, وأختمُ بصياغةِ هويتي المهنيةِ ورؤيتي كما تبلورت فعلًا على أرضِ الصف. هو إذن ليس تقريرًا عن سنة, بل محاولةٌ صادقةٌ لفهمِ المعلمةِ التي صرتُ عليها, والمعلمةِ التي ما زلتُ في الطريقِ إليها.</w:t>
       </w:r>
     </w:p>
     <w:p>
@@ -1937,7 +1954,7 @@
           <w:sz w:val="26"/>
           <w:rtl w:val="1"/>
         </w:rPr>
-        <w:t>أهمُّ استنتاجٍ خرجتُ به أنَّ التعليمَ ليس عرضًا للمعلومات, بل هو إدارةٌ لعلاقةٍ ولبيئة. كنتُ في السابقِ أُحضِّرُ الحصةَ وأنا مشغولةٌ بسؤالِ "ماذا سأُعطي؟", وصرتُ أُحضِّرها وأنا أسألُ "ماذا سيفعلُ الطالبُ وبماذا سيخرج؟". هذا التحوُّلُ من مركزيةِ المعلمِ إلى مركزيةِ المتعلمِ هو خلاصةُ السنةِ عندي.</w:t>
+        <w:t>حين أتأملُ في هذه السنة, أجدُ أنَّ المرافقةَ المهنيةَ والمساقَ عملا فيَّ كجناحين: المساقُ أعطاني الإطارَ النظريَّ والمفاهيمَ التي أُسمّي بها ما أراه, والمرافقةُ أنزلت تلك المفاهيمَ إلى أرضِ الصفِّ ووضعتها تحت اختبارِ الواقع. لولا المساقُ لبقيتُ أتصرفُ بالحدسِ دون أن أفهمَ لماذا, ولولا المرافقةُ لبقيت المفاهيمُ حبيسةَ الورق. وأهمُّ استنتاجٍ خرجتُ به من الاثنين معًا أنَّ التعليمَ ليس عرضًا للمعلومات, بل هو إدارةٌ لعلاقةٍ ولبيئةِ تعلُّم. كنتُ في السابقِ أُحضِّرُ الحصةَ وأنا مشغولةٌ بسؤالِ "ماذا سأُعطي؟", وصرتُ أُحضِّرها وأنا أسألُ "ماذا سيفعلُ الطالبُ وبماذا سيخرج؟". هذا التحوُّلُ من مركزيةِ المعلمِ إلى مركزيةِ المتعلمِ هو خلاصةُ السنةِ عندي, ومنه تفرَّعَ كلُّ تغييرٍ آخر.</w:t>
       </w:r>
     </w:p>
     <w:p>
@@ -1972,7 +1989,7 @@
           <w:sz w:val="26"/>
           <w:rtl w:val="1"/>
         </w:rPr>
-        <w:t>أرَتني المرافقةُ أنَّ المعلمَ ليس ملزَمًا بأن يكونَ مصدرَ كلِّ شيءٍ في الصف. كانت المعلمةُ المرافقةُ أهدأَ مني بكثير, تمنحُ الطالبَ وقتًا ليفكرَ ولا تتعجلُ ملءَ الفراغ. تعلمتُ أنَّ الصمتَ في الصفِّ ليس فشلًا دائمًا, بل هو أحيانًا تفكيرٌ يجري بهدوء.</w:t>
+        <w:t>غيَّرت المرافقةُ صورتي عن المعلمِ من جذورها. كنتُ أظنُّ أنَّ قوةَ المعلمِ في أن يملأَ الصفَّ بحضورِه وكلامِه, فأرَتني المعلمةُ المرافقةُ أنَّ القوةَ الحقيقيةَ أحيانًا في الصمتِ وفي التراجعِ خطوةً إلى الوراء لإفساحِ المجالِ للطالب. كانت أهدأَ مني بكثير, تطرحُ سؤالًا ثم تنتظرُ, تعُدُّ في نفسها ثوانيَ لا تُعدُّ عندي, فيخرجُ من الطالبِ جوابٌ ما كان ليخرجَ لو تعجَّلتُ ملءَ الفراغ. وربط المساقُ لي هذا بمفهومِ "زمنِ الانتظار" (wait time) وبفكرةِ السقالاتِ التعليمية (scaffolding): أنَّ دوري ليس أن أُعطيَ الجوابَ, بل أن أبنيَ سلَّمًا يصعدُ الطالبُ عليه بنفسه. فأدركتُ أنَّ الصمتَ في الصفِّ ليس فشلًا يجبُ إنقاذُه, بل هو غالبًا تفكيرٌ يجري بهدوء, وأنَّ المعلمَ الأنجحَ ليس من يعرفُ أكثر, بل من يجعلُ طلابَه يفكرون أكثر.</w:t>
       </w:r>
     </w:p>
     <w:p>
@@ -2099,7 +2116,7 @@
                 <w:sz w:val="23"/>
                 <w:rtl w:val="1"/>
               </w:rPr>
-              <w:t>صرتُ أبدأُ من الهدفِ ومن الطالب لا من المحتوى, وأسألُ نفسي: ما الذي أريدُه قادرًا على فعلِه في نهايةِ الحصة؟</w:t>
+              <w:t>صرتُ أبدأُ من الهدفِ ومن الطالب لا من المحتوى, وأصوغُ الهدفَ بفعلٍ يقدرُ الطالبُ على أدائِه وقياسِه: ماذا سيكونُ قادرًا على فعلِه في نهايةِ الحصة؟</w:t>
             </w:r>
           </w:p>
         </w:tc>
@@ -2148,7 +2165,7 @@
                 <w:sz w:val="23"/>
                 <w:rtl w:val="1"/>
               </w:rPr>
-              <w:t>قلَّلتُ حديثي وكثَّرتُ عملَ الطلاب, حتى صارت الحصةُ التي أتكلمُ فيها طوالَ الوقتِ تُزعجني.</w:t>
+              <w:t>قلَّلتُ حديثي وكثَّرتُ عملَ الطلاب, ووزَّعتُ الحصةَ إلى مراحلَ قصيرةٍ متنوعةٍ بدل شرحٍ طويلٍ واحد, حتى صارت الحصةُ التي أتكلمُ فيها طوالَ الوقتِ تُزعجني.</w:t>
             </w:r>
           </w:p>
         </w:tc>
@@ -2197,7 +2214,7 @@
                 <w:sz w:val="23"/>
                 <w:rtl w:val="1"/>
               </w:rPr>
-              <w:t>صرتُ أقرأُ السلوكَ المشوِّشَ كرسالةٍ لا كتحدٍّ شخصي؛ فالطالبُ المشوِّشُ غالبًا مللٌّ أو غيرُ فاهم.</w:t>
+              <w:t>صرتُ أقرأُ السلوكَ المشوِّشَ كرسالةٍ لها سبب لا كتحدٍّ لشخصي؛ فالطالبُ المشوِّشُ غالبًا مللٌّ أو غيرُ فاهمٍ أو يبحثُ عن انتباه, والاستجابةُ للسببِ أجدى من معاقبةِ العرَض.</w:t>
             </w:r>
           </w:p>
         </w:tc>
@@ -2246,7 +2263,7 @@
                 <w:sz w:val="23"/>
                 <w:rtl w:val="1"/>
               </w:rPr>
-              <w:t>أدركتُ أنَّ التقييمَ ليس امتحانًا في نهايةِ الوحدةِ فحسب؛ فسؤالٌ ختاميٌّ أو ورقةُ خروجٍ تمنحُني صورةً أوضحَ من علامةٍ رقمية.</w:t>
+              <w:t>أدركتُ أنَّ التقييمَ مرافقٌ للتعلمِ لا خاتمةٌ له؛ فسؤالٌ ختاميٌّ أو ورقةُ خروجٍ أو جولةٌ بين المجموعاتِ تمنحُني صورةً حيةً عن فهمهم أصدقَ من علامةٍ رقميةٍ في نهايةِ الوحدة.</w:t>
             </w:r>
           </w:p>
         </w:tc>
@@ -2300,7 +2317,7 @@
           <w:sz w:val="26"/>
           <w:rtl w:val="1"/>
         </w:rPr>
-        <w:t>خرجتُ يومًا من حصةٍ محبَطةً لأنَّ خطتي لم تسِر كما أردت, فقالت لي المعلمةُ المرافقةُ جملةً لم أنسَها: "لستِ مطالبةً بإنقاذِ الحصة, بل بقراءةِ الصف". قصدت أنني بدل أن أتشبثَ بالورقةِ التي حضَّرتها وأُكملَها قسرًا, عليَّ أن أنظرَ إلى الطلابِ أمامي وأُعدِّل. كانت مهمةً لأنني كنتُ أضعُ الخطةَ فوق الطلاب. ومنذئذٍ صرتُ أدخلُ الصفَّ والخطةُ معي, لكنها ليست مقدَّسة. وقد طبَّقتُها فعلًا في مشروعِ المدينة: حين رأيتُ المجموعةَ الأولى تتعثرُ في الكتابة, أوقفتُ المهمة, ورجعنا معًا إلى بنكِ المفردات, ثم أكملنا. ولو تشبثتُ بالورقةِ لضاعوا جميعًا.</w:t>
+        <w:t>خرجتُ يومًا من حصةٍ محبَطةً لأنَّ خطتي لم تسِر كما أردت, فقالت لي المعلمةُ المرافقةُ جملةً لم أنسَها: "لستِ مطالبةً بإنقاذِ الحصة, بل بقراءةِ الصف". بدت لي في لحظتها كلمةً عابرة, لكنها فتحت لي بابًا واسعًا. فهمتُ أنني كنتُ أضعُ الخطةَ فوق الطلاب, أركضُ خلف إتمامِ ما كتبتُه في دفتري حتى لو فقَدتُ الصفَّ في الطريق, وأنَّ عليَّ أن أعكسَ الأولوية: الطلابُ أولًا, والخطةُ أداةٌ في خدمتهم لا سيدةٌ عليهم. كانت هذه النصيحةُ الأعمقَ أثرًا لأنها لم تُصحِّح تقنيةً عندي بل صحَّحت موقفي كلَّه من التدريس. ومنذئذٍ صرتُ أدخلُ الصفَّ والخطةُ معي, لكنها ليست مقدَّسة, وعينيَّ على وجوهِ الطلابِ لا على الورقة. وقد طبَّقتُها فعلًا في مشروعِ المدينة: حين رأيتُ المجموعةَ الأولى تتعثرُ في الكتابةِ وتتسربُ الحيرةُ إلى وجوهها, لم أُكمِل كما هو مكتوب, بل أوقفتُ المهمةَ ورجعنا معًا إلى بنكِ المفردات, ثم عُدنا إلى الكتابة. ولو تشبثتُ بالورقةِ لضاعوا جميعًا, ولخرجوا بإحساسِ فشلٍ جديدٍ لا أريدُه لهم.</w:t>
       </w:r>
     </w:p>
     <w:p>
@@ -2335,7 +2352,7 @@
           <w:sz w:val="26"/>
           <w:rtl w:val="1"/>
         </w:rPr>
-        <w:t>صارت أهدافي أقلَّ عددًا وأوضحَ صياغة, إذ إنَّ هدفًا واحدًا أو اثنين يتحققان خيرٌ من خمسةٍ تبقى حبرًا على ورق. وصرتُ في تنظيمِ مراحلِ الدرسِ أتركُ هامشًا للمرونةِ ولا أملأُ كلَّ دقيقة, لأنَّ الحصةَ المضغوطةَ لا تدعُ للطالبِ مجالًا ليفكر. وفي ملاءمةِ الأنشطةِ صرتُ أفكرُ في أضعفِ طالبٍ أولًا لا في المتوسط, فما يصلحُ له يصلحُ للبقية. وفي التنويعِ صرتُ أمزجُ السمعيَّ والبصريَّ والحركيَّ في الحصةِ الواحدة, لأنَّ الطلابَ لا يتعلمون جميعًا بالطريقةِ نفسها.</w:t>
+        <w:t>تغيَّرت النظرةُ في أربعةِ مواضعَ ملموسة. في اختيارِ الأهداف صارت أقلَّ عددًا وأوضحَ صياغة, إذ إنَّ هدفًا واحدًا أو اثنين يتحققان ويُقاسان خيرٌ من خمسةٍ طموحةٍ تبقى حبرًا على ورق. وفي تنظيمِ مراحلِ الدرسِ صرتُ أتركُ هامشًا للمرونةِ ولا أملأُ كلَّ دقيقة, لأنَّ الحصةَ المضغوطةَ لا تدعُ للطالبِ مجالًا ليفكرَ ولا تدعُ لي مجالًا لأُعدِّل حين يلزمُ التعديل. وفي ملاءمةِ الأنشطةِ صرتُ أفكرُ في أضعفِ طالبٍ أولًا لا في المتوسط, لأنني وجدتُ أنَّ ما أُيسِّرُه للأضعفِ يصلحُ للبقيةِ أيضًا, بينما العكسُ لا يصح. وفي تنويعِ طرقِ التدريسِ صرتُ أمزجُ السمعيَّ والبصريَّ والحركيَّ في الحصةِ الواحدة, بعد أن فهمتُ في المساقِ أنَّ الطلابَ لا يصلون إلى المعنى من بابٍ واحد, وأنَّ تنويعَ المداخلِ ليس رفاهيةً بل شرطٌ لوصولِ أكبرِ عددٍ منهم.</w:t>
       </w:r>
     </w:p>
     <w:p>
@@ -2370,7 +2387,7 @@
           <w:sz w:val="26"/>
           <w:rtl w:val="1"/>
         </w:rPr>
-        <w:t>الأول في إدارةِ الصفِّ والوقت: كنتُ في مطلعِ السنةِ أُنهي الحصةَ لاهثةً دون أن أُتمَّ نصفَ الخطة, فتعلمتُ أن أخطِّطَ لزمنٍ أقلَّ من الحصةِ الفعلية وأتركَ فائضًا, فكفَّ عني الركض. والثاني في بناءِ العلاقةِ مع الطلاب: تعلمتُ أن أُناديَهم بأسمائهم منذ الأسبوعِ الأول وأن أسألَ عن الغائب, وهو تغييرٌ بسيطٌ غيَّر جوَّ الصفِّ كلِّه؛ فالطالبُ الذي تشعرُه بأنك تراه يعودُ إليك.</w:t>
+        <w:t>التغييرُ الأولُ في إدارةِ الصفِّ والوقت. كنتُ في مطلعِ السنةِ أُنهي الحصةَ لاهثةً دون أن أُتمَّ نصفَ الخطة, لأنني كنتُ أقدِّرُ الزمنَ بتفاؤلٍ لا يشبهُ الواقع. فتعلمتُ أن أخطِّطَ لزمنٍ أقلَّ من الحصةِ الفعليةِ وأتركَ فائضًا للطوارئِ وللأسئلة, وأن أضعَ حدًّا زمنيًّا واضحًا لكلِّ مرحلةٍ أُعلنُه للطلاب, فكفَّ عني الركضُ وصار الوقتُ في يدي لا فوقَ رأسي. والتغييرُ الثاني في بناءِ العلاقةِ مع الطلاب. تعلمتُ أن أُناديَهم بأسمائهم منذ الأسبوعِ الأول, وأن أسألَ عن الغائبِ حين يعود, وأن أُلقيَ التحيةَ عند البابِ قبل أن تبدأَ الحصة. تبدو هذه تفاصيلَ صغيرة, لكنها غيَّرت جوَّ الصفِّ كلَّه؛ فالطالبُ الذي تشعرُه بأنك تراه وتذكرُه يعودُ إليك, ويمنحُك من الانتباهِ والاحترامِ ما لا تمنحُه إياه أيُّ قاعدةِ ضبطٍ مكتوبة. أدركتُ في النهايةِ أنَّ إدارةَ الصفِّ ليست ضبطًا للسلوكِ بقدرِ ما هي بناءٌ لعلاقةٍ يجعلُ الضبطَ أقلَّ حاجةً أصلًا.</w:t>
       </w:r>
     </w:p>
     <w:p>

</xml_diff>

<commit_message>
Remove heading separator lines; fix RTL table direction
Co-Authored-By: Claude Opus 4.8 <noreply@anthropic.com>
Claude-Session: https://claude.ai/code/session_01AkgGYV3yP2PQ2xS2ETa6YJ
</commit_message>
<xml_diff>
--- a/ملف_التأمل_المهني_الاستاج.docx
+++ b/ملف_التأمل_المهني_الاستاج.docx
@@ -206,11 +206,8 @@
     <w:p>
       <w:pPr>
         <w:bidi w:val="1"/>
-        <w:spacing w:before="360" w:after="120"/>
+        <w:spacing w:before="400" w:after="160"/>
         <w:jc w:val="right"/>
-        <w:pBdr>
-          <w:bottom w:val="single" w:sz="6" w:space="4" w:color="000000"/>
-        </w:pBdr>
       </w:pPr>
       <w:r>
         <w:rPr>
@@ -278,11 +275,8 @@
     <w:p>
       <w:pPr>
         <w:bidi w:val="1"/>
-        <w:spacing w:before="360" w:after="120"/>
+        <w:spacing w:before="400" w:after="160"/>
         <w:jc w:val="right"/>
-        <w:pBdr>
-          <w:bottom w:val="single" w:sz="6" w:space="4" w:color="000000"/>
-        </w:pBdr>
       </w:pPr>
       <w:r>
         <w:rPr>
@@ -387,10 +381,10 @@
     <w:tbl>
       <w:tblPr>
         <w:tblStyle w:val="TableGrid"/>
+        <w:bidiVisual/>
         <w:tblW w:type="auto" w:w="0"/>
-        <w:jc w:val="center"/>
+        <w:jc w:val="right"/>
         <w:tblLook w:firstColumn="1" w:firstRow="1" w:lastColumn="0" w:lastRow="0" w:noHBand="0" w:noVBand="1" w:val="04A0"/>
-        <w:bidiVisual/>
       </w:tblPr>
       <w:tblGrid>
         <w:gridCol w:w="4873"/>
@@ -724,10 +718,10 @@
     <w:tbl>
       <w:tblPr>
         <w:tblStyle w:val="TableGrid"/>
+        <w:bidiVisual/>
         <w:tblW w:type="auto" w:w="0"/>
-        <w:jc w:val="center"/>
+        <w:jc w:val="right"/>
         <w:tblLook w:firstColumn="1" w:firstRow="1" w:lastColumn="0" w:lastRow="0" w:noHBand="0" w:noVBand="1" w:val="04A0"/>
-        <w:bidiVisual/>
       </w:tblPr>
       <w:tblGrid>
         <w:gridCol w:w="4873"/>
@@ -1061,10 +1055,10 @@
     <w:tbl>
       <w:tblPr>
         <w:tblStyle w:val="TableGrid"/>
+        <w:bidiVisual/>
         <w:tblW w:type="auto" w:w="0"/>
-        <w:jc w:val="center"/>
+        <w:jc w:val="right"/>
         <w:tblLook w:firstColumn="1" w:firstRow="1" w:lastColumn="0" w:lastRow="0" w:noHBand="0" w:noVBand="1" w:val="04A0"/>
-        <w:bidiVisual/>
       </w:tblPr>
       <w:tblGrid>
         <w:gridCol w:w="2436"/>
@@ -1744,11 +1738,8 @@
     <w:p>
       <w:pPr>
         <w:bidi w:val="1"/>
-        <w:spacing w:before="360" w:after="120"/>
+        <w:spacing w:before="400" w:after="160"/>
         <w:jc w:val="right"/>
-        <w:pBdr>
-          <w:bottom w:val="single" w:sz="6" w:space="4" w:color="000000"/>
-        </w:pBdr>
       </w:pPr>
       <w:r>
         <w:rPr>
@@ -1922,11 +1913,8 @@
     <w:p>
       <w:pPr>
         <w:bidi w:val="1"/>
-        <w:spacing w:before="360" w:after="120"/>
+        <w:spacing w:before="400" w:after="160"/>
         <w:jc w:val="right"/>
-        <w:pBdr>
-          <w:bottom w:val="single" w:sz="6" w:space="4" w:color="000000"/>
-        </w:pBdr>
       </w:pPr>
       <w:r>
         <w:rPr>
@@ -2013,10 +2001,10 @@
     <w:tbl>
       <w:tblPr>
         <w:tblStyle w:val="TableGrid"/>
+        <w:bidiVisual/>
         <w:tblW w:type="auto" w:w="0"/>
-        <w:jc w:val="center"/>
+        <w:jc w:val="right"/>
         <w:tblLook w:firstColumn="1" w:firstRow="1" w:lastColumn="0" w:lastRow="0" w:noHBand="0" w:noVBand="1" w:val="04A0"/>
-        <w:bidiVisual/>
       </w:tblPr>
       <w:tblGrid>
         <w:gridCol w:w="4873"/>
@@ -2393,11 +2381,8 @@
     <w:p>
       <w:pPr>
         <w:bidi w:val="1"/>
-        <w:spacing w:before="360" w:after="120"/>
+        <w:spacing w:before="400" w:after="160"/>
         <w:jc w:val="right"/>
-        <w:pBdr>
-          <w:bottom w:val="single" w:sz="6" w:space="4" w:color="000000"/>
-        </w:pBdr>
       </w:pPr>
       <w:r>
         <w:rPr>
@@ -2465,11 +2450,8 @@
     <w:p>
       <w:pPr>
         <w:bidi w:val="1"/>
-        <w:spacing w:before="360" w:after="120"/>
+        <w:spacing w:before="400" w:after="160"/>
         <w:jc w:val="right"/>
-        <w:pBdr>
-          <w:bottom w:val="single" w:sz="6" w:space="4" w:color="000000"/>
-        </w:pBdr>
       </w:pPr>
       <w:r>
         <w:rPr>

</xml_diff>

<commit_message>
Neutralize framing: keep activity purely pedagogical, remove identity/homeland tone
Co-Authored-By: Claude Opus 4.8 <noreply@anthropic.com>
Claude-Session: https://claude.ai/code/session_01AkgGYV3yP2PQ2xS2ETa6YJ
</commit_message>
<xml_diff>
--- a/ملف_التأمل_المهني_الاستاج.docx
+++ b/ملف_التأمل_المهني_الاستاج.docx
@@ -252,7 +252,7 @@
           <w:sz w:val="26"/>
           <w:rtl w:val="1"/>
         </w:rPr>
-        <w:t>لم يكن الأمرُ سهلًا في بدايته. الوقوفُ أمام صفٍّ من المراهقين في مرحلةٍ حساسةٍ من أعمارهم, وتعليمُهم لغةً يشعرُ كثيرٌ منهم أنها غريبةٌ وبعيدةٌ عن عالمهم, وضعني أمام أسئلةٍ لم تكن الكتبُ قد أجابت عنها: كيف أُعيدُ الثقةَ لطالبٍ استسلم؟ كيف أوازنُ بين من يسبقُ ومن يتخلَّف في الصفِّ نفسه؟ متى أتمسكُ بخطتي ومتى أتركُها؟ ومع كلِّ سؤالٍ من هذه كنتُ أتعلمُ شيئًا, أحيانًا من نجاحٍ صغيرٍ وأحيانًا كثيرةً من إخفاق. ولعلَّ أهمَّ ما أدركتُه أنَّ التدريسَ ليس أداءً ننجزُه ثم ننصرف, بل علاقةٌ نبنيها يومًا بعد يوم مع أناسٍ صغارٍ يستحقون أن يُؤخذوا على محملِ الجد.</w:t>
+        <w:t>لم يكن الأمرُ سهلًا في بدايته. الوقوفُ أمام صفٍّ من المراهقين في مرحلةٍ حساسةٍ من أعمارهم, وتعليمُهم لغةً يشعرُ كثيرٌ منهم أنها صعبةٌ وبعيدةٌ عن اهتماماتهم, وضعني أمام أسئلةٍ لم تكن الكتبُ قد أجابت عنها: كيف أُعيدُ الثقةَ لطالبٍ استسلم؟ كيف أوازنُ بين من يسبقُ ومن يتخلَّف في الصفِّ نفسه؟ متى أتمسكُ بخطتي ومتى أتركُها؟ ومع كلِّ سؤالٍ من هذه كنتُ أتعلمُ شيئًا, أحيانًا من نجاحٍ صغيرٍ وأحيانًا كثيرةً من إخفاق. ولعلَّ أهمَّ ما أدركتُه أنَّ التدريسَ ليس أداءً ننجزُه ثم ننصرف, بل علاقةٌ نبنيها يومًا بعد يوم مع أناسٍ صغارٍ يستحقون أن يُؤخذوا على محملِ الجد.</w:t>
       </w:r>
     </w:p>
     <w:p>
@@ -269,7 +269,7 @@
           <w:sz w:val="26"/>
           <w:rtl w:val="1"/>
         </w:rPr>
-        <w:t>يأتي هذا الملفُّ ليكونَ محطةَ توقفٍ أنظرُ فيها إلى الوراء بعينٍ متأملة, لا لأسردَ ما جرى فحسب, بل لأفهمَ كيف تحوَّلتُ خلاله. سأبدأُ بتخطيطِ فعاليةٍ تربويةٍ ذاتِ معنى اخترتُها لأنها تلخِّصُ ما أومنُ به, ثم أقفُ عند أصعبِ تحدٍّ واجهني وكيف انعكس في تلك الفعالية, وأتأملُ بعدها في الأثرِ العميقِ الذي تركته فيَّ المرافقةُ المهنيةُ والمساق, وأختمُ بصياغةِ هويتي المهنيةِ ورؤيتي كما تبلورت فعلًا على أرضِ الصف. هو إذن ليس تقريرًا عن سنة, بل محاولةٌ صادقةٌ لفهمِ المعلمةِ التي صرتُ عليها, والمعلمةِ التي ما زلتُ في الطريقِ إليها.</w:t>
+        <w:t>يأتي هذا الملفُّ ليكونَ محطةَ توقفٍ أنظرُ فيها إلى الوراء بعينٍ متأملة, لا لأسردَ ما جرى فحسب, بل لأفهمَ كيف تحوَّلتُ خلاله. سأبدأُ بتخطيطِ فعاليةٍ تربويةٍ ذاتِ معنى اخترتُها لأنها تلخِّصُ ما أومنُ به في تعليمِ اللغة, ثم أقفُ عند أصعبِ تحدٍّ واجهني وكيف انعكس في تلك الفعالية, وأتأملُ بعدها في الأثرِ العميقِ الذي تركته فيَّ المرافقةُ المهنيةُ والمساق, وأختمُ بصياغةِ هويتي المهنيةِ ورؤيتي كما تبلورت فعلًا على أرضِ الصف. هو إذن ليس تقريرًا عن سنة, بل محاولةٌ صادقةٌ لفهمِ المعلمةِ التي صرتُ عليها, والمعلمةِ التي ما زلتُ في الطريقِ إليها.</w:t>
       </w:r>
     </w:p>
     <w:p>
@@ -322,7 +322,7 @@
           <w:sz w:val="26"/>
           <w:rtl w:val="1"/>
         </w:rPr>
-        <w:t>اخترتُ فعاليةً على هيئةِ مشروعٍ صفيٍّ قصير حمَل عنوان "My City, My Words" (مدينتي بكلماتي). المشروعُ يمتدُّ على ثلاثِ حصص, ينتجُ فيه الطلابُ دليلًا سياحيًّا مصغَّرًا عن مدينتهم شفرعم باللغةِ الإنجليزية: مكانٌ يحبونه, طبقٌ من طعامِ البلد, وشخصٌ من العائلةِ يعرِّفون به. وخطةُ الدرسِ المفصَّلةُ أدناه تخصُّ الحصةَ الأولى من المشروع, وهي حصةُ التقديمِ وجمعِ الأفكارِ والكتابةِ الأولى, إذ إنها الحصةُ التي يُبنى عليها كلُّ ما يليها.</w:t>
+        <w:t>اخترتُ فعاليةً على هيئةِ مشروعٍ صفيٍّ قصير حمَل عنوان "My City, My Words" (مدينتي بكلماتي). المشروعُ يمتدُّ على ثلاثِ حصص, يصفُ فيه الطلابُ باللغةِ الإنجليزيةِ أماكنَ من محيطهم اليومي: مكانٌ يمرُّون به, طريقٌ إلى المدرسة, ساحةٌ يلعبون فيها. وخطةُ الدرسِ المفصَّلةُ أدناه تخصُّ الحصةَ الأولى من المشروع, وهي حصةُ التقديمِ وجمعِ المفرداتِ والكتابةِ الأولى, إذ إنها الحصةُ التي يُبنى عليها كلُّ ما يليها. والغرضُ التعليميُّ من الموضوع أن يمارسَ الطالبُ الوصفَ بالإنجليزيةِ انطلاقًا مما يعرفُه, فتصيرَ اللغةُ أداةً يستعملُها لا مادةً يحفظُها.</w:t>
       </w:r>
     </w:p>
     <w:p>
@@ -508,7 +508,7 @@
                 <w:sz w:val="23"/>
                 <w:rtl w:val="1"/>
               </w:rPr>
-              <w:t>أن يكتبَ الطالبُ فقرةً قصيرةً من أربعِ إلى خمسِ جملٍ يصفُ فيها مكانًا في مدينته موظِّفًا زمنَ المضارعِ البسيطِ وصفاتٍ مناسبة.</w:t>
+              <w:t>أن يكتبَ الطالبُ فقرةً قصيرةً من أربعِ إلى خمسِ جملٍ يصفُ فيها مكانًا يعرفُه موظِّفًا زمنَ المضارعِ البسيطِ وصفاتٍ مناسبة.</w:t>
             </w:r>
           </w:p>
         </w:tc>
@@ -604,7 +604,7 @@
                 <w:sz w:val="23"/>
                 <w:rtl w:val="1"/>
               </w:rPr>
-              <w:t>أن يشعرَ الطالبُ بأنَّ لغته الإنجليزيةَ قادرةٌ على التعبيرِ عن حياتِه هو, لا عن نصوصٍ جاهزةٍ بعيدةٍ عنه.</w:t>
+              <w:t>أن يشعرَ الطالبُ بأنَّ لغته الإنجليزيةَ قادرةٌ على التعبيرِ عن أمورٍ يعرفُها, لا عن نصوصٍ جاهزةٍ بعيدةٍ عنه.</w:t>
             </w:r>
           </w:p>
         </w:tc>
@@ -652,7 +652,7 @@
                 <w:sz w:val="23"/>
                 <w:rtl w:val="1"/>
               </w:rPr>
-              <w:t>أن يعتزَّ الطالبُ بمدينتِه وبقصصِ أهلِه, وأن ينقلَ هذا الاعتزازَ إلى لغةٍ ثانية.</w:t>
+              <w:t>أن يتعاونَ الطالبُ مع مجموعتِه, ويحترمَ دورَ زميلِه وصوتَه في أثناءِ العملِ المشترك.</w:t>
             </w:r>
           </w:p>
         </w:tc>
@@ -675,7 +675,7 @@
                 <w:sz w:val="23"/>
                 <w:rtl w:val="1"/>
               </w:rPr>
-              <w:t>قيمي</w:t>
+              <w:t>قيمي / اجتماعي</w:t>
             </w:r>
           </w:p>
         </w:tc>
@@ -893,7 +893,7 @@
                 <w:sz w:val="23"/>
                 <w:rtl w:val="1"/>
               </w:rPr>
-              <w:t>صورٌ من شفرعم: السوقُ القديم, حارةٌ قديمة, إطلالةٌ على البلد</w:t>
+              <w:t>صورٌ لأماكنَ عامةٍ مألوفة: سوق, شارع, ساحة, حديقة</w:t>
             </w:r>
           </w:p>
         </w:tc>
@@ -916,7 +916,7 @@
                 <w:sz w:val="23"/>
                 <w:rtl w:val="1"/>
               </w:rPr>
-              <w:t>إثارةُ الدافعيةِ وتقريبُ الموضوعِ من واقعِ الطلاب</w:t>
+              <w:t>إثارةُ الدافعيةِ وتقريبُ الموضوعِ من محيطِ الطلابِ اليومي</w:t>
             </w:r>
           </w:p>
         </w:tc>
@@ -941,7 +941,7 @@
                 <w:sz w:val="23"/>
                 <w:rtl w:val="1"/>
               </w:rPr>
-              <w:t>مقطعٌ صوتيٌّ قصيرٌ لشخصٍ يعرِّفُ بمدينتِه بالإنجليزية</w:t>
+              <w:t>مقطعٌ صوتيٌّ قصيرٌ لشخصٍ يصفُ مكانًا بالإنجليزية</w:t>
             </w:r>
           </w:p>
         </w:tc>
@@ -1210,7 +1210,7 @@
                 <w:sz w:val="23"/>
                 <w:rtl w:val="1"/>
               </w:rPr>
-              <w:t>أفتتحُ الحصةَ بسؤالٍ على السبورة: "?If a friend visits Shefar’am for one day, where do you take them". أتيحُ لهم الحديثَ بالعربيةِ أولًا حتى أفتحَ البابَ دون خوف, ثم أدوِّنُ الأماكنَ التي يذكرونها بالإنجليزيةِ على اللوح, فيتكوَّنُ بنكُ مفرداتٍ نابعٌ منهم لا منّي.</w:t>
+              <w:t>أفتتحُ الحصةَ بسؤالٍ على السبورة: "?What is a place you pass by every day". أتيحُ لهم الحديثَ بالعربيةِ أولًا حتى أفتحَ البابَ دون خوف, ثم أدوِّنُ الأماكنَ التي يذكرونها بالإنجليزيةِ على اللوح, فيتكوَّنُ بنكُ مفرداتٍ نابعٌ منهم لا منّي.</w:t>
             </w:r>
           </w:p>
         </w:tc>
@@ -1256,7 +1256,7 @@
                 <w:sz w:val="23"/>
                 <w:rtl w:val="1"/>
               </w:rPr>
-              <w:t>السبورة, صورٌ من البلد</w:t>
+              <w:t>السبورة, صورٌ لأماكن</w:t>
             </w:r>
           </w:p>
         </w:tc>
@@ -1404,7 +1404,7 @@
                 <w:sz w:val="23"/>
                 <w:rtl w:val="1"/>
               </w:rPr>
-              <w:t>أوزِّعُ بطاقاتِ المفردات, ونربطُ كلَّ مفردةٍ بصورةٍ من صورِ المدينة, ثم نلعبُ لعبةً سريعة: أنطقُ الصفةَ فيرفعون الصورةَ المناسبة.</w:t>
+              <w:t>أوزِّعُ بطاقاتِ المفردات, ونربطُ كلَّ مفردةٍ بصورةٍ مناسبة, ثم نلعبُ لعبةً سريعة: أنطقُ الصفةَ فيرفعون الصورةَ المناسبة.</w:t>
             </w:r>
           </w:p>
         </w:tc>
@@ -1598,7 +1598,7 @@
                 <w:sz w:val="23"/>
                 <w:rtl w:val="1"/>
               </w:rPr>
-              <w:t>تقرأُ كلُّ مجموعةٍ جملةً أو جملتين من فقرتها بصوتٍ عالٍ. لا أطلبُ الكمالَ بل المحاولة. أختمُ بسؤالٍ واحد: "ما أصعبُ كلمةٍ شعرتَ بها اليوم, وما أجملُ مكانٍ توصلتم إليه؟", وأدوِّنُ ملاحظةً سريعةً عن كلِّ مجموعةٍ لأبنيَ عليها في الحصةِ التالية.</w:t>
+              <w:t>تقرأُ كلُّ مجموعةٍ جملةً أو جملتين من فقرتها بصوتٍ عالٍ. لا أطلبُ الكمالَ بل المحاولة. أختمُ بسؤالٍ واحد: "ما أصعبُ كلمةٍ شعرتَ بها اليوم, وما الجملةُ التي أعجبتك؟", وأدوِّنُ ملاحظةً سريعةً عن كلِّ مجموعةٍ لأبنيَ عليها في الحصةِ التالية.</w:t>
             </w:r>
           </w:p>
         </w:tc>
@@ -1698,7 +1698,7 @@
           <w:sz w:val="26"/>
           <w:rtl w:val="1"/>
         </w:rPr>
-        <w:t>اخترتُ هذا الموضوعَ تحديدًا لأنني لاحظتُ أمرًا بسيطًا لكنه مقلق: كثيرٌ من طلابي يتعاملون مع الإنجليزيةِ كأنها مادةٌ منفصلةٌ عن حياتهم, شيءٌ يخصُّ الامتحانَ فحسب. أردتُ أن أقرِّبَ اللغةَ من واقعهم؛ فحين يكونُ الموضوعُ مدينتَهم هم, يصعبُ عليهم أن يقولوا إنَّ هذا لا يعنيهم.</w:t>
+        <w:t>اخترتُ هذا الموضوعَ تحديدًا لأنني لاحظتُ أمرًا بسيطًا لكنه مقلق: كثيرٌ من طلابي يتعاملون مع الإنجليزيةِ كأنها مادةٌ منفصلةٌ عن حياتهم, شيءٌ يخصُّ الامتحانَ فحسب. أردتُ أن أقرِّبَ اللغةَ من خبرتهم اليومية؛ فحين يكونُ الموضوعُ شيئًا يعرفُه الطالبُ ويراه كلَّ يوم, يسهلُ عليه أن يجدَ ما يقولُه, ويقلُّ خوفُه من الكتابة.</w:t>
       </w:r>
     </w:p>
     <w:p>
@@ -1715,7 +1715,7 @@
           <w:sz w:val="26"/>
           <w:rtl w:val="1"/>
         </w:rPr>
-        <w:t>أما الاعتباراتُ التي أثَّرت في قراري فكانت في مقدمتها الفروقُ الفردية. أدركُ أنَّ لديَّ طلابًا لا يقدرون على كتابةِ فقرةٍ بمفردهم, فبنيتُ المشروعَ على مجموعاتٍ وأدوارٍ يشاركُ فيها كلٌّ على قدرِه دون أن يشعرَ أحدٌ بالعجز. ثم جاء الاعتبارُ القيمي: أردتُ لهم أن يعتزوا بأنفسهم وببلدهم وهم يتعلمون لغةً ثانية, لا أن يشعروا بأنَّ الإنجليزيةَ تُلغي هويتهم. وثمة اعتبارٌ عمليٌّ ثالث, هو محدوديةُ زمنِ الحصة, فآثرتُ هدفًا لغويًّا واحدًا واضحًا على أهدافٍ كثيرةٍ متعجلة.</w:t>
+        <w:t>أما الاعتباراتُ التي أثَّرت في قراري فكانت في مقدمتها الفروقُ الفردية. أدركُ أنَّ لديَّ طلابًا لا يقدرون على كتابةِ فقرةٍ بمفردهم, فبنيتُ المشروعَ على مجموعاتٍ وأدوارٍ يشاركُ فيها كلٌّ على قدرِه دون أن يشعرَ أحدٌ بالعجز. ثم جاء الاعتبارُ المرتبطُ بالدافعية: أردتُ أن يشعرَ كلُّ طالبٍ أنَّ ما يكتبُه قريبٌ منه وفي متناولِه, فيزدادَ إقبالُه على المحاولة. وثمة اعتبارٌ عمليٌّ ثالث, هو محدوديةُ زمنِ الحصة, فآثرتُ هدفًا لغويًّا واحدًا واضحًا على أهدافٍ كثيرةٍ متعجلة.</w:t>
       </w:r>
     </w:p>
     <w:p>
@@ -1732,7 +1732,7 @@
           <w:sz w:val="26"/>
           <w:rtl w:val="1"/>
         </w:rPr>
-        <w:t>وأما مصدرُ الفكرة فموقفٌ صغيرٌ لا أنساه. كنتُ أشرحُ نصًّا عن مدينةٍ أجنبيةٍ في الكتاب, فقال لي طالبٌ بعفوية: "مِس, لماذا دائمًا مدنٌ في الخارج؟ ألا مدينةَ لنا؟". ظلَّت جملتُه في ذهني, وشعرتُ أنه محق. ثم التقت هذه الملاحظةُ الميدانيةُ بما درسناه في المساق عن التعلُّمِ ذي المعنى (meaningful learning), وأنَّ المتعلمَ يتعلمُ أعمقَ حين يربطُ المادةَ بواقعِه المعيش. فأردتُ أن أجرِّبَ هذا المبدأ عمليًّا, لا أن يبقى سطرًا نظريًّا في دفتري.</w:t>
+        <w:t>وأما مصدرُ الفكرة فجاء من ملاحظةٍ صفيةٍ متكررة: كلما كان النصُّ في الكتابِ بعيدًا عن خبرةِ الطلابِ فترَ تفاعلُهم, وكلما اقتربَ مما يعرفونه ازدادَ انخراطُهم. لمستُ ذلك بوضوحٍ حين قارنتُ حصةً عن موضوعٍ مجردٍ بحصةٍ طلبتُ فيها أن يصفوا شيئًا من محيطهم المألوف, فكان الفرقُ في المشاركةِ واضحًا. ثم التقت هذه الملاحظةُ الميدانيةُ بما درسناه في المساق عن التعلُّمِ ذي المعنى (meaningful learning), وأنَّ المتعلمَ يتعلمُ أعمقَ حين يربطُ المادةَ بما يعرفُه ويعيشُه. فأردتُ أن أجرِّبَ هذا المبدأ عمليًّا, لا أن يبقى سطرًا نظريًّا في دفتري.</w:t>
       </w:r>
     </w:p>
     <w:p>
@@ -1872,7 +1872,7 @@
           <w:sz w:val="26"/>
           <w:rtl w:val="1"/>
         </w:rPr>
-        <w:t>مشروعُ "مدينتي بكلماتي" هو حرفيًّا ردِّي على هذا التحدي. اخترتُ موضوعًا يعرفُه الطالبُ ويقدرُ على الحديثِ عنه مهما ضعُفت إنجليزيتُه, لأنه يتحدثُ عن بلده. وبنيتُ المشروعَ على مجموعاتٍ وأدوار كي يجدَ الطالبُ الضعيفُ لنفسِه موضعًا. وجعلتُ خاتمةَ الحصةِ "جرِّبوا فحسب" لا "تكلموا بصواب", حتى أكسرَ الخوفَ من الخطأ. غايتي أن يخرجَ كلُّ طالبٍ من الحصةِ شاعرًا بأنه نجح في شيء, وإن كان صغيرًا. وقد وجَّهني في التخطيطِ اعتبارٌ حرِصتُ عليه: خشيتُ أن يستحوذَ الطلابُ الأقوى على العملِ فيُهمَّشَ الأضعف, فوزَّعتُ الأدوارَ بنفسي ولم أتركها للصدفة, وجعلتُ في دورِ "المحرِّر" تحديًا يليقُ بالقوي.</w:t>
+        <w:t>مشروعُ "مدينتي بكلماتي" هو حرفيًّا ردِّي على هذا التحدي. اخترتُ موضوعًا يعرفُه الطالبُ ويقدرُ على الحديثِ عنه مهما ضعُفت إنجليزيتُه, لأنه يتحدثُ عمّا يراه ويعرفُه. وبنيتُ المشروعَ على مجموعاتٍ وأدوار كي يجدَ الطالبُ الضعيفُ لنفسِه موضعًا. وجعلتُ خاتمةَ الحصةِ "جرِّبوا فحسب" لا "تكلموا بصواب", حتى أكسرَ الخوفَ من الخطأ. غايتي أن يخرجَ كلُّ طالبٍ من الحصةِ شاعرًا بأنه نجح في شيء, وإن كان صغيرًا. وقد وجَّهني في التخطيطِ اعتبارٌ حرِصتُ عليه: خشيتُ أن يستحوذَ الطلابُ الأقوى على العملِ فيُهمَّشَ الأضعف, فوزَّعتُ الأدوارَ بنفسي ولم أتركها للصدفة, وجعلتُ في دورِ "المحرِّر" تحديًا يليقُ بالقوي.</w:t>
       </w:r>
     </w:p>
     <w:p>
@@ -2427,7 +2427,7 @@
           <w:sz w:val="26"/>
           <w:rtl w:val="1"/>
         </w:rPr>
-        <w:t>وانطلاقًا من هذا الأساس, صار واضحًا لي ما الذي أريدُ أن أنمِّيَه في طلابي فعلًا. قبل أيِّ مهارةٍ لغوية, أريدُهم أن يخرجوا من صفي غيرَ خائفين من الخطأ, لأنَّ الخطأَ عندي محطةٌ في التعلمِ لا عيبٌ يُستحى منه, وقد رأيتُ بعينيَّ كيف يشلُّ الخوفُ من الخطأ طالبًا كاملًا فيصمتُ خشيةَ أن يُخطئ. ثم أريدُهم قادرين على التعبيرِ عن رأيهم بثقة, ولو بلغةٍ بسيطة, وأن يتعوَّدوا التعاونَ واحترامَ صوتِ زميلِهم في أثناءِ العمل؛ فالمهارةُ اللغويةُ تأتي مع الوقت, أما الجرأةُ على المحاولةِ فهي الأرضُ التي يُزرَعُ فيها كلُّ شيءٍ بعدها. ولأنَّ هذا ما أريدُ أن أزرعَه, صرتُ أعرفُ أيَّ معلمةٍ أطمحُ أن أكون: معلمةً مُصغيةً وممكِّنة. مُصغيةً لأنني اختبرتُ بنفسي كيف يتغيرُ الطالبُ حين يشعرُ أنَّ ثمة من يسمعُه حقًّا, وممكِّنةً لأنني لا أريدُ أن أبقى مصدرَ كلِّ شيء, بل أن أمنحَه الأدواتِ ثم أراه ينطلقُ بها وحده. أنجحُ حصةٍ عندي تلك التي يخرجُ منها الطالبُ شاعرًا بأنه هو من أنجز, لا أنا, لأنني في النهايةِ أربّي إنسانًا مستقلًّا لا أُلقِّنُ مادةً وحسب.</w:t>
+        <w:t>وانطلاقًا من هذا الأساس, صار واضحًا لي ما الذي أريدُ أن أنمِّيَه في طلابي فعلًا. قبل أيِّ مهارةٍ لغوية, أريدُهم أن يخرجوا من صفي غيرَ خائفين من الخطأ, لأنَّ الخطأَ عندي محطةٌ في التعلمِ لا عيبٌ يُستحى منه, وقد رأيتُ بعينيَّ كيف يشلُّ الخوفُ من الخطأ طالبًا كاملًا فيصمتُ خشيةَ أن يُخطئ. ثم أريدُهم قادرين على التعبيرِ عن رأيهم بثقة, ولو بلغةٍ بسيطة, وأن يتعوَّدوا التعاونَ واحترامَ صوتِ زميلِهم في أثناءِ العمل؛ فالمهارةُ اللغويةُ تأتي مع الوقت, أما الجرأةُ على المحاولةِ فهي الأرضُ التي يُزرَعُ فيها كلُّ شيءٍ بعدها. ولأنَّ هذا ما أريدُ أن أزرعَه, صرتُ أعرفُ أيَّ معلمةٍ أطمحُ أن أكون: معلمةً مُصغيةً وممكِّنة. مُصغيةً لأنني اختبرتُ بنفسي كيف يتغيرُ الطالبُ حين يشعرُ أنَّ ثمة من يسمعُه حقًّا, وممكِّنةً لأنني لا أريدُ أن أبقى مصدرَ كلِّ شيء, بل أن أمنحَه الأدواتِ ثم أراه ينطلقُ بها وحده. أنجحُ حصةٍ عندي تلك التي يخرجُ منها الطالبُ شاعرًا بأنه هو من أنجز, لا أنا, لأنني في النهايةِ أُنمّي متعلمًا مستقلًّا لا أُلقِّنُ مادةً وحسب.</w:t>
       </w:r>
     </w:p>
     <w:p>

</xml_diff>

<commit_message>
Apply humanizer RTL/punctuation rules: unvocalized text, Arabic commas, no dashes
Co-Authored-By: Claude Opus 4.8 <noreply@anthropic.com>
Claude-Session: https://claude.ai/code/session_01AkgGYV3yP2PQ2xS2ETa6YJ
</commit_message>
<xml_diff>
--- a/ملف_التأمل_المهني_الاستاج.docx
+++ b/ملف_التأمل_المهني_الاستاج.docx
@@ -21,7 +21,7 @@
           <w:bCs/>
           <w:rtl w:val="1"/>
         </w:rPr>
-        <w:t>مِلَفُّ التَّأمُّلِ والتَّطوُّرِ المِهَنيِّ</w:t>
+        <w:t>ملف التأمل والتطور المهني</w:t>
       </w:r>
     </w:p>
     <w:p>
@@ -38,7 +38,7 @@
           <w:sz w:val="30"/>
           <w:rtl w:val="1"/>
         </w:rPr>
-        <w:t>مسارُ سنةِ الاستاج في تعليمِ اللغةِ الإنجليزية</w:t>
+        <w:t>مسار سنة الاستاج في تعليم اللغة الإنجليزية</w:t>
       </w:r>
     </w:p>
     <w:p>
@@ -66,7 +66,7 @@
           <w:sz w:val="26"/>
           <w:rtl w:val="1"/>
         </w:rPr>
-        <w:t xml:space="preserve"> تعليمُ اللغةِ الإنجليزية – المرحلةُ الإعدادية</w:t>
+        <w:t xml:space="preserve"> تعليم اللغة الإنجليزية للمرحلة الإعدادية</w:t>
       </w:r>
     </w:p>
     <w:p>
@@ -94,7 +94,7 @@
           <w:sz w:val="26"/>
           <w:rtl w:val="1"/>
         </w:rPr>
-        <w:t xml:space="preserve"> الإعداديةُ الشاملةُ (أ) شفرعم، على اسمِ الشيخِ صالح خنيفس</w:t>
+        <w:t xml:space="preserve"> الإعدادية الشاملة (أ) شفرعم، على اسم الشيخ صالح خنيفس</w:t>
       </w:r>
     </w:p>
     <w:p>
@@ -122,7 +122,7 @@
           <w:sz w:val="26"/>
           <w:rtl w:val="1"/>
         </w:rPr>
-        <w:t xml:space="preserve"> شفرعم – الشمال</w:t>
+        <w:t xml:space="preserve"> شفرعم، في الشمال</w:t>
       </w:r>
     </w:p>
     <w:p>
@@ -150,7 +150,7 @@
           <w:sz w:val="26"/>
           <w:rtl w:val="1"/>
         </w:rPr>
-        <w:t xml:space="preserve"> مدرسةٌ إعدادية</w:t>
+        <w:t xml:space="preserve"> مدرسة إعدادية</w:t>
       </w:r>
     </w:p>
     <w:p>
@@ -168,7 +168,7 @@
           <w:bCs/>
           <w:rtl w:val="1"/>
         </w:rPr>
-        <w:t>نوعُ التقديم:</w:t>
+        <w:t>نوع التقديم:</w:t>
       </w:r>
       <w:r>
         <w:rPr>
@@ -178,7 +178,7 @@
           <w:sz w:val="26"/>
           <w:rtl w:val="1"/>
         </w:rPr>
-        <w:t xml:space="preserve"> ملفُّ تأمُّلٍ في سنةِ الاستاج (ضمن سِدنةِ الاستاج)</w:t>
+        <w:t xml:space="preserve"> ملف تأمل في سنة الاستاج، ضمن سدنة الاستاج</w:t>
       </w:r>
     </w:p>
     <w:p>
@@ -195,7 +195,7 @@
           <w:sz w:val="24"/>
           <w:rtl w:val="1"/>
         </w:rPr>
-        <w:t>السنةُ الدراسية: 2025 – 2026</w:t>
+        <w:t>العام الدراسي 2025-2026</w:t>
       </w:r>
     </w:p>
     <w:p>
@@ -235,7 +235,7 @@
           <w:sz w:val="26"/>
           <w:rtl w:val="1"/>
         </w:rPr>
-        <w:t>يُقالُ إنَّ المرءَ لا يعرفُ معنى مهنةٍ ما حتى يمارسَها, وأنا لم أُدرك كم أنَّ هذا صحيحٌ إلا في سنةِ الاستاج. جئتُ إلى الصفِّ محمَّلةً بما درستُه من نظرياتٍ عن التعلمِ والتقييمِ وإدارةِ الصف, وكنتُ أظنُّ أنَّ المعرفةَ وحدها كافية. لكنَّ أولَ حصةٍ حقيقيةٍ ذكَّرتني بأنَّ بين ما نعرفُه وما نفعلُه مسافةً لا تُقطعُ إلا بالممارسةِ والخطأ والتأمل. هكذا صارت هذه السنةُ, في تعليمِ اللغةِ الإنجليزيةِ في مدرسةٍ إعداديةٍ في شفرعم, أشبهَ بورشةٍ طويلةٍ أعدتُ فيها تشكيلَ صورتي عن نفسي معلمة.</w:t>
+        <w:t>يقال إن المرء لا يعرف معنى مهنة ما حتى يمارسها، وأنا لم أدرك كم أن هذا صحيح إلا في سنة الاستاج. جئت إلى الصف محملة بما درسته من نظريات عن التعلم والتقييم وإدارة الصف، وكنت أظن أن المعرفة وحدها كافية. لكن أول حصة حقيقية ذكرتني بأن بين ما نعرفه وما نفعله مسافة لا تقطع إلا بالممارسة والخطأ والتأمل. هكذا صارت هذه السنة، في تعليم اللغة الإنجليزية في مدرسة إعدادية في شفرعم، أشبه بورشة طويلة أعدت فيها تشكيل صورتي عن نفسي معلمة.</w:t>
       </w:r>
     </w:p>
     <w:p>
@@ -252,7 +252,7 @@
           <w:sz w:val="26"/>
           <w:rtl w:val="1"/>
         </w:rPr>
-        <w:t>لم يكن الأمرُ سهلًا في بدايته. الوقوفُ أمام صفٍّ من المراهقين في مرحلةٍ حساسةٍ من أعمارهم, وتعليمُهم لغةً يشعرُ كثيرٌ منهم أنها صعبةٌ وبعيدةٌ عن اهتماماتهم, وضعني أمام أسئلةٍ لم تكن الكتبُ قد أجابت عنها: كيف أُعيدُ الثقةَ لطالبٍ استسلم؟ كيف أوازنُ بين من يسبقُ ومن يتخلَّف في الصفِّ نفسه؟ متى أتمسكُ بخطتي ومتى أتركُها؟ ومع كلِّ سؤالٍ من هذه كنتُ أتعلمُ شيئًا, أحيانًا من نجاحٍ صغيرٍ وأحيانًا كثيرةً من إخفاق. ولعلَّ أهمَّ ما أدركتُه أنَّ التدريسَ ليس أداءً ننجزُه ثم ننصرف, بل علاقةٌ نبنيها يومًا بعد يوم مع أناسٍ صغارٍ يستحقون أن يُؤخذوا على محملِ الجد.</w:t>
+        <w:t>لم يكن الأمر سهلا في بدايته. الوقوف أمام صف من المراهقين في مرحلة حساسة من أعمارهم، وتعليمهم لغة يشعر كثير منهم أنها صعبة وبعيدة عن اهتماماتهم، وضعني أمام أسئلة لم تكن الكتب قد أجابت عنها: كيف أعيد الثقة لطالب استسلم؟ كيف أوازن بين من يسبق ومن يتخلف في الصف نفسه؟ متى أتمسك بخطتي ومتى أتركها؟ ومع كل سؤال من هذه كنت أتعلم شيئا، أحيانا من نجاح صغير وأحيانا كثيرة من إخفاق. ولعل أهم ما أدركته أن التدريس ليس أداء ننجزه ثم ننصرف، بل علاقة نبنيها يوما بعد يوم مع أناس صغار يستحقون أن يؤخذوا على محمل الجد.</w:t>
       </w:r>
     </w:p>
     <w:p>
@@ -269,7 +269,7 @@
           <w:sz w:val="26"/>
           <w:rtl w:val="1"/>
         </w:rPr>
-        <w:t>يأتي هذا الملفُّ ليكونَ محطةَ توقفٍ أنظرُ فيها إلى الوراء بعينٍ متأملة, لا لأسردَ ما جرى فحسب, بل لأفهمَ كيف تحوَّلتُ خلاله. سأبدأُ بتخطيطِ فعاليةٍ تربويةٍ ذاتِ معنى اخترتُها لأنها تلخِّصُ ما أومنُ به في تعليمِ اللغة, ثم أقفُ عند أصعبِ تحدٍّ واجهني وكيف انعكس في تلك الفعالية, وأتأملُ بعدها في الأثرِ العميقِ الذي تركته فيَّ المرافقةُ المهنيةُ والمساق, وأختمُ بصياغةِ هويتي المهنيةِ ورؤيتي كما تبلورت فعلًا على أرضِ الصف. هو إذن ليس تقريرًا عن سنة, بل محاولةٌ صادقةٌ لفهمِ المعلمةِ التي صرتُ عليها, والمعلمةِ التي ما زلتُ في الطريقِ إليها.</w:t>
+        <w:t>يأتي هذا الملف ليكون محطة توقف أنظر فيها إلى الوراء بعين متأملة، لا لأسرد ما جرى فحسب، بل لأفهم كيف تحولت خلاله. سأبدأ بتخطيط فعالية تربوية ذات معنى اخترتها لأنها تلخص ما أومن به في تعليم اللغة، ثم أقف عند أصعب تحد واجهني وكيف انعكس في تلك الفعالية، وأتأمل بعدها في الأثر العميق الذي تركته في المرافقة المهنية والمساق، وأختم بصياغة هويتي المهنية ورؤيتي كما تبلورت فعلا على أرض الصف. هو إذن ليس تقريرا عن سنة، بل محاولة صادقة لفهم المعلمة التي صرت عليها، والمعلمة التي ما زلت في الطريق إليها.</w:t>
       </w:r>
     </w:p>
     <w:p>
@@ -287,7 +287,7 @@
           <w:bCs/>
           <w:rtl w:val="1"/>
         </w:rPr>
-        <w:t>أولًا: تخطيطُ الفعاليةِ التربويةِ وخطةُ الدرس</w:t>
+        <w:t>أولا: تخطيط الفعالية التربوية وخطة الدرس</w:t>
       </w:r>
     </w:p>
     <w:p>
@@ -305,7 +305,7 @@
           <w:bCs/>
           <w:rtl w:val="1"/>
         </w:rPr>
-        <w:t>اسمُ الفعاليةِ وموضوعُ الدرس</w:t>
+        <w:t>اسم الفعالية وموضوع الدرس</w:t>
       </w:r>
     </w:p>
     <w:p>
@@ -322,7 +322,7 @@
           <w:sz w:val="26"/>
           <w:rtl w:val="1"/>
         </w:rPr>
-        <w:t>اخترتُ فعاليةً على هيئةِ مشروعٍ صفيٍّ قصير حمَل عنوان "My City, My Words" (مدينتي بكلماتي). المشروعُ يمتدُّ على ثلاثِ حصص, يصفُ فيه الطلابُ باللغةِ الإنجليزيةِ أماكنَ من محيطهم اليومي: مكانٌ يمرُّون به, طريقٌ إلى المدرسة, ساحةٌ يلعبون فيها. وخطةُ الدرسِ المفصَّلةُ أدناه تخصُّ الحصةَ الأولى من المشروع, وهي حصةُ التقديمِ وجمعِ المفرداتِ والكتابةِ الأولى, إذ إنها الحصةُ التي يُبنى عليها كلُّ ما يليها. والغرضُ التعليميُّ من الموضوع أن يمارسَ الطالبُ الوصفَ بالإنجليزيةِ انطلاقًا مما يعرفُه, فتصيرَ اللغةُ أداةً يستعملُها لا مادةً يحفظُها.</w:t>
+        <w:t>اخترت فعالية على هيئة مشروع صفي قصير حمل عنوان "My City, My Words" (مدينتي بكلماتي). المشروع يمتد على ثلاث حصص، يصف فيه الطلاب باللغة الإنجليزية أماكن من محيطهم اليومي: مكان يمرون به، أو ساحة يلعبون فيها. وخطة الدرس المفصلة أدناه تخص الحصة الأولى من المشروع، وهي حصة التقديم وجمع المفردات والكتابة الأولى، إذ إنها الحصة التي يبنى عليها كل ما يليها. والغرض التعليمي من الموضوع أن يمارس الطالب الوصف بالإنجليزية انطلاقا مما يعرفه، فتصير اللغة أداة يستعملها لا مادة يحفظها.</w:t>
       </w:r>
     </w:p>
     <w:p>
@@ -340,7 +340,7 @@
           <w:bCs/>
           <w:rtl w:val="1"/>
         </w:rPr>
-        <w:t>الصفُّ المستهدَف</w:t>
+        <w:t>الصف المستهدف</w:t>
       </w:r>
     </w:p>
     <w:p>
@@ -357,7 +357,7 @@
           <w:sz w:val="26"/>
           <w:rtl w:val="1"/>
         </w:rPr>
-        <w:t>الصفُّ الثامن, مجموعةٌ من ثمانيةٍ وعشرين طالبًا وطالبة. المستوياتُ في هذا الصفِّ متفاوتةٌ إلى حدٍّ بعيد؛ فمنهم من يقرأُ ويكتبُ بثقة, ومنهم من ما زال يتعثرُ في تركيبِ جملةٍ بسيطة. هذه الفجوةُ بالذات كانت حاضرةً في ذهني في كلِّ سطرٍ من التخطيط, ووجَّهت قراري في تقسيمِ العملِ وتوزيعِ الأدوار.</w:t>
+        <w:t>الصف الثامن، مجموعة من ثمانية وعشرين طالبا وطالبة. المستويات في هذا الصف متفاوتة إلى حد بعيد، فمنهم من يقرأ ويكتب بثقة، ومنهم من ما زال يتعثر في تركيب جملة بسيطة. هذه الفجوة بالذات كانت حاضرة في ذهني في كل سطر من التخطيط، ووجهت قراري في تقسيم العمل وتوزيع الأدوار.</w:t>
       </w:r>
     </w:p>
     <w:p>
@@ -375,7 +375,7 @@
           <w:bCs/>
           <w:rtl w:val="1"/>
         </w:rPr>
-        <w:t>الأهدافُ التعليميةُ والقيمية</w:t>
+        <w:t>الأهداف التعليمية والقيمية</w:t>
       </w:r>
     </w:p>
     <w:tbl>
@@ -435,7 +435,7 @@
                 <w:bCs/>
                 <w:rtl w:val="1"/>
               </w:rPr>
-              <w:t>نوعُ الهدف</w:t>
+              <w:t>نوع الهدف</w:t>
             </w:r>
           </w:p>
         </w:tc>
@@ -460,7 +460,7 @@
                 <w:sz w:val="23"/>
                 <w:rtl w:val="1"/>
               </w:rPr>
-              <w:t>أن يوظِّفَ الطالبُ ما بين ثماني وعشرِ مفرداتٍ جديدةٍ مرتبطةٍ بوصفِ الأماكن مثل: crowded, ancient, peaceful, market, view.</w:t>
+              <w:t>أن يوظف الطالب ما بين ثماني وعشر مفردات جديدة مرتبطة بوصف الأماكن مثل: crowded, ancient, peaceful, market, view.</w:t>
             </w:r>
           </w:p>
         </w:tc>
@@ -508,7 +508,7 @@
                 <w:sz w:val="23"/>
                 <w:rtl w:val="1"/>
               </w:rPr>
-              <w:t>أن يكتبَ الطالبُ فقرةً قصيرةً من أربعِ إلى خمسِ جملٍ يصفُ فيها مكانًا يعرفُه موظِّفًا زمنَ المضارعِ البسيطِ وصفاتٍ مناسبة.</w:t>
+              <w:t>أن يكتب الطالب فقرة قصيرة من أربع إلى خمس جمل يصف فيها مكانا يعرفه موظفا زمن المضارع البسيط وصفات مناسبة.</w:t>
             </w:r>
           </w:p>
         </w:tc>
@@ -556,7 +556,7 @@
                 <w:sz w:val="23"/>
                 <w:rtl w:val="1"/>
               </w:rPr>
-              <w:t>أن يعرضَ الطالبُ فكرته شفويًّا بجملةٍ أو جملتين أمام مجموعتِه الصغيرة.</w:t>
+              <w:t>أن يعرض الطالب فكرته شفويا بجملة أو جملتين أمام مجموعته الصغيرة.</w:t>
             </w:r>
           </w:p>
         </w:tc>
@@ -604,7 +604,7 @@
                 <w:sz w:val="23"/>
                 <w:rtl w:val="1"/>
               </w:rPr>
-              <w:t>أن يشعرَ الطالبُ بأنَّ لغته الإنجليزيةَ قادرةٌ على التعبيرِ عن أمورٍ يعرفُها, لا عن نصوصٍ جاهزةٍ بعيدةٍ عنه.</w:t>
+              <w:t>أن يشعر الطالب بأن لغته الإنجليزية قادرة على التعبير عن أمور يعرفها، لا عن نصوص جاهزة بعيدة عنه.</w:t>
             </w:r>
           </w:p>
         </w:tc>
@@ -652,7 +652,7 @@
                 <w:sz w:val="23"/>
                 <w:rtl w:val="1"/>
               </w:rPr>
-              <w:t>أن يتعاونَ الطالبُ مع مجموعتِه, ويحترمَ دورَ زميلِه وصوتَه في أثناءِ العملِ المشترك.</w:t>
+              <w:t>أن يتعاون الطالب مع مجموعته، ويحترم دور زميله وصوته في أثناء العمل المشترك.</w:t>
             </w:r>
           </w:p>
         </w:tc>
@@ -712,7 +712,7 @@
           <w:bCs/>
           <w:rtl w:val="1"/>
         </w:rPr>
-        <w:t>الموادُّ والوسائلُ التعليمية</w:t>
+        <w:t>المواد والوسائل التعليمية</w:t>
       </w:r>
     </w:p>
     <w:tbl>
@@ -772,7 +772,7 @@
                 <w:bCs/>
                 <w:rtl w:val="1"/>
               </w:rPr>
-              <w:t>الغرضُ منها</w:t>
+              <w:t>الغرض منها</w:t>
             </w:r>
           </w:p>
         </w:tc>
@@ -797,7 +797,7 @@
                 <w:sz w:val="23"/>
                 <w:rtl w:val="1"/>
               </w:rPr>
-              <w:t>بطاقاتُ مفرداتٍ مصوَّرةٌ عن الأماكنِ والأوصاف</w:t>
+              <w:t>بطاقات مفردات مصورة عن الأماكن والأوصاف</w:t>
             </w:r>
           </w:p>
         </w:tc>
@@ -820,7 +820,7 @@
                 <w:sz w:val="23"/>
                 <w:rtl w:val="1"/>
               </w:rPr>
-              <w:t>ربطُ المفردةِ بصورةٍ محسوسةٍ لترسيخِها لدى المتعلمِ البصري</w:t>
+              <w:t>ربط المفردة بصورة محسوسة لترسيخها لدى المتعلم البصري</w:t>
             </w:r>
           </w:p>
         </w:tc>
@@ -845,7 +845,7 @@
                 <w:sz w:val="23"/>
                 <w:rtl w:val="1"/>
               </w:rPr>
-              <w:t>ورقةُ عملٍ فيها هيكلُ الفقرةِ وبداياتُ جملٍ جاهزة</w:t>
+              <w:t>ورقة عمل فيها هيكل الفقرة وبدايات جمل جاهزة</w:t>
             </w:r>
           </w:p>
         </w:tc>
@@ -868,7 +868,7 @@
                 <w:sz w:val="23"/>
                 <w:rtl w:val="1"/>
               </w:rPr>
-              <w:t>إسنادُ الطالبِ الأضعفِ حتى لا يبدأَ الكتابةَ من فراغ</w:t>
+              <w:t>إسناد الطالب الأضعف حتى لا يبدأ الكتابة من فراغ</w:t>
             </w:r>
           </w:p>
         </w:tc>
@@ -893,7 +893,7 @@
                 <w:sz w:val="23"/>
                 <w:rtl w:val="1"/>
               </w:rPr>
-              <w:t>صورٌ لأماكنَ عامةٍ مألوفة: سوق, شارع, ساحة, حديقة</w:t>
+              <w:t>صور لأماكن عامة مألوفة: سوق، شارع، ساحة، حديقة</w:t>
             </w:r>
           </w:p>
         </w:tc>
@@ -916,7 +916,7 @@
                 <w:sz w:val="23"/>
                 <w:rtl w:val="1"/>
               </w:rPr>
-              <w:t>إثارةُ الدافعيةِ وتقريبُ الموضوعِ من محيطِ الطلابِ اليومي</w:t>
+              <w:t>إثارة الدافعية وتقريب الموضوع من محيط الطلاب اليومي</w:t>
             </w:r>
           </w:p>
         </w:tc>
@@ -941,7 +941,7 @@
                 <w:sz w:val="23"/>
                 <w:rtl w:val="1"/>
               </w:rPr>
-              <w:t>مقطعٌ صوتيٌّ قصيرٌ لشخصٍ يصفُ مكانًا بالإنجليزية</w:t>
+              <w:t>مقطع صوتي قصير لشخص يصف مكانا بالإنجليزية</w:t>
             </w:r>
           </w:p>
         </w:tc>
@@ -964,7 +964,7 @@
                 <w:sz w:val="23"/>
                 <w:rtl w:val="1"/>
               </w:rPr>
-              <w:t>نموذجُ استماعٍ أصيلٌ يُحتذى في العرضِ الشفوي</w:t>
+              <w:t>نموذج استماع أصيل يحتذى في العرض الشفوي</w:t>
             </w:r>
           </w:p>
         </w:tc>
@@ -989,7 +989,7 @@
                 <w:sz w:val="23"/>
                 <w:rtl w:val="1"/>
               </w:rPr>
-              <w:t>أوراقٌ كبيرةٌ وأقلامٌ لكلِّ مجموعة</w:t>
+              <w:t>أوراق كبيرة وأقلام لكل مجموعة</w:t>
             </w:r>
           </w:p>
         </w:tc>
@@ -1012,7 +1012,7 @@
                 <w:sz w:val="23"/>
                 <w:rtl w:val="1"/>
               </w:rPr>
-              <w:t>إخراجُ نتاجِ المجموعةِ وعرضُه في نهايةِ المشروع</w:t>
+              <w:t>إخراج نتاج المجموعة وعرضه في نهاية المشروع</w:t>
             </w:r>
           </w:p>
         </w:tc>
@@ -1049,7 +1049,7 @@
           <w:bCs/>
           <w:rtl w:val="1"/>
         </w:rPr>
-        <w:t>سيرُ الدرس</w:t>
+        <w:t>سير الدرس</w:t>
       </w:r>
     </w:p>
     <w:tbl>
@@ -1087,7 +1087,7 @@
                 <w:bCs/>
                 <w:rtl w:val="1"/>
               </w:rPr>
-              <w:t>المرحلةُ والزمن</w:t>
+              <w:t>المرحلة والزمن</w:t>
             </w:r>
           </w:p>
         </w:tc>
@@ -1111,7 +1111,7 @@
                 <w:bCs/>
                 <w:rtl w:val="1"/>
               </w:rPr>
-              <w:t>سيرُ النشاطِ ودورُ المعلمة</w:t>
+              <w:t>سير النشاط ودور المعلمة</w:t>
             </w:r>
           </w:p>
         </w:tc>
@@ -1135,7 +1135,7 @@
                 <w:bCs/>
                 <w:rtl w:val="1"/>
               </w:rPr>
-              <w:t>دورُ الطالب</w:t>
+              <w:t>دور الطالب</w:t>
             </w:r>
           </w:p>
         </w:tc>
@@ -1210,7 +1210,7 @@
                 <w:sz w:val="23"/>
                 <w:rtl w:val="1"/>
               </w:rPr>
-              <w:t>أفتتحُ الحصةَ بسؤالٍ على السبورة: "?What is a place you pass by every day". أتيحُ لهم الحديثَ بالعربيةِ أولًا حتى أفتحَ البابَ دون خوف, ثم أدوِّنُ الأماكنَ التي يذكرونها بالإنجليزيةِ على اللوح, فيتكوَّنُ بنكُ مفرداتٍ نابعٌ منهم لا منّي.</w:t>
+              <w:t>أفتتح الحصة بسؤال على السبورة: "?What is a place you pass by every day". أتيح لهم الحديث بالعربية أولا حتى أفتح الباب دون خوف، ثم أدون الأماكن التي يذكرونها بالإنجليزية على اللوح، فيتكون بنك مفردات نابع منهم لا مني.</w:t>
             </w:r>
           </w:p>
         </w:tc>
@@ -1233,7 +1233,7 @@
                 <w:sz w:val="23"/>
                 <w:rtl w:val="1"/>
               </w:rPr>
-              <w:t>يستحضرُ أماكنَ يعرفُها, يشاركُ برأيه, ويتعرَّفُ على المفرداتِ في سياقٍ حيّ.</w:t>
+              <w:t>يستحضر أماكن يعرفها، يشارك برأيه، ويتعرف على المفردات في سياق حي.</w:t>
             </w:r>
           </w:p>
         </w:tc>
@@ -1256,7 +1256,7 @@
                 <w:sz w:val="23"/>
                 <w:rtl w:val="1"/>
               </w:rPr>
-              <w:t>السبورة, صورٌ لأماكن</w:t>
+              <w:t>السبورة، صور لأماكن</w:t>
             </w:r>
           </w:p>
         </w:tc>
@@ -1282,7 +1282,7 @@
                 <w:bCs/>
                 <w:rtl w:val="1"/>
               </w:rPr>
-              <w:t>مجريات الدرس – الاستماع</w:t>
+              <w:t>مجريات الدرس - الاستماع</w:t>
               <w:br/>
               <w:t>(7 دقائق)</w:t>
             </w:r>
@@ -1307,7 +1307,7 @@
                 <w:sz w:val="23"/>
                 <w:rtl w:val="1"/>
               </w:rPr>
-              <w:t>أُسمِعُهم المقطعَ الصوتيَّ مرتين, وأكلِّفهم بالتقاطِ صفتين وصفيتين فقط, ثم نراجعُهما معًا ونثبِّتُهما على اللوح.</w:t>
+              <w:t>أسمعهم المقطع الصوتي مرتين، وأكلفهم بالتقاط صفتين وصفيتين فقط، ثم نراجعهما معا ونثبتهما على اللوح.</w:t>
             </w:r>
           </w:p>
         </w:tc>
@@ -1330,7 +1330,7 @@
                 <w:sz w:val="23"/>
                 <w:rtl w:val="1"/>
               </w:rPr>
-              <w:t>يستمعُ بهدف, يلتقطُ مفرداتٍ محددة, ويشاركُ فيما سمِع.</w:t>
+              <w:t>يستمع بهدف، يلتقط مفردات محددة، ويشارك فيما سمع.</w:t>
             </w:r>
           </w:p>
         </w:tc>
@@ -1353,7 +1353,7 @@
                 <w:sz w:val="23"/>
                 <w:rtl w:val="1"/>
               </w:rPr>
-              <w:t>المقطعُ الصوتي</w:t>
+              <w:t>المقطع الصوتي</w:t>
             </w:r>
           </w:p>
         </w:tc>
@@ -1379,7 +1379,7 @@
                 <w:bCs/>
                 <w:rtl w:val="1"/>
               </w:rPr>
-              <w:t>مجريات الدرس – بناءُ المفردات</w:t>
+              <w:t>مجريات الدرس - بناء المفردات</w:t>
               <w:br/>
               <w:t>(8 دقائق)</w:t>
             </w:r>
@@ -1404,7 +1404,7 @@
                 <w:sz w:val="23"/>
                 <w:rtl w:val="1"/>
               </w:rPr>
-              <w:t>أوزِّعُ بطاقاتِ المفردات, ونربطُ كلَّ مفردةٍ بصورةٍ مناسبة, ثم نلعبُ لعبةً سريعة: أنطقُ الصفةَ فيرفعون الصورةَ المناسبة.</w:t>
+              <w:t>أوزع بطاقات المفردات، ونربط كل مفردة بصورة مناسبة، ثم نلعب لعبة سريعة: أنطق الصفة فيرفعون الصورة المناسبة.</w:t>
             </w:r>
           </w:p>
         </w:tc>
@@ -1427,7 +1427,7 @@
                 <w:sz w:val="23"/>
                 <w:rtl w:val="1"/>
               </w:rPr>
-              <w:t>يربطُ المفردةَ بمعناها المحسوس, ويتفاعلُ حركيًّا مع المحتوى.</w:t>
+              <w:t>يربط المفردة بمعناها المحسوس، ويتفاعل حركيا مع المحتوى.</w:t>
             </w:r>
           </w:p>
         </w:tc>
@@ -1450,7 +1450,7 @@
                 <w:sz w:val="23"/>
                 <w:rtl w:val="1"/>
               </w:rPr>
-              <w:t>بطاقاتُ المفردات</w:t>
+              <w:t>بطاقات المفردات</w:t>
             </w:r>
           </w:p>
         </w:tc>
@@ -1476,7 +1476,7 @@
                 <w:bCs/>
                 <w:rtl w:val="1"/>
               </w:rPr>
-              <w:t>مجريات الدرس – العملُ في مجموعاتٍ والكتابة</w:t>
+              <w:t>مجريات الدرس - العمل في مجموعات والكتابة</w:t>
               <w:br/>
               <w:t>(15 دقيقة)</w:t>
             </w:r>
@@ -1501,7 +1501,7 @@
                 <w:sz w:val="23"/>
                 <w:rtl w:val="1"/>
               </w:rPr>
-              <w:t>أقسِّمُهم مجموعاتٍ من أربعة, تختارُ كلٌّ منها مكانًا واحدًا. أوزِّعُ ورقةَ العملِ بهيكلِ الفقرة, ويشرعون في الكتابةِ معًا, وأدورُ بينهم أُسنِدُ من يحتاج. يتولى الطالبُ الأقوى دورَ "المحرِّر" الذي يراجعُ الجمل, ويتولى الأضعفُ الرسمَ والكلماتِ المفتاحية, فلكلٍّ مهمة.</w:t>
+              <w:t>أقسمهم مجموعات من أربعة، تختار كل منها مكانا واحدا. أوزع ورقة العمل بهيكل الفقرة، ويشرعون في الكتابة معا، وأدور بينهم أسند من يحتاج. يتولى الطالب الأقوى دور "المحرر" الذي يراجع الجمل، ويتولى الأضعف الرسم والكلمات المفتاحية، فلكل مهمة.</w:t>
             </w:r>
           </w:p>
         </w:tc>
@@ -1524,7 +1524,7 @@
                 <w:sz w:val="23"/>
                 <w:rtl w:val="1"/>
               </w:rPr>
-              <w:t>يتعاونُ ضمن دورٍ واضح, يكتبُ فقرةً قصيرة, ويتحملُ مسؤوليةَ جزءٍ من النتاج.</w:t>
+              <w:t>يتعاون ضمن دور واضح، يكتب فقرة قصيرة، ويتحمل مسؤولية جزء من النتاج.</w:t>
             </w:r>
           </w:p>
         </w:tc>
@@ -1547,7 +1547,7 @@
                 <w:sz w:val="23"/>
                 <w:rtl w:val="1"/>
               </w:rPr>
-              <w:t>أوراقُ العمل, الأوراقُ الكبيرة</w:t>
+              <w:t>أوراق العمل، الأوراق الكبيرة</w:t>
             </w:r>
           </w:p>
         </w:tc>
@@ -1573,7 +1573,7 @@
                 <w:bCs/>
                 <w:rtl w:val="1"/>
               </w:rPr>
-              <w:t>الخاتمةُ والتقييم</w:t>
+              <w:t>الخاتمة والتقييم</w:t>
               <w:br/>
               <w:t>(10 دقائق)</w:t>
             </w:r>
@@ -1598,7 +1598,7 @@
                 <w:sz w:val="23"/>
                 <w:rtl w:val="1"/>
               </w:rPr>
-              <w:t>تقرأُ كلُّ مجموعةٍ جملةً أو جملتين من فقرتها بصوتٍ عالٍ. لا أطلبُ الكمالَ بل المحاولة. أختمُ بسؤالٍ واحد: "ما أصعبُ كلمةٍ شعرتَ بها اليوم, وما الجملةُ التي أعجبتك؟", وأدوِّنُ ملاحظةً سريعةً عن كلِّ مجموعةٍ لأبنيَ عليها في الحصةِ التالية.</w:t>
+              <w:t>تقرأ كل مجموعة جملة أو جملتين من فقرتها بصوت عال. لا أطلب الكمال بل المحاولة. أختم بسؤال واحد: "ما أصعب كلمة شعرت بها اليوم، وما الجملة التي أعجبتك؟"، وأدون ملاحظة سريعة عن كل مجموعة لأبني عليها في الحصة التالية.</w:t>
             </w:r>
           </w:p>
         </w:tc>
@@ -1621,7 +1621,7 @@
                 <w:sz w:val="23"/>
                 <w:rtl w:val="1"/>
               </w:rPr>
-              <w:t>يعرضُ نتاجَه, يتأملُ في تعلُّمِه, ويقدِّمُ تغذيةً راجعةً عن تجربتِه.</w:t>
+              <w:t>يعرض نتاجه، يتأمل في تعلمه، ويقدم تغذية راجعة عن تجربته.</w:t>
             </w:r>
           </w:p>
         </w:tc>
@@ -1644,7 +1644,7 @@
                 <w:sz w:val="23"/>
                 <w:rtl w:val="1"/>
               </w:rPr>
-              <w:t>الأوراقُ الكبيرة</w:t>
+              <w:t>الأوراق الكبيرة</w:t>
             </w:r>
           </w:p>
         </w:tc>
@@ -1681,7 +1681,7 @@
           <w:bCs/>
           <w:rtl w:val="1"/>
         </w:rPr>
-        <w:t>تأمُّلٌ شخصيٌّ حول تخطيطِ الفعالية</w:t>
+        <w:t>تأمل شخصي حول تخطيط الفعالية</w:t>
       </w:r>
     </w:p>
     <w:p>
@@ -1698,7 +1698,7 @@
           <w:sz w:val="26"/>
           <w:rtl w:val="1"/>
         </w:rPr>
-        <w:t>اخترتُ هذا الموضوعَ تحديدًا لأنني لاحظتُ أمرًا بسيطًا لكنه مقلق: كثيرٌ من طلابي يتعاملون مع الإنجليزيةِ كأنها مادةٌ منفصلةٌ عن حياتهم, شيءٌ يخصُّ الامتحانَ فحسب. أردتُ أن أقرِّبَ اللغةَ من خبرتهم اليومية؛ فحين يكونُ الموضوعُ شيئًا يعرفُه الطالبُ ويراه كلَّ يوم, يسهلُ عليه أن يجدَ ما يقولُه, ويقلُّ خوفُه من الكتابة.</w:t>
+        <w:t>اخترت هذا الموضوع تحديدا لأنني لاحظت أمرا بسيطا لكنه مقلق: كثير من طلابي يتعاملون مع الإنجليزية كأنها مادة منفصلة عن حياتهم، شيء يخص الامتحان فحسب. أردت أن أقرب اللغة من خبرتهم اليومية، فحين يكون الموضوع شيئا يعرفه الطالب ويراه كل يوم، يسهل عليه أن يجد ما يقوله، ويقل خوفه من الكتابة.</w:t>
       </w:r>
     </w:p>
     <w:p>
@@ -1715,7 +1715,7 @@
           <w:sz w:val="26"/>
           <w:rtl w:val="1"/>
         </w:rPr>
-        <w:t>أما الاعتباراتُ التي أثَّرت في قراري فكانت في مقدمتها الفروقُ الفردية. أدركُ أنَّ لديَّ طلابًا لا يقدرون على كتابةِ فقرةٍ بمفردهم, فبنيتُ المشروعَ على مجموعاتٍ وأدوارٍ يشاركُ فيها كلٌّ على قدرِه دون أن يشعرَ أحدٌ بالعجز. ثم جاء الاعتبارُ المرتبطُ بالدافعية: أردتُ أن يشعرَ كلُّ طالبٍ أنَّ ما يكتبُه قريبٌ منه وفي متناولِه, فيزدادَ إقبالُه على المحاولة. وثمة اعتبارٌ عمليٌّ ثالث, هو محدوديةُ زمنِ الحصة, فآثرتُ هدفًا لغويًّا واحدًا واضحًا على أهدافٍ كثيرةٍ متعجلة.</w:t>
+        <w:t>أما الاعتبارات التي أثرت في قراري فكانت في مقدمتها الفروق الفردية. أدرك أن لدي طلابا لا يقدرون على كتابة فقرة بمفردهم، فبنيت المشروع على مجموعات وأدوار يشارك فيها كل على قدره دون أن يشعر أحد بالعجز. ثم جاء الاعتبار المرتبط بالدافعية: أردت أن يشعر كل طالب أن ما يكتبه قريب منه وفي متناوله، فيزداد إقباله على المحاولة. وثمة اعتبار عملي ثالث، هو محدودية زمن الحصة، فآثرت هدفا لغويا واحدا واضحا على أهداف كثيرة متعجلة.</w:t>
       </w:r>
     </w:p>
     <w:p>
@@ -1732,7 +1732,7 @@
           <w:sz w:val="26"/>
           <w:rtl w:val="1"/>
         </w:rPr>
-        <w:t>وأما مصدرُ الفكرة فجاء من ملاحظةٍ صفيةٍ متكررة: كلما كان النصُّ في الكتابِ بعيدًا عن خبرةِ الطلابِ فترَ تفاعلُهم, وكلما اقتربَ مما يعرفونه ازدادَ انخراطُهم. لمستُ ذلك بوضوحٍ حين قارنتُ حصةً عن موضوعٍ مجردٍ بحصةٍ طلبتُ فيها أن يصفوا شيئًا من محيطهم المألوف, فكان الفرقُ في المشاركةِ واضحًا. ثم التقت هذه الملاحظةُ الميدانيةُ بما درسناه في المساق عن التعلُّمِ ذي المعنى (meaningful learning), وأنَّ المتعلمَ يتعلمُ أعمقَ حين يربطُ المادةَ بما يعرفُه ويعيشُه. فأردتُ أن أجرِّبَ هذا المبدأ عمليًّا, لا أن يبقى سطرًا نظريًّا في دفتري.</w:t>
+        <w:t>وأما مصدر الفكرة فجاء من ملاحظة صفية متكررة: كلما كان النص في الكتاب بعيدا عن خبرة الطلاب فتر تفاعلهم، وكلما اقترب مما يعرفونه ازداد انخراطهم. لمست ذلك بوضوح حين قارنت حصة عن موضوع مجرد بحصة طلبت فيها أن يصفوا شيئا من محيطهم المألوف، فكان الفرق في المشاركة واضحا. ثم التقت هذه الملاحظة الميدانية بما درسناه في المساق عن التعلم ذي المعنى (meaningful learning)، وأن المتعلم يتعلم أعمق حين يربط المادة بما يعرفه ويعيشه. فأردت أن أجرب هذا المبدأ عمليا، لا أن يبقى سطرا نظريا في دفتري.</w:t>
       </w:r>
     </w:p>
     <w:p>
@@ -1750,7 +1750,7 @@
           <w:bCs/>
           <w:rtl w:val="1"/>
         </w:rPr>
-        <w:t>ثانيًا: تحدٍّ شخصيٌّ خلال السنةِ وانعكاسُه في الفعالية</w:t>
+        <w:t>ثانيا: تحد شخصي خلال السنة وانعكاسه في الفعالية</w:t>
       </w:r>
     </w:p>
     <w:p>
@@ -1767,7 +1767,7 @@
           <w:sz w:val="26"/>
           <w:rtl w:val="1"/>
         </w:rPr>
-        <w:t>كان التحدي الأكبرُ الذي واجهني هو انخفاضَ دافعيةِ الطلابِ نحو الإنجليزية, لا في الصفِّ كلِّه, بل لدى فئةٍ واضحةٍ من الطلابِ ذوي الفجوةِ اللغويةِ القديمة. بلغ هؤلاءِ مرحلةً قرَّروا فيها أنهم "ليسوا أهلًا للإنجليزية", فكفُّوا عن المحاولة. قال لي أحدُهم يومًا: "مِس, أنا فاشلٌ في الإنجليزيةِ منذ الصفِّ الرابع, فلماذا أُتعبُ نفسي؟". أوجعتني هذه الجملةُ, وصارت طوال السنةِ مقياسًا أقيسُ عليه نجاحي.</w:t>
+        <w:t>كان التحدي الأكبر الذي واجهني هو انخفاض دافعية الطلاب نحو الإنجليزية، لا في الصف كله، بل لدى فئة واضحة من الطلاب ذوي الفجوة اللغوية القديمة. بلغ هؤلاء مرحلة قرروا فيها أنهم "ليسوا أهلا للإنجليزية"، فكفوا عن المحاولة. قال لي أحدهم يوما: "مس، أنا فاشل في الإنجليزية منذ الصف الرابع، فلماذا أتعب نفسي؟". أوجعتني هذه الجملة، وصارت طوال السنة مقياسا أقيس عليه نجاحي.</w:t>
       </w:r>
     </w:p>
     <w:p>
@@ -1785,7 +1785,7 @@
           <w:bCs/>
           <w:rtl w:val="1"/>
         </w:rPr>
-        <w:t>كيف تعاملتُ مع التحدي</w:t>
+        <w:t>كيف تعاملت مع التحدي</w:t>
       </w:r>
     </w:p>
     <w:p>
@@ -1802,7 +1802,7 @@
           <w:sz w:val="26"/>
           <w:rtl w:val="1"/>
         </w:rPr>
-        <w:t>بدأتُ بتصغيرِ الأهداف. فبدل أن أطلبَ فقرةً كاملة, صرتُ أطلبُ جملةً واحدةً صحيحة, لأنَّ النجاحَ الصغيرَ يعيدُ الثقةَ أسرعَ من أيِّ خطبةِ تشجيع. ثم غيَّرتُ أسلوبَ التصحيح؛ فكففتُ عن تحميرِ كلِّ خطأٍ في الورقة, وصرتُ أُبرزُ أولًا شيئًا أصابوا فيه, ثم نصحِّحُ خطأً واحدًا معًا. وبنيتُ داخلَ المجموعاتِ أدوارًا تجعلُ للطالبِ الضعيفِ موقعًا ووظيفة, لا مجردَ متفرجٍ على من يعملون. وأخيرًا, خصَّصتُ لحظاتٍ خارجَ الدرسِ أحادثُهم فيها كأشخاص, أسألُ عن أحوالهم؛ فالطالبُ حين يشعرُ أنك تراه إنسانًا يعودُ إلى المحاولةِ من أجلك أنت قبل المادة.</w:t>
+        <w:t>بدأت بتصغير الأهداف. فبدل أن أطلب فقرة كاملة، صرت أطلب جملة واحدة صحيحة، لأن النجاح الصغير يعيد الثقة أسرع من أي خطبة تشجيع. ثم غيرت أسلوب التصحيح، فكففت عن تحمير كل خطأ في الورقة، وصرت أبرز أولا شيئا أصابوا فيه، ثم نصحح خطأ واحدا معا. وبنيت داخل المجموعات أدوارا تجعل للطالب الضعيف موقعا ووظيفة، لا مجرد متفرج على من يعملون. وأخيرا، خصصت لحظات خارج الدرس أحادثهم فيها كأشخاص، أسأل عن أحوالهم، فالطالب حين يشعر أنك تراه إنسانا يعود إلى المحاولة من أجلك أنت قبل المادة.</w:t>
       </w:r>
     </w:p>
     <w:p>
@@ -1820,7 +1820,7 @@
           <w:bCs/>
           <w:rtl w:val="1"/>
         </w:rPr>
-        <w:t>ما الذي تعلمتُه من التجربة</w:t>
+        <w:t>ما الذي تعلمته من التجربة</w:t>
       </w:r>
     </w:p>
     <w:p>
@@ -1837,7 +1837,7 @@
           <w:sz w:val="26"/>
           <w:rtl w:val="1"/>
         </w:rPr>
-        <w:t>تعلمتُ أنَّ الدافعيةَ لا تُشترى بالتهديدِ ولا بالعلامة. فالطالبُ الذي "لا يحبُّ الإنجليزية" هو في الغالبِ طالبٌ تعوَّدَ أن يفشلَ فيها, ويخافُ أن يجرِّبَ فيفشلَ من جديد. فصارت مهمتي الأولى أن أكسرَ هذا الخوف, لا أن أحشوَ المعلوماتِ في رأسه. وأدركتُ أنَّ التعليمَ في جوهرِه علاقةٌ قبل أن يكون محتوى.</w:t>
+        <w:t>تعلمت أن الدافعية لا تشترى بالتهديد ولا بالعلامة. فالطالب الذي "لا يحب الإنجليزية" هو في الغالب طالب تعود أن يفشل فيها، ويخاف أن يجرب فيفشل من جديد. فصارت مهمتي الأولى أن أكسر هذا الخوف، لا أن أحشو المعلومات في رأسه. وأدركت أن التعليم في جوهره علاقة قبل أن يكون محتوى.</w:t>
       </w:r>
     </w:p>
     <w:p>
@@ -1872,7 +1872,7 @@
           <w:sz w:val="26"/>
           <w:rtl w:val="1"/>
         </w:rPr>
-        <w:t>مشروعُ "مدينتي بكلماتي" هو حرفيًّا ردِّي على هذا التحدي. اخترتُ موضوعًا يعرفُه الطالبُ ويقدرُ على الحديثِ عنه مهما ضعُفت إنجليزيتُه, لأنه يتحدثُ عمّا يراه ويعرفُه. وبنيتُ المشروعَ على مجموعاتٍ وأدوار كي يجدَ الطالبُ الضعيفُ لنفسِه موضعًا. وجعلتُ خاتمةَ الحصةِ "جرِّبوا فحسب" لا "تكلموا بصواب", حتى أكسرَ الخوفَ من الخطأ. غايتي أن يخرجَ كلُّ طالبٍ من الحصةِ شاعرًا بأنه نجح في شيء, وإن كان صغيرًا. وقد وجَّهني في التخطيطِ اعتبارٌ حرِصتُ عليه: خشيتُ أن يستحوذَ الطلابُ الأقوى على العملِ فيُهمَّشَ الأضعف, فوزَّعتُ الأدوارَ بنفسي ولم أتركها للصدفة, وجعلتُ في دورِ "المحرِّر" تحديًا يليقُ بالقوي.</w:t>
+        <w:t>مشروع "مدينتي بكلماتي" هو حرفيا ردي على هذا التحدي. اخترت موضوعا يعرفه الطالب ويقدر على الحديث عنه مهما ضعفت إنجليزيته، لأنه يتحدث عما يراه ويعرفه. وبنيت المشروع على مجموعات وأدوار كي يجد الطالب الضعيف لنفسه موضعا. وجعلت خاتمة الحصة "جربوا فحسب" لا "تكلموا بصواب"، حتى أكسر الخوف من الخطأ. غايتي أن يخرج كل طالب من الحصة شاعرا بأنه نجح في شيء، وإن كان صغيرا. وقد وجهني في التخطيط اعتبار حرصت عليه: خشيت أن يستحوذ الطلاب الأقوى على العمل فيهمش الأضعف، فوزعت الأدوار بنفسي ولم أتركها للصدفة، وجعلت في دور "المحرر" تحديا يليق بالقوي.</w:t>
       </w:r>
     </w:p>
     <w:p>
@@ -1890,7 +1890,7 @@
           <w:bCs/>
           <w:rtl w:val="1"/>
         </w:rPr>
-        <w:t>ما أرغبُ في تطويرِه مستقبلًا</w:t>
+        <w:t>ما أرغب في تطويره مستقبلا</w:t>
       </w:r>
     </w:p>
     <w:p>
@@ -1907,7 +1907,7 @@
           <w:sz w:val="26"/>
           <w:rtl w:val="1"/>
         </w:rPr>
-        <w:t>أشعرُ أنَّ تقييمي ما زال قائمًا على الحدسِ أكثرَ من اللازم, وأطمحُ إلى بناءِ أداةٍ واضحةٍ (سلَّم تقييمٍ مبسَّط) يعرفُ الطالبُ من خلالها أين هو وإلى أين يريدُ أن يصل. كما أنَّ عشرَ دقائقَ للعرضِ الشفويِّ لم تكفِ, وأنوي في المرةِ القادمةِ أن أمنحَ العرضَ حصةً كاملة, لأنَّ لحظةَ وقوفِ الطالبِ ونطقِه بجملتِه هي اللحظةُ التي تُبنى فيها الثقةُ فعلًا.</w:t>
+        <w:t>أشعر أن تقييمي ما زال قائما على الحدس أكثر من اللازم، وأطمح إلى بناء أداة واضحة، سلم تقييم مبسط، يعرف الطالب من خلالها أين هو وإلى أين يريد أن يصل. كما أن عشر دقائق للعرض الشفوي لم تكف، وأنوي في المرة القادمة أن أمنح العرض حصة كاملة، لأن لحظة وقوف الطالب ونطقه بجملته هي اللحظة التي تبنى فيها الثقة فعلا.</w:t>
       </w:r>
     </w:p>
     <w:p>
@@ -1925,7 +1925,7 @@
           <w:bCs/>
           <w:rtl w:val="1"/>
         </w:rPr>
-        <w:t>ثالثًا: ما الذي تعلمتُه من المرافقةِ المهنيةِ ومن المساق</w:t>
+        <w:t>ثالثا: ما الذي تعلمته من المرافقة المهنية ومن المساق</w:t>
       </w:r>
     </w:p>
     <w:p>
@@ -1942,7 +1942,7 @@
           <w:sz w:val="26"/>
           <w:rtl w:val="1"/>
         </w:rPr>
-        <w:t>حين أتأملُ في هذه السنة, أجدُ أنَّ المرافقةَ المهنيةَ والمساقَ عملا فيَّ كجناحين: المساقُ أعطاني الإطارَ النظريَّ والمفاهيمَ التي أُسمّي بها ما أراه, والمرافقةُ أنزلت تلك المفاهيمَ إلى أرضِ الصفِّ ووضعتها تحت اختبارِ الواقع. لولا المساقُ لبقيتُ أتصرفُ بالحدسِ دون أن أفهمَ لماذا, ولولا المرافقةُ لبقيت المفاهيمُ حبيسةَ الورق. وأهمُّ استنتاجٍ خرجتُ به من الاثنين معًا أنَّ التعليمَ ليس عرضًا للمعلومات, بل هو إدارةٌ لعلاقةٍ ولبيئةِ تعلُّم. كنتُ في السابقِ أُحضِّرُ الحصةَ وأنا مشغولةٌ بسؤالِ "ماذا سأُعطي؟", وصرتُ أُحضِّرها وأنا أسألُ "ماذا سيفعلُ الطالبُ وبماذا سيخرج؟". هذا التحوُّلُ من مركزيةِ المعلمِ إلى مركزيةِ المتعلمِ هو خلاصةُ السنةِ عندي, ومنه تفرَّعَ كلُّ تغييرٍ آخر.</w:t>
+        <w:t>حين أتأمل في هذه السنة، أجد أن المرافقة المهنية والمساق عملا في كجناحين: المساق أعطاني الإطار النظري والمفاهيم التي أسمي بها ما أراه، والمرافقة أنزلت تلك المفاهيم إلى أرض الصف ووضعتها تحت اختبار الواقع. لولا المساق لبقيت أتصرف بالحدس دون أن أفهم لماذا، ولولا المرافقة لبقيت المفاهيم حبيسة الورق. وأهم استنتاج خرجت به من الاثنين معا أن التعليم ليس عرضا للمعلومات، بل هو إدارة لعلاقة ولبيئة تعلم. كنت في السابق أحضر الحصة وأنا مشغولة بسؤال "ماذا سأعطي؟"، وصرت أحضرها وأنا أسأل "ماذا سيفعل الطالب وبماذا سيخرج؟". هذا التحول من مركزية المعلم إلى مركزية المتعلم هو خلاصة السنة عندي، ومنه تفرع كل تغيير آخر.</w:t>
       </w:r>
     </w:p>
     <w:p>
@@ -1960,7 +1960,7 @@
           <w:bCs/>
           <w:rtl w:val="1"/>
         </w:rPr>
-        <w:t>في فهمِ دورِ المعلمِ وعمليةِ التدريس</w:t>
+        <w:t>في فهم دور المعلم وعملية التدريس</w:t>
       </w:r>
     </w:p>
     <w:p>
@@ -1977,7 +1977,7 @@
           <w:sz w:val="26"/>
           <w:rtl w:val="1"/>
         </w:rPr>
-        <w:t>غيَّرت المرافقةُ صورتي عن المعلمِ من جذورها. كنتُ أظنُّ أنَّ قوةَ المعلمِ في أن يملأَ الصفَّ بحضورِه وكلامِه, فأرَتني المعلمةُ المرافقةُ أنَّ القوةَ الحقيقيةَ أحيانًا في الصمتِ وفي التراجعِ خطوةً إلى الوراء لإفساحِ المجالِ للطالب. كانت أهدأَ مني بكثير, تطرحُ سؤالًا ثم تنتظرُ, تعُدُّ في نفسها ثوانيَ لا تُعدُّ عندي, فيخرجُ من الطالبِ جوابٌ ما كان ليخرجَ لو تعجَّلتُ ملءَ الفراغ. وربط المساقُ لي هذا بمفهومِ "زمنِ الانتظار" (wait time) وبفكرةِ السقالاتِ التعليمية (scaffolding): أنَّ دوري ليس أن أُعطيَ الجوابَ, بل أن أبنيَ سلَّمًا يصعدُ الطالبُ عليه بنفسه. فأدركتُ أنَّ الصمتَ في الصفِّ ليس فشلًا يجبُ إنقاذُه, بل هو غالبًا تفكيرٌ يجري بهدوء, وأنَّ المعلمَ الأنجحَ ليس من يعرفُ أكثر, بل من يجعلُ طلابَه يفكرون أكثر.</w:t>
+        <w:t>غيرت المرافقة صورتي عن المعلم من جذورها. كنت أظن أن قوة المعلم في أن يملأ الصف بحضوره وكلامه، فأرتني المعلمة المرافقة أن القوة الحقيقية أحيانا في الصمت وفي التراجع خطوة إلى الوراء لإفساح المجال للطالب. كانت أهدأ مني بكثير، تطرح سؤالا ثم تنتظر، تعد في نفسها ثواني لا تعد عندي، فيخرج من الطالب جواب ما كان ليخرج لو تعجلت ملء الفراغ. وربط المساق لي هذا بمفهوم "زمن الانتظار" (wait time) وبفكرة السقالات التعليمية (scaffolding): أن دوري ليس أن أعطي الجواب، بل أن أبني سلما يصعد الطالب عليه بنفسه. فأدركت أن الصمت في الصف ليس فشلا يجب إنقاذه، بل هو غالبا تفكير يجري بهدوء، وأن المعلم الأنجح ليس من يعرف أكثر، بل من يجعل طلابه يفكرون أكثر.</w:t>
       </w:r>
     </w:p>
     <w:p>
@@ -1995,7 +1995,7 @@
           <w:bCs/>
           <w:rtl w:val="1"/>
         </w:rPr>
-        <w:t>كيف أثَّرا في طريقةِ تدريسي</w:t>
+        <w:t>كيف أثرا في طريقة تدريسي</w:t>
       </w:r>
     </w:p>
     <w:tbl>
@@ -2055,7 +2055,7 @@
                 <w:bCs/>
                 <w:rtl w:val="1"/>
               </w:rPr>
-              <w:t>التغيُّرُ الذي طرأ</w:t>
+              <w:t>التغير الذي طرأ</w:t>
             </w:r>
           </w:p>
         </w:tc>
@@ -2081,7 +2081,7 @@
                 <w:bCs/>
                 <w:rtl w:val="1"/>
               </w:rPr>
-              <w:t>تخطيطُ الدروس</w:t>
+              <w:t>تخطيط الدروس</w:t>
             </w:r>
           </w:p>
         </w:tc>
@@ -2104,7 +2104,7 @@
                 <w:sz w:val="23"/>
                 <w:rtl w:val="1"/>
               </w:rPr>
-              <w:t>صرتُ أبدأُ من الهدفِ ومن الطالب لا من المحتوى, وأصوغُ الهدفَ بفعلٍ يقدرُ الطالبُ على أدائِه وقياسِه: ماذا سيكونُ قادرًا على فعلِه في نهايةِ الحصة؟</w:t>
+              <w:t>صرت أبدأ من الهدف ومن الطالب لا من المحتوى، وأصوغ الهدف بفعل يقدر الطالب على أدائه وقياسه: ماذا سيكون قادرا على فعله في نهاية الحصة؟</w:t>
             </w:r>
           </w:p>
         </w:tc>
@@ -2130,7 +2130,7 @@
                 <w:bCs/>
                 <w:rtl w:val="1"/>
               </w:rPr>
-              <w:t>تنفيذُ الدروس</w:t>
+              <w:t>تنفيذ الدروس</w:t>
             </w:r>
           </w:p>
         </w:tc>
@@ -2153,7 +2153,7 @@
                 <w:sz w:val="23"/>
                 <w:rtl w:val="1"/>
               </w:rPr>
-              <w:t>قلَّلتُ حديثي وكثَّرتُ عملَ الطلاب, ووزَّعتُ الحصةَ إلى مراحلَ قصيرةٍ متنوعةٍ بدل شرحٍ طويلٍ واحد, حتى صارت الحصةُ التي أتكلمُ فيها طوالَ الوقتِ تُزعجني.</w:t>
+              <w:t>قللت حديثي وكثرت عمل الطلاب، ووزعت الحصة إلى مراحل قصيرة متنوعة بدل شرح طويل واحد، حتى صارت الحصة التي أتكلم فيها طوال الوقت تزعجني.</w:t>
             </w:r>
           </w:p>
         </w:tc>
@@ -2179,7 +2179,7 @@
                 <w:bCs/>
                 <w:rtl w:val="1"/>
               </w:rPr>
-              <w:t>التعاملُ مع الطلاب</w:t>
+              <w:t>التعامل مع الطلاب</w:t>
             </w:r>
           </w:p>
         </w:tc>
@@ -2202,7 +2202,7 @@
                 <w:sz w:val="23"/>
                 <w:rtl w:val="1"/>
               </w:rPr>
-              <w:t>صرتُ أقرأُ السلوكَ المشوِّشَ كرسالةٍ لها سبب لا كتحدٍّ لشخصي؛ فالطالبُ المشوِّشُ غالبًا مللٌّ أو غيرُ فاهمٍ أو يبحثُ عن انتباه, والاستجابةُ للسببِ أجدى من معاقبةِ العرَض.</w:t>
+              <w:t>صرت أقرأ السلوك المشوش كرسالة لها سبب لا كتحد لشخصي، فالطالب المشوش غالبا ملان أو غير فاهم أو يبحث عن انتباه، والاستجابة للسبب أجدى من معاقبة العرض.</w:t>
             </w:r>
           </w:p>
         </w:tc>
@@ -2228,7 +2228,7 @@
                 <w:bCs/>
                 <w:rtl w:val="1"/>
               </w:rPr>
-              <w:t>تقييمُ تعلُّمهم</w:t>
+              <w:t>تقييم تعلمهم</w:t>
             </w:r>
           </w:p>
         </w:tc>
@@ -2251,7 +2251,7 @@
                 <w:sz w:val="23"/>
                 <w:rtl w:val="1"/>
               </w:rPr>
-              <w:t>أدركتُ أنَّ التقييمَ مرافقٌ للتعلمِ لا خاتمةٌ له؛ فسؤالٌ ختاميٌّ أو ورقةُ خروجٍ أو جولةٌ بين المجموعاتِ تمنحُني صورةً حيةً عن فهمهم أصدقَ من علامةٍ رقميةٍ في نهايةِ الوحدة.</w:t>
+              <w:t>أدركت أن التقييم مرافق للتعلم لا خاتمة له، فسؤال ختامي أو ورقة خروج أو جولة بين المجموعات تمنحني صورة حية عن فهمهم أصدق من علامة رقمية في نهاية الوحدة.</w:t>
             </w:r>
           </w:p>
         </w:tc>
@@ -2288,7 +2288,7 @@
           <w:bCs/>
           <w:rtl w:val="1"/>
         </w:rPr>
-        <w:t>النصيحةُ الأكثرُ تأثيرًا من المعلمةِ المرافقة</w:t>
+        <w:t>النصيحة الأكثر تأثيرا من المعلمة المرافقة</w:t>
       </w:r>
     </w:p>
     <w:p>
@@ -2305,7 +2305,7 @@
           <w:sz w:val="26"/>
           <w:rtl w:val="1"/>
         </w:rPr>
-        <w:t>خرجتُ يومًا من حصةٍ محبَطةً لأنَّ خطتي لم تسِر كما أردت, فقالت لي المعلمةُ المرافقةُ جملةً لم أنسَها: "لستِ مطالبةً بإنقاذِ الحصة, بل بقراءةِ الصف". بدت لي في لحظتها كلمةً عابرة, لكنها فتحت لي بابًا واسعًا. فهمتُ أنني كنتُ أضعُ الخطةَ فوق الطلاب, أركضُ خلف إتمامِ ما كتبتُه في دفتري حتى لو فقَدتُ الصفَّ في الطريق, وأنَّ عليَّ أن أعكسَ الأولوية: الطلابُ أولًا, والخطةُ أداةٌ في خدمتهم لا سيدةٌ عليهم. كانت هذه النصيحةُ الأعمقَ أثرًا لأنها لم تُصحِّح تقنيةً عندي بل صحَّحت موقفي كلَّه من التدريس. ومنذئذٍ صرتُ أدخلُ الصفَّ والخطةُ معي, لكنها ليست مقدَّسة, وعينيَّ على وجوهِ الطلابِ لا على الورقة. وقد طبَّقتُها فعلًا في مشروعِ المدينة: حين رأيتُ المجموعةَ الأولى تتعثرُ في الكتابةِ وتتسربُ الحيرةُ إلى وجوهها, لم أُكمِل كما هو مكتوب, بل أوقفتُ المهمةَ ورجعنا معًا إلى بنكِ المفردات, ثم عُدنا إلى الكتابة. ولو تشبثتُ بالورقةِ لضاعوا جميعًا, ولخرجوا بإحساسِ فشلٍ جديدٍ لا أريدُه لهم.</w:t>
+        <w:t>خرجت يوما من حصة محبطة لأن خطتي لم تسر كما أردت، فقالت لي المعلمة المرافقة جملة لم أنسها: "لست مطالبة بإنقاذ الحصة، بل بقراءة الصف". بدت لي في لحظتها كلمة عابرة، لكنها فتحت لي بابا واسعا. فهمت أنني كنت أضع الخطة فوق الطلاب، أركض خلف إتمام ما كتبته في دفتري حتى لو فقدت الصف في الطريق، وأن علي أن أعكس الأولوية: الطلاب أولا، والخطة أداة في خدمتهم لا سيدة عليهم. كانت هذه النصيحة الأعمق أثرا لأنها لم تصحح تقنية عندي بل صححت موقفي كله من التدريس. ومنذئذ صرت أدخل الصف والخطة معي، لكنها ليست مقدسة، وعيني على وجوه الطلاب لا على الورقة. وقد طبقتها فعلا في مشروع المدينة: حين رأيت المجموعة الأولى تتعثر في الكتابة وتتسرب الحيرة إلى وجوهها، لم أكمل كما هو مكتوب، بل أوقفت المهمة ورجعنا معا إلى بنك المفردات، ثم عدنا إلى الكتابة. ولو تشبثت بالورقة لضاعوا جميعا، ولخرجوا بإحساس فشل جديد لا أريده لهم.</w:t>
       </w:r>
     </w:p>
     <w:p>
@@ -2323,7 +2323,7 @@
           <w:bCs/>
           <w:rtl w:val="1"/>
         </w:rPr>
-        <w:t>كيف تغيَّرت نظرتي إلى تخطيطِ الدرس</w:t>
+        <w:t>كيف تغيرت نظرتي إلى تخطيط الدرس</w:t>
       </w:r>
     </w:p>
     <w:p>
@@ -2340,7 +2340,7 @@
           <w:sz w:val="26"/>
           <w:rtl w:val="1"/>
         </w:rPr>
-        <w:t>تغيَّرت النظرةُ في أربعةِ مواضعَ ملموسة. في اختيارِ الأهداف صارت أقلَّ عددًا وأوضحَ صياغة, إذ إنَّ هدفًا واحدًا أو اثنين يتحققان ويُقاسان خيرٌ من خمسةٍ طموحةٍ تبقى حبرًا على ورق. وفي تنظيمِ مراحلِ الدرسِ صرتُ أتركُ هامشًا للمرونةِ ولا أملأُ كلَّ دقيقة, لأنَّ الحصةَ المضغوطةَ لا تدعُ للطالبِ مجالًا ليفكرَ ولا تدعُ لي مجالًا لأُعدِّل حين يلزمُ التعديل. وفي ملاءمةِ الأنشطةِ صرتُ أفكرُ في أضعفِ طالبٍ أولًا لا في المتوسط, لأنني وجدتُ أنَّ ما أُيسِّرُه للأضعفِ يصلحُ للبقيةِ أيضًا, بينما العكسُ لا يصح. وفي تنويعِ طرقِ التدريسِ صرتُ أمزجُ السمعيَّ والبصريَّ والحركيَّ في الحصةِ الواحدة, بعد أن فهمتُ في المساقِ أنَّ الطلابَ لا يصلون إلى المعنى من بابٍ واحد, وأنَّ تنويعَ المداخلِ ليس رفاهيةً بل شرطٌ لوصولِ أكبرِ عددٍ منهم.</w:t>
+        <w:t>تغيرت النظرة في أربعة مواضع ملموسة. في اختيار الأهداف صارت أقل عددا وأوضح صياغة، إذ إن هدفا واحدا أو اثنين يتحققان ويقاسان خير من خمسة طموحة تبقى حبرا على ورق. وفي تنظيم مراحل الدرس صرت أترك هامشا للمرونة ولا أملأ كل دقيقة، لأن الحصة المضغوطة لا تدع للطالب مجالا ليفكر ولا تدع لي مجالا لأعدل حين يلزم التعديل. وفي ملاءمة الأنشطة صرت أفكر في أضعف طالب أولا لا في المتوسط، لأنني وجدت أن ما أيسره للأضعف يصلح للبقية أيضا، بينما العكس لا يصح. وفي تنويع طرق التدريس صرت أمزج السمعي والبصري والحركي في الحصة الواحدة، بعد أن فهمت في المساق أن الطلاب لا يصلون إلى المعنى من باب واحد، وأن تنويع المداخل ليس رفاهية بل شرط لوصول أكبر عدد منهم.</w:t>
       </w:r>
     </w:p>
     <w:p>
@@ -2358,7 +2358,7 @@
           <w:bCs/>
           <w:rtl w:val="1"/>
         </w:rPr>
-        <w:t>كيف تطوَّرت قدراتي (تغييران حقيقيان)</w:t>
+        <w:t>كيف تطورت قدراتي، تغييران حقيقيان</w:t>
       </w:r>
     </w:p>
     <w:p>
@@ -2375,7 +2375,7 @@
           <w:sz w:val="26"/>
           <w:rtl w:val="1"/>
         </w:rPr>
-        <w:t>التغييرُ الأولُ في إدارةِ الصفِّ والوقت. كنتُ في مطلعِ السنةِ أُنهي الحصةَ لاهثةً دون أن أُتمَّ نصفَ الخطة, لأنني كنتُ أقدِّرُ الزمنَ بتفاؤلٍ لا يشبهُ الواقع. فتعلمتُ أن أخطِّطَ لزمنٍ أقلَّ من الحصةِ الفعليةِ وأتركَ فائضًا للطوارئِ وللأسئلة, وأن أضعَ حدًّا زمنيًّا واضحًا لكلِّ مرحلةٍ أُعلنُه للطلاب, فكفَّ عني الركضُ وصار الوقتُ في يدي لا فوقَ رأسي. والتغييرُ الثاني في بناءِ العلاقةِ مع الطلاب. تعلمتُ أن أُناديَهم بأسمائهم منذ الأسبوعِ الأول, وأن أسألَ عن الغائبِ حين يعود, وأن أُلقيَ التحيةَ عند البابِ قبل أن تبدأَ الحصة. تبدو هذه تفاصيلَ صغيرة, لكنها غيَّرت جوَّ الصفِّ كلَّه؛ فالطالبُ الذي تشعرُه بأنك تراه وتذكرُه يعودُ إليك, ويمنحُك من الانتباهِ والاحترامِ ما لا تمنحُه إياه أيُّ قاعدةِ ضبطٍ مكتوبة. أدركتُ في النهايةِ أنَّ إدارةَ الصفِّ ليست ضبطًا للسلوكِ بقدرِ ما هي بناءٌ لعلاقةٍ يجعلُ الضبطَ أقلَّ حاجةً أصلًا.</w:t>
+        <w:t>التغيير الأول في إدارة الصف والوقت. كنت في مطلع السنة أنهي الحصة لاهثة دون أن أتم نصف الخطة، لأنني كنت أقدر الزمن بتفاؤل لا يشبه الواقع. فتعلمت أن أخطط لزمن أقل من الحصة الفعلية وأترك فائضا للطوارئ وللأسئلة، وأن أضع حدا زمنيا واضحا لكل مرحلة أعلنه للطلاب، فكف عني الركض وصار الوقت في يدي لا فوق رأسي. والتغيير الثاني في بناء العلاقة مع الطلاب. تعلمت أن أناديهم بأسمائهم منذ الأسبوع الأول، وأن أسأل عن الغائب حين يعود، وأن ألقي التحية عند الباب قبل أن تبدأ الحصة. تبدو هذه تفاصيل صغيرة، لكنها غيرت جو الصف كله، فالطالب الذي تشعره بأنك تراه وتذكره يعود إليك، ويمنحك من الانتباه والاحترام ما لا تمنحه إياه أي قاعدة ضبط مكتوبة. أدركت في النهاية أن إدارة الصف ليست ضبطا للسلوك بقدر ما هي بناء لعلاقة يجعل الضبط أقل حاجة أصلا.</w:t>
       </w:r>
     </w:p>
     <w:p>
@@ -2393,7 +2393,7 @@
           <w:bCs/>
           <w:rtl w:val="1"/>
         </w:rPr>
-        <w:t>رابعًا: هويتي المهنيةُ كمعلمة – القيمُ والمعتقداتُ والرؤية</w:t>
+        <w:t>رابعا: هويتي المهنية كمعلمة، قيمي ومعتقداتي ورؤيتي</w:t>
       </w:r>
     </w:p>
     <w:p>
@@ -2410,7 +2410,7 @@
           <w:sz w:val="26"/>
           <w:rtl w:val="1"/>
         </w:rPr>
-        <w:t>حين أحاولُ أن أصفَ نفسي كمعلمة, أجدُ أنَّ كلَّ ما أفعلُه في الصفِّ يعودُ في جذرِه إلى قيمةٍ واحدةٍ تتصدرُ ما عداها: احترامُ المتعلمِ المتبادل. أدخلُ الصفَّ على أساسِ أنَّ الطالبَ إنسانٌ قبل أن يكونَ متعلمًا, وأنَّ احترامي له غيرُ مشروطٍ بعلامتِه. من هذه القيمةِ تتفرَّعُ بقيةُ ما أومنُ به؛ فحبُّ الاستطلاعِ الذي أرجو أن يسألَ الطالبُ بدافعِه "لماذا" ويتجاوزَ حدودَ الكتاب لا ينمو إلا في صفٍّ يشعرُ فيه أنَّ سؤالَه مُرحَّبٌ به لا مصدرُ إحراج. وكذلك المسؤوليةُ الشخصية, أي أن يعيَ الطالبُ أنَّ تعلُّمَه مسؤوليتُه هو أيضًا لا عبءٌ على عاتقي وحدي, لا تُبنى بالإكراهِ بل حين يشعرُ أنَّ صوتَه محسوبٌ وأنَّ قراراتِه في التعلمِ تخصُّه. هذه القيمُ ليست شعاراتٍ أعلِّقها على جدارِ الصف, بل معاييرُ أزنُ بها قراراتي اليوميةَ الصغيرة.</w:t>
+        <w:t>حين أحاول أن أصف نفسي كمعلمة، أجد أن كل ما أفعله في الصف يعود في جذره إلى قيمة واحدة تتصدر ما عداها: احترام المتعلم المتبادل. أدخل الصف على أساس أن الطالب إنسان قبل أن يكون متعلما، وأن احترامي له غير مشروط بعلامته. من هذه القيمة تتفرع بقية ما أومن به، فحب الاستطلاع الذي أرجو أن يسأل الطالب بدافعه "لماذا" ويتجاوز حدود الكتاب لا ينمو إلا في صف يشعر فيه أن سؤاله مرحب به لا مصدر إحراج. وكذلك المسؤولية الشخصية، أي أن يعي الطالب أن تعلمه مسؤوليته هو أيضا لا عبء على عاتقي وحدي، لا تبنى بالإكراه بل حين يشعر أن صوته محسوب وأن قراراته في التعلم تخصه. هذه القيم ليست شعارات أعلقها على جدار الصف، بل معايير أزن بها قراراتي اليومية الصغيرة.</w:t>
       </w:r>
     </w:p>
     <w:p>
@@ -2427,7 +2427,7 @@
           <w:sz w:val="26"/>
           <w:rtl w:val="1"/>
         </w:rPr>
-        <w:t>وانطلاقًا من هذا الأساس, صار واضحًا لي ما الذي أريدُ أن أنمِّيَه في طلابي فعلًا. قبل أيِّ مهارةٍ لغوية, أريدُهم أن يخرجوا من صفي غيرَ خائفين من الخطأ, لأنَّ الخطأَ عندي محطةٌ في التعلمِ لا عيبٌ يُستحى منه, وقد رأيتُ بعينيَّ كيف يشلُّ الخوفُ من الخطأ طالبًا كاملًا فيصمتُ خشيةَ أن يُخطئ. ثم أريدُهم قادرين على التعبيرِ عن رأيهم بثقة, ولو بلغةٍ بسيطة, وأن يتعوَّدوا التعاونَ واحترامَ صوتِ زميلِهم في أثناءِ العمل؛ فالمهارةُ اللغويةُ تأتي مع الوقت, أما الجرأةُ على المحاولةِ فهي الأرضُ التي يُزرَعُ فيها كلُّ شيءٍ بعدها. ولأنَّ هذا ما أريدُ أن أزرعَه, صرتُ أعرفُ أيَّ معلمةٍ أطمحُ أن أكون: معلمةً مُصغيةً وممكِّنة. مُصغيةً لأنني اختبرتُ بنفسي كيف يتغيرُ الطالبُ حين يشعرُ أنَّ ثمة من يسمعُه حقًّا, وممكِّنةً لأنني لا أريدُ أن أبقى مصدرَ كلِّ شيء, بل أن أمنحَه الأدواتِ ثم أراه ينطلقُ بها وحده. أنجحُ حصةٍ عندي تلك التي يخرجُ منها الطالبُ شاعرًا بأنه هو من أنجز, لا أنا, لأنني في النهايةِ أُنمّي متعلمًا مستقلًّا لا أُلقِّنُ مادةً وحسب.</w:t>
+        <w:t>وانطلاقا من هذا الأساس، صار واضحا لي ما الذي أريد أن أنميه في طلابي فعلا. قبل أي مهارة لغوية، أريدهم أن يخرجوا من صفي غير خائفين من الخطأ، لأن الخطأ عندي محطة في التعلم لا عيب يستحى منه، وقد رأيت بعيني كيف يشل الخوف من الخطأ طالبا كاملا فيصمت خشية أن يخطئ. ثم أريدهم قادرين على التعبير عن رأيهم بثقة، ولو بلغة بسيطة، وأن يتعودوا التعاون واحترام صوت زميلهم في أثناء العمل، فالمهارة اللغوية تأتي مع الوقت، أما الجرأة على المحاولة فهي الأرض التي يزرع فيها كل شيء بعدها. ولأن هذا ما أريد أن أزرعه، صرت أعرف أي معلمة أطمح أن أكون: معلمة مصغية وممكنة. مصغية لأنني اختبرت بنفسي كيف يتغير الطالب حين يشعر أن ثمة من يسمعه حقا، وممكنة لأنني لا أريد أن أبقى مصدر كل شيء، بل أن أمنحه الأدوات ثم أراه ينطلق بها وحده. أنجح حصة عندي تلك التي يخرج منها الطالب شاعرا بأنه هو من أنجز، لا أنا، لأنني في النهاية أنمي متعلما مستقلا لا ألقن مادة وحسب.</w:t>
       </w:r>
     </w:p>
     <w:p>
@@ -2444,7 +2444,7 @@
           <w:sz w:val="26"/>
           <w:rtl w:val="1"/>
         </w:rPr>
-        <w:t>كلُّ ما سبق يتكثَّفُ عندي في جملةٍ واحدةٍ هي "أنا أؤمن" التربويُّ الذي أعملُ في ضوئه: أؤمنُ أنَّ كلَّ طالبٍ قادرٌ على التعلمِ حين يشعرُ بالأمانِ وبأنَّ له مكانًا, وأنَّ اللغةَ تُبنى بالمحاولةِ والخطأ لا بالخوف, وأنَّ مهمتي الأولى ليست أن أُعطيَ معلومةً بل أن أجعلَ الطالبَ يصدِّقُ أنه قادر, فحين يصدِّقُ نفسَه يغدو التعلمُ يسيرًا. وهذا الإيمانُ لا يبقى في مكانٍ مجرَّد, بل يتسربُ إلى أدقِّ تفاصيلِ يومي في الصف. يظهرُ في أسلوبِ حديثي معهم حين أناديهم بأسمائهم وأتجنبُ أيَّ كلمةٍ تقلِّلُ من قيمةِ طالبٍ أمام زملائه, وفي إدارتي للحصةِ حين أتركُ له وقتًا ليفكرَ قبل أن يجيبَ ولا أتعجلُ ملءَ الصمت, وفي تشجيعي للمشاركةِ حين أوجِّهُ للطالبِ الخجولِ سؤالًا أعلمُ أنه قادرٌ عليه ليختبرَ طعمَ النجاح, وفي تعاملي مع الأخطاءِ حين أصحِّحُ الخطأَ معه بهدوءٍ وأُبرزُ الصوابَ قبله, وأخيرًا في بيئةِ الصفِّ حين أضعُ القوانينَ مع الطلابِ أنفسِهم ليشعروا أنها قوانينُهم لا قوانيني. بهذا تصيرُ القيمةُ والرؤيةُ والممارسةُ شيئًا واحدًا, لا أقوالًا في جانبٍ وأفعالًا في جانبٍ آخر.</w:t>
+        <w:t>كل ما سبق يتكثف عندي في جملة واحدة هي "أنا أؤمن" التربوي الذي أعمل في ضوئه: أؤمن أن كل طالب قادر على التعلم حين يشعر بالأمان وبأن له مكانا، وأن اللغة تبنى بالمحاولة والخطأ لا بالخوف، وأن مهمتي الأولى ليست أن أعطي معلومة بل أن أجعل الطالب يصدق أنه قادر، فحين يصدق نفسه يغدو التعلم يسيرا. وهذا الإيمان لا يبقى في مكان مجرد، بل يتسرب إلى أدق تفاصيل يومي في الصف. يظهر في أسلوب حديثي معهم حين أناديهم بأسمائهم وأتجنب أي كلمة تقلل من قيمة طالب أمام زملائه، وفي إدارتي للحصة حين أترك له وقتا ليفكر قبل أن يجيب ولا أتعجل ملء الصمت، وفي تشجيعي للمشاركة حين أوجه للطالب الخجول سؤالا أعلم أنه قادر عليه ليختبر طعم النجاح، وفي تعاملي مع الأخطاء حين أصحح الخطأ معه بهدوء وأبرز الصواب قبله، وأخيرا في بيئة الصف حين أضع القوانين مع الطلاب أنفسهم ليشعروا أنها قوانينهم لا قوانيني. بهذا تصير القيمة والرؤية والممارسة شيئا واحدا، لا أقوالا في جانب وأفعالا في جانب آخر.</w:t>
       </w:r>
     </w:p>
     <w:p>
@@ -2479,7 +2479,7 @@
           <w:sz w:val="26"/>
           <w:rtl w:val="1"/>
         </w:rPr>
-        <w:t>لو عدتُ إلى أولِ يومٍ دخلتُ فيه الصف, لغيَّرتُ أشياءَ كثيرة. وهذا بالضبط ما يفرحني: أنني لم أعد المعلمةَ نفسَها التي بدأت. تعلمتُ أنَّ التعليمَ مهنةٌ تُتعلَّمُ كلَّ يوم, ومن كلِّ طالب. وخرجتُ من سنةِ الاستاجِ وأنا أعرفُ أيَّ معلمةٍ أريدُ أن أكون, وهذا وحده يستحقُّ كلَّ التعب.</w:t>
+        <w:t>لو عدت إلى أول يوم دخلت فيه الصف، لغيرت أشياء كثيرة. وهذا بالضبط ما يفرحني: أنني لم أعد المعلمة نفسها التي بدأت. تعلمت أن التعليم مهنة تتعلم كل يوم، ومن كل طالب. وخرجت من سنة الاستاج وأنا أعرف أي معلمة أريد أن أكون، وهذا وحده يستحق كل التعب.</w:t>
       </w:r>
     </w:p>
     <w:sectPr>

</xml_diff>